<commit_message>
fix: actualizar Plan Migración
</commit_message>
<xml_diff>
--- a/7_Trimestre/Planes/Plan Migración.docx
+++ b/7_Trimestre/Planes/Plan Migración.docx
@@ -13,67 +13,7 @@
           <w:noProof/>
         </w:rPr>
         <w:drawing>
-          <wp:anchor distT="0" distB="0" distL="114300" distR="114300" simplePos="0" relativeHeight="251659264" behindDoc="0" locked="0" layoutInCell="1" allowOverlap="1" wp14:anchorId="2CAB5562" wp14:editId="16D52A17">
-            <wp:simplePos x="0" y="0"/>
-            <wp:positionH relativeFrom="column">
-              <wp:posOffset>-956945</wp:posOffset>
-            </wp:positionH>
-            <wp:positionV relativeFrom="paragraph">
-              <wp:posOffset>-800735</wp:posOffset>
-            </wp:positionV>
-            <wp:extent cx="1425647" cy="1440000"/>
-            <wp:effectExtent l="0" t="0" r="3175" b="8255"/>
-            <wp:wrapNone/>
-            <wp:docPr id="1" name="Imagen 1"/>
-            <wp:cNvGraphicFramePr>
-              <a:graphicFrameLocks xmlns:a="http://schemas.openxmlformats.org/drawingml/2006/main" noChangeAspect="1"/>
-            </wp:cNvGraphicFramePr>
-            <a:graphic xmlns:a="http://schemas.openxmlformats.org/drawingml/2006/main">
-              <a:graphicData uri="http://schemas.openxmlformats.org/drawingml/2006/picture">
-                <pic:pic xmlns:pic="http://schemas.openxmlformats.org/drawingml/2006/picture">
-                  <pic:nvPicPr>
-                    <pic:cNvPr id="1" name=""/>
-                    <pic:cNvPicPr/>
-                  </pic:nvPicPr>
-                  <pic:blipFill>
-                    <a:blip r:embed="rId8" cstate="print">
-                      <a:extLst>
-                        <a:ext uri="{28A0092B-C50C-407E-A947-70E740481C1C}">
-                          <a14:useLocalDpi xmlns:a14="http://schemas.microsoft.com/office/drawing/2010/main" val="0"/>
-                        </a:ext>
-                      </a:extLst>
-                    </a:blip>
-                    <a:stretch>
-                      <a:fillRect/>
-                    </a:stretch>
-                  </pic:blipFill>
-                  <pic:spPr>
-                    <a:xfrm>
-                      <a:off x="0" y="0"/>
-                      <a:ext cx="1425647" cy="1440000"/>
-                    </a:xfrm>
-                    <a:prstGeom prst="rect">
-                      <a:avLst/>
-                    </a:prstGeom>
-                  </pic:spPr>
-                </pic:pic>
-              </a:graphicData>
-            </a:graphic>
-            <wp14:sizeRelH relativeFrom="margin">
-              <wp14:pctWidth>0</wp14:pctWidth>
-            </wp14:sizeRelH>
-            <wp14:sizeRelV relativeFrom="margin">
-              <wp14:pctHeight>0</wp14:pctHeight>
-            </wp14:sizeRelV>
-          </wp:anchor>
-        </w:drawing>
-      </w:r>
-      <w:r>
-        <w:rPr>
-          <w:noProof/>
-        </w:rPr>
-        <w:drawing>
-          <wp:anchor distT="0" distB="0" distL="114300" distR="114300" simplePos="0" relativeHeight="251658240" behindDoc="0" locked="0" layoutInCell="1" allowOverlap="1" wp14:anchorId="0492248F" wp14:editId="34545D36">
+          <wp:anchor distT="0" distB="0" distL="114300" distR="114300" simplePos="0" relativeHeight="251658240" behindDoc="0" locked="0" layoutInCell="1" allowOverlap="1" wp14:anchorId="0492248F" wp14:editId="2BF0B38E">
             <wp:simplePos x="0" y="0"/>
             <wp:positionH relativeFrom="column">
               <wp:posOffset>5140325</wp:posOffset>
@@ -98,7 +38,7 @@
                     </pic:cNvPicPr>
                   </pic:nvPicPr>
                   <pic:blipFill>
-                    <a:blip r:embed="rId9">
+                    <a:blip r:embed="rId8">
                       <a:extLst>
                         <a:ext uri="{28A0092B-C50C-407E-A947-70E740481C1C}">
                           <a14:useLocalDpi xmlns:a14="http://schemas.microsoft.com/office/drawing/2010/main" val="0"/>
@@ -252,7 +192,7 @@
           <w:b/>
           <w:sz w:val="42"/>
         </w:rPr>
-        <w:t xml:space="preserve">Comunidad Inteligente </w:t>
+        <w:t>Urbancops</w:t>
       </w:r>
     </w:p>
     <w:p>
@@ -564,17 +504,8 @@
                 <w:sz w:val="24"/>
                 <w:szCs w:val="28"/>
               </w:rPr>
-              <w:t xml:space="preserve">Equipo </w:t>
-            </w:r>
-            <w:proofErr w:type="spellStart"/>
-            <w:r>
-              <w:rPr>
-                <w:sz w:val="24"/>
-                <w:szCs w:val="28"/>
-              </w:rPr>
-              <w:t>Urbancops</w:t>
-            </w:r>
-            <w:proofErr w:type="spellEnd"/>
+              <w:t>Equipo Urbancops</w:t>
+            </w:r>
           </w:p>
         </w:tc>
         <w:tc>
@@ -623,27 +554,7 @@
                 <w:szCs w:val="24"/>
                 <w:lang w:val="es-CO" w:eastAsia="es-CO"/>
               </w:rPr>
-              <w:t>Adaptación a Hostinger (</w:t>
-            </w:r>
-            <w:proofErr w:type="spellStart"/>
-            <w:r>
-              <w:rPr>
-                <w:rFonts w:eastAsia="Times New Roman" w:hAnsi="Georgia" w:cs="Times New Roman"/>
-                <w:sz w:val="24"/>
-                <w:szCs w:val="24"/>
-                <w:lang w:val="es-CO" w:eastAsia="es-CO"/>
-              </w:rPr>
-              <w:t>MariaDB</w:t>
-            </w:r>
-            <w:proofErr w:type="spellEnd"/>
-            <w:r>
-              <w:rPr>
-                <w:rFonts w:eastAsia="Times New Roman" w:hAnsi="Georgia" w:cs="Times New Roman"/>
-                <w:sz w:val="24"/>
-                <w:szCs w:val="24"/>
-                <w:lang w:val="es-CO" w:eastAsia="es-CO"/>
-              </w:rPr>
-              <w:t xml:space="preserve"> nube)</w:t>
+              <w:t>Adaptación a Hostinger (MariaDB nube)</w:t>
             </w:r>
           </w:p>
         </w:tc>
@@ -876,17 +787,8 @@
                 <w:sz w:val="24"/>
                 <w:szCs w:val="28"/>
               </w:rPr>
-              <w:t xml:space="preserve">Equipo </w:t>
-            </w:r>
-            <w:proofErr w:type="spellStart"/>
-            <w:r>
-              <w:rPr>
-                <w:sz w:val="24"/>
-                <w:szCs w:val="28"/>
-              </w:rPr>
-              <w:t>Urbancops</w:t>
-            </w:r>
-            <w:proofErr w:type="spellEnd"/>
+              <w:t>Equipo Urbancops</w:t>
+            </w:r>
           </w:p>
         </w:tc>
         <w:tc>
@@ -1203,17 +1105,8 @@
                 <w:sz w:val="24"/>
                 <w:szCs w:val="28"/>
               </w:rPr>
-              <w:t xml:space="preserve">n </w:t>
-            </w:r>
-            <w:proofErr w:type="spellStart"/>
-            <w:r>
-              <w:rPr>
-                <w:sz w:val="24"/>
-                <w:szCs w:val="28"/>
-              </w:rPr>
-              <w:t>Urbancops</w:t>
-            </w:r>
-            <w:proofErr w:type="spellEnd"/>
+              <w:t>n Urbancops</w:t>
+            </w:r>
           </w:p>
         </w:tc>
       </w:tr>
@@ -1947,47 +1840,7 @@
           <w:szCs w:val="24"/>
           <w:lang w:val="es-CO" w:eastAsia="es-CO"/>
         </w:rPr>
-        <w:t xml:space="preserve">Explicar cómo se realizará el proceso de migración de la base de datos y la carga inicial de datos al pasar del entorno de desarrollo local al servidor en la nube. Para cada uno de estos dos procesos se deben identificar claramente los sistemas o componentes involucrados tanto en el lado de origen (desde dónde sale la información) como en el lado de destino (hacia dónde llega). Adicionalmente, se debe incluir un plan de contingencia que describa los pasos a seguir en caso de que la migración falle o presente errores, con el fin de restaurar el sistema a su estado anterior sin pérdida de datos. El contexto del proyecto implica mover la base de datos de un entorno local con </w:t>
-      </w:r>
-      <w:proofErr w:type="spellStart"/>
-      <w:r>
-        <w:rPr>
-          <w:rFonts w:eastAsia="Times New Roman" w:hAnsi="Georgia" w:cs="Times New Roman"/>
-          <w:sz w:val="24"/>
-          <w:szCs w:val="24"/>
-          <w:lang w:val="es-CO" w:eastAsia="es-CO"/>
-        </w:rPr>
-        <w:t>MariaDB</w:t>
-      </w:r>
-      <w:proofErr w:type="spellEnd"/>
-      <w:r>
-        <w:rPr>
-          <w:rFonts w:eastAsia="Times New Roman" w:hAnsi="Georgia" w:cs="Times New Roman"/>
-          <w:sz w:val="24"/>
-          <w:szCs w:val="24"/>
-          <w:lang w:val="es-CO" w:eastAsia="es-CO"/>
-        </w:rPr>
-        <w:t xml:space="preserve">/MySQL hacia una base de datos </w:t>
-      </w:r>
-      <w:proofErr w:type="spellStart"/>
-      <w:r>
-        <w:rPr>
-          <w:rFonts w:eastAsia="Times New Roman" w:hAnsi="Georgia" w:cs="Times New Roman"/>
-          <w:sz w:val="24"/>
-          <w:szCs w:val="24"/>
-          <w:lang w:val="es-CO" w:eastAsia="es-CO"/>
-        </w:rPr>
-        <w:t>MariaDB</w:t>
-      </w:r>
-      <w:proofErr w:type="spellEnd"/>
-      <w:r>
-        <w:rPr>
-          <w:rFonts w:eastAsia="Times New Roman" w:hAnsi="Georgia" w:cs="Times New Roman"/>
-          <w:sz w:val="24"/>
-          <w:szCs w:val="24"/>
-          <w:lang w:val="es-CO" w:eastAsia="es-CO"/>
-        </w:rPr>
-        <w:t xml:space="preserve"> alojada en el VPS de Hostinger.</w:t>
+        <w:t>Explicar cómo se realizará el proceso de migración de la base de datos y la carga inicial de datos al pasar del entorno de desarrollo local al servidor en la nube. Para cada uno de estos dos procesos se deben identificar claramente los sistemas o componentes involucrados tanto en el lado de origen (desde dónde sale la información) como en el lado de destino (hacia dónde llega). Adicionalmente, se debe incluir un plan de contingencia que describa los pasos a seguir en caso de que la migración falle o presente errores, con el fin de restaurar el sistema a su estado anterior sin pérdida de datos. El contexto del proyecto implica mover la base de datos de un entorno local con MariaDB/MySQL hacia una base de datos MariaDB alojada en el VPS de Hostinger.</w:t>
       </w:r>
     </w:p>
     <w:p>
@@ -2263,16 +2116,7 @@
           <w:szCs w:val="24"/>
           <w:lang w:val="es-CO" w:eastAsia="es-CO"/>
         </w:rPr>
-        <w:t xml:space="preserve">n de paneles de hosting como el proporcionado por </w:t>
-      </w:r>
-      <w:proofErr w:type="gramStart"/>
-      <w:r>
-        <w:rPr>
-          <w:sz w:val="24"/>
-          <w:szCs w:val="24"/>
-          <w:lang w:val="es-CO" w:eastAsia="es-CO"/>
-        </w:rPr>
-        <w:t>Hostinger.</w:t>
+        <w:t>n de paneles de hosting como el proporcionado por Hostinger.</w:t>
       </w:r>
       <w:r>
         <w:rPr>
@@ -2282,7 +2126,6 @@
         </w:rPr>
         <w:t>.</w:t>
       </w:r>
-      <w:proofErr w:type="gramEnd"/>
     </w:p>
     <w:p>
       <w:pPr>
@@ -2433,7 +2276,6 @@
               </w:rPr>
               <w:t xml:space="preserve">Equipo </w:t>
             </w:r>
-            <w:proofErr w:type="spellStart"/>
             <w:r>
               <w:rPr>
                 <w:rFonts w:eastAsia="Times New Roman" w:hAnsi="Georgia" w:cs="Times New Roman"/>
@@ -2443,7 +2285,6 @@
               </w:rPr>
               <w:t>Urbancops</w:t>
             </w:r>
-            <w:proofErr w:type="spellEnd"/>
           </w:p>
         </w:tc>
         <w:tc>
@@ -2684,47 +2525,7 @@
           <w:szCs w:val="24"/>
           <w:lang w:val="es-CO" w:eastAsia="es-CO"/>
         </w:rPr>
-        <w:t xml:space="preserve">El componente de origen utiliza la base de datos local </w:t>
-      </w:r>
-      <w:proofErr w:type="spellStart"/>
-      <w:r>
-        <w:rPr>
-          <w:rFonts w:eastAsia="Times New Roman" w:hAnsi="Georgia" w:cs="Times New Roman"/>
-          <w:sz w:val="24"/>
-          <w:szCs w:val="24"/>
-          <w:lang w:val="es-CO" w:eastAsia="es-CO"/>
-        </w:rPr>
-        <w:t>MariaDB</w:t>
-      </w:r>
-      <w:proofErr w:type="spellEnd"/>
-      <w:r>
-        <w:rPr>
-          <w:rFonts w:eastAsia="Times New Roman" w:hAnsi="Georgia" w:cs="Times New Roman"/>
-          <w:sz w:val="24"/>
-          <w:szCs w:val="24"/>
-          <w:lang w:val="es-CO" w:eastAsia="es-CO"/>
-        </w:rPr>
-        <w:t xml:space="preserve">/MySQL con la estructura definida en el script </w:t>
-      </w:r>
-      <w:proofErr w:type="spellStart"/>
-      <w:r>
-        <w:rPr>
-          <w:rFonts w:eastAsia="Times New Roman" w:hAnsi="Georgia" w:cs="Times New Roman"/>
-          <w:sz w:val="24"/>
-          <w:szCs w:val="24"/>
-          <w:lang w:val="es-CO" w:eastAsia="es-CO"/>
-        </w:rPr>
-        <w:t>ScriptComunidadInteligente.sql</w:t>
-      </w:r>
-      <w:proofErr w:type="spellEnd"/>
-      <w:r>
-        <w:rPr>
-          <w:rFonts w:eastAsia="Times New Roman" w:hAnsi="Georgia" w:cs="Times New Roman"/>
-          <w:sz w:val="24"/>
-          <w:szCs w:val="24"/>
-          <w:lang w:val="es-CO" w:eastAsia="es-CO"/>
-        </w:rPr>
-        <w:t>. Este script contiene todas las tablas, relaciones y restricciones necesarias para la estructura inicial del proyecto Comunidad Inteligente.</w:t>
+        <w:t>El componente de origen utiliza la base de datos local MariaDB/MySQL con la estructura definida en el script ScriptComunidadInteligente.sql. Este script contiene todas las tablas, relaciones y restricciones necesarias para la estructura inicial del proyecto Comunidad Inteligente.</w:t>
       </w:r>
     </w:p>
     <w:p>
@@ -2738,6 +2539,9 @@
         </w:rPr>
       </w:pPr>
       <w:r>
+        <w:rPr>
+          <w:noProof/>
+        </w:rPr>
         <w:drawing>
           <wp:inline distT="0" distB="0" distL="0" distR="0" wp14:anchorId="331CDF24" wp14:editId="3D532946">
             <wp:extent cx="5518150" cy="4053205"/>
@@ -2754,7 +2558,7 @@
                     <pic:cNvPicPr/>
                   </pic:nvPicPr>
                   <pic:blipFill>
-                    <a:blip r:embed="rId10"/>
+                    <a:blip r:embed="rId9"/>
                     <a:stretch>
                       <a:fillRect/>
                     </a:stretch>
@@ -2834,6 +2638,7 @@
       <w:r>
         <w:rPr>
           <w:rFonts w:eastAsia="Times New Roman" w:hAnsi="Georgia" w:cs="Times New Roman"/>
+          <w:noProof/>
           <w:sz w:val="20"/>
           <w:szCs w:val="20"/>
           <w:lang w:val="es-CO" w:eastAsia="es-CO"/>
@@ -2855,7 +2660,7 @@
                     <pic:cNvPicPr/>
                   </pic:nvPicPr>
                   <pic:blipFill>
-                    <a:blip r:embed="rId11"/>
+                    <a:blip r:embed="rId10"/>
                     <a:stretch>
                       <a:fillRect/>
                     </a:stretch>
@@ -2961,27 +2766,7 @@
           <w:szCs w:val="24"/>
           <w:lang w:val="es-CO" w:eastAsia="es-CO"/>
         </w:rPr>
-        <w:t>Tener instalado el motor de base de datos MySQL/</w:t>
-      </w:r>
-      <w:proofErr w:type="spellStart"/>
-      <w:r>
-        <w:rPr>
-          <w:rFonts w:eastAsia="Times New Roman" w:hAnsi="Georgia" w:cs="Times New Roman"/>
-          <w:sz w:val="24"/>
-          <w:szCs w:val="24"/>
-          <w:lang w:val="es-CO" w:eastAsia="es-CO"/>
-        </w:rPr>
-        <w:t>MariaDB</w:t>
-      </w:r>
-      <w:proofErr w:type="spellEnd"/>
-      <w:r>
-        <w:rPr>
-          <w:rFonts w:eastAsia="Times New Roman" w:hAnsi="Georgia" w:cs="Times New Roman"/>
-          <w:sz w:val="24"/>
-          <w:szCs w:val="24"/>
-          <w:lang w:val="es-CO" w:eastAsia="es-CO"/>
-        </w:rPr>
-        <w:t xml:space="preserve"> en el entorno local</w:t>
+        <w:t>Tener instalado el motor de base de datos MySQL/MariaDB en el entorno local</w:t>
       </w:r>
     </w:p>
     <w:p>
@@ -3021,87 +2806,7 @@
           <w:szCs w:val="24"/>
           <w:lang w:val="es-CO" w:eastAsia="es-CO"/>
         </w:rPr>
-        <w:t xml:space="preserve">Tener acceso a MySQL </w:t>
-      </w:r>
-      <w:proofErr w:type="spellStart"/>
-      <w:r>
-        <w:rPr>
-          <w:rFonts w:eastAsia="Times New Roman" w:hAnsi="Georgia" w:cs="Times New Roman"/>
-          <w:sz w:val="24"/>
-          <w:szCs w:val="24"/>
-          <w:lang w:val="es-CO" w:eastAsia="es-CO"/>
-        </w:rPr>
-        <w:t>Workbench</w:t>
-      </w:r>
-      <w:proofErr w:type="spellEnd"/>
-      <w:r>
-        <w:rPr>
-          <w:rFonts w:eastAsia="Times New Roman" w:hAnsi="Georgia" w:cs="Times New Roman"/>
-          <w:sz w:val="24"/>
-          <w:szCs w:val="24"/>
-          <w:lang w:val="es-CO" w:eastAsia="es-CO"/>
-        </w:rPr>
-        <w:t xml:space="preserve"> o herramienta equivalente (</w:t>
-      </w:r>
-      <w:proofErr w:type="spellStart"/>
-      <w:r>
-        <w:rPr>
-          <w:rFonts w:eastAsia="Times New Roman" w:hAnsi="Georgia" w:cs="Times New Roman"/>
-          <w:sz w:val="24"/>
-          <w:szCs w:val="24"/>
-          <w:lang w:val="es-CO" w:eastAsia="es-CO"/>
-        </w:rPr>
-        <w:t>ej</w:t>
-      </w:r>
-      <w:proofErr w:type="spellEnd"/>
-      <w:r>
-        <w:rPr>
-          <w:rFonts w:eastAsia="Times New Roman" w:hAnsi="Georgia" w:cs="Times New Roman"/>
-          <w:sz w:val="24"/>
-          <w:szCs w:val="24"/>
-          <w:lang w:val="es-CO" w:eastAsia="es-CO"/>
-        </w:rPr>
-        <w:t xml:space="preserve">: </w:t>
-      </w:r>
-      <w:proofErr w:type="spellStart"/>
-      <w:r>
-        <w:rPr>
-          <w:rFonts w:eastAsia="Times New Roman" w:hAnsi="Georgia" w:cs="Times New Roman"/>
-          <w:sz w:val="24"/>
-          <w:szCs w:val="24"/>
-          <w:lang w:val="es-CO" w:eastAsia="es-CO"/>
-        </w:rPr>
-        <w:t>DBeaver</w:t>
-      </w:r>
-      <w:proofErr w:type="spellEnd"/>
-      <w:r>
-        <w:rPr>
-          <w:rFonts w:eastAsia="Times New Roman" w:hAnsi="Georgia" w:cs="Times New Roman"/>
-          <w:sz w:val="24"/>
-          <w:szCs w:val="24"/>
-          <w:lang w:val="es-CO" w:eastAsia="es-CO"/>
-        </w:rPr>
-        <w:t xml:space="preserve">, </w:t>
-      </w:r>
-      <w:proofErr w:type="spellStart"/>
-      <w:r>
-        <w:rPr>
-          <w:rFonts w:eastAsia="Times New Roman" w:hAnsi="Georgia" w:cs="Times New Roman"/>
-          <w:sz w:val="24"/>
-          <w:szCs w:val="24"/>
-          <w:lang w:val="es-CO" w:eastAsia="es-CO"/>
-        </w:rPr>
-        <w:t>HeidiSQL</w:t>
-      </w:r>
-      <w:proofErr w:type="spellEnd"/>
-      <w:r>
-        <w:rPr>
-          <w:rFonts w:eastAsia="Times New Roman" w:hAnsi="Georgia" w:cs="Times New Roman"/>
-          <w:sz w:val="24"/>
-          <w:szCs w:val="24"/>
-          <w:lang w:val="es-CO" w:eastAsia="es-CO"/>
-        </w:rPr>
-        <w:t>)</w:t>
+        <w:t>Tener acceso a MySQL Workbench o herramienta equivalente (ej: DBeaver, HeidiSQL)</w:t>
       </w:r>
     </w:p>
     <w:p>
@@ -3183,27 +2888,7 @@
           <w:szCs w:val="24"/>
           <w:lang w:val="es-CO" w:eastAsia="es-CO"/>
         </w:rPr>
-        <w:t>Contar con una copia de seguridad (</w:t>
-      </w:r>
-      <w:proofErr w:type="spellStart"/>
-      <w:r>
-        <w:rPr>
-          <w:rFonts w:eastAsia="Times New Roman" w:hAnsi="Georgia" w:cs="Times New Roman"/>
-          <w:sz w:val="24"/>
-          <w:szCs w:val="24"/>
-          <w:lang w:val="es-CO" w:eastAsia="es-CO"/>
-        </w:rPr>
-        <w:t>dump</w:t>
-      </w:r>
-      <w:proofErr w:type="spellEnd"/>
-      <w:r>
-        <w:rPr>
-          <w:rFonts w:eastAsia="Times New Roman" w:hAnsi="Georgia" w:cs="Times New Roman"/>
-          <w:sz w:val="24"/>
-          <w:szCs w:val="24"/>
-          <w:lang w:val="es-CO" w:eastAsia="es-CO"/>
-        </w:rPr>
-        <w:t>) de la base de datos local antes de iniciar el proceso</w:t>
+        <w:t>Contar con una copia de seguridad (dump) de la base de datos local antes de iniciar el proceso</w:t>
       </w:r>
     </w:p>
     <w:p>
@@ -3277,31 +2962,7 @@
           <w:szCs w:val="24"/>
           <w:lang w:val="es-CO" w:eastAsia="es-CO"/>
         </w:rPr>
-        <w:t xml:space="preserve">Paso 1: Verificar datos iniciales en </w:t>
-      </w:r>
-      <w:proofErr w:type="spellStart"/>
-      <w:r>
-        <w:rPr>
-          <w:rFonts w:eastAsia="Times New Roman" w:hAnsi="Georgia" w:cs="Times New Roman"/>
-          <w:b/>
-          <w:bCs/>
-          <w:sz w:val="24"/>
-          <w:szCs w:val="24"/>
-          <w:lang w:val="es-CO" w:eastAsia="es-CO"/>
-        </w:rPr>
-        <w:t>MariaDB</w:t>
-      </w:r>
-      <w:proofErr w:type="spellEnd"/>
-      <w:r>
-        <w:rPr>
-          <w:rFonts w:eastAsia="Times New Roman" w:hAnsi="Georgia" w:cs="Times New Roman"/>
-          <w:b/>
-          <w:bCs/>
-          <w:sz w:val="24"/>
-          <w:szCs w:val="24"/>
-          <w:lang w:val="es-CO" w:eastAsia="es-CO"/>
-        </w:rPr>
-        <w:t xml:space="preserve"> local</w:t>
+        <w:t>Paso 1: Verificar datos iniciales en MariaDB local</w:t>
       </w:r>
       <w:r>
         <w:rPr>
@@ -3313,7 +2974,6 @@
         <w:br/>
         <w:t xml:space="preserve">Ejecutar </w:t>
       </w:r>
-      <w:proofErr w:type="gramStart"/>
       <w:r>
         <w:rPr>
           <w:rFonts w:eastAsia="Times New Roman" w:hAnsi="Georgia" w:cs="Courier New"/>
@@ -3321,17 +2981,7 @@
           <w:szCs w:val="20"/>
           <w:lang w:val="es-CO" w:eastAsia="es-CO"/>
         </w:rPr>
-        <w:t>SHOW</w:t>
-      </w:r>
-      <w:proofErr w:type="gramEnd"/>
-      <w:r>
-        <w:rPr>
-          <w:rFonts w:eastAsia="Times New Roman" w:hAnsi="Georgia" w:cs="Courier New"/>
-          <w:sz w:val="20"/>
-          <w:szCs w:val="20"/>
-          <w:lang w:val="es-CO" w:eastAsia="es-CO"/>
-        </w:rPr>
-        <w:t xml:space="preserve"> TABLES;</w:t>
+        <w:t>SHOW TABLES;</w:t>
       </w:r>
       <w:r>
         <w:rPr>
@@ -3375,6 +3025,7 @@
       <w:r>
         <w:rPr>
           <w:rFonts w:eastAsia="Times New Roman" w:hAnsi="Georgia" w:cs="Times New Roman"/>
+          <w:noProof/>
           <w:sz w:val="20"/>
           <w:szCs w:val="20"/>
           <w:lang w:val="es-CO" w:eastAsia="es-CO"/>
@@ -3395,7 +3046,7 @@
                     <pic:cNvPicPr/>
                   </pic:nvPicPr>
                   <pic:blipFill>
-                    <a:blip r:embed="rId12"/>
+                    <a:blip r:embed="rId11"/>
                     <a:stretch>
                       <a:fillRect/>
                     </a:stretch>
@@ -3444,55 +3095,7 @@
           <w:szCs w:val="24"/>
           <w:lang w:val="es-CO" w:eastAsia="es-CO"/>
         </w:rPr>
-        <w:t xml:space="preserve">Paso 2: Exportar datos desde local (MySQL </w:t>
-      </w:r>
-      <w:proofErr w:type="spellStart"/>
-      <w:r>
-        <w:rPr>
-          <w:rFonts w:eastAsia="Times New Roman" w:hAnsi="Georgia" w:cs="Times New Roman"/>
-          <w:b/>
-          <w:bCs/>
-          <w:sz w:val="24"/>
-          <w:szCs w:val="24"/>
-          <w:lang w:val="es-CO" w:eastAsia="es-CO"/>
-        </w:rPr>
-        <w:t>Workbench</w:t>
-      </w:r>
-      <w:proofErr w:type="spellEnd"/>
-      <w:r>
-        <w:rPr>
-          <w:rFonts w:eastAsia="Times New Roman" w:hAnsi="Georgia" w:cs="Times New Roman"/>
-          <w:b/>
-          <w:bCs/>
-          <w:sz w:val="24"/>
-          <w:szCs w:val="24"/>
-          <w:lang w:val="es-CO" w:eastAsia="es-CO"/>
-        </w:rPr>
-        <w:t xml:space="preserve"> o </w:t>
-      </w:r>
-      <w:proofErr w:type="spellStart"/>
-      <w:r>
-        <w:rPr>
-          <w:rFonts w:eastAsia="Times New Roman" w:hAnsi="Georgia" w:cs="Times New Roman"/>
-          <w:b/>
-          <w:bCs/>
-          <w:sz w:val="24"/>
-          <w:szCs w:val="24"/>
-          <w:lang w:val="es-CO" w:eastAsia="es-CO"/>
-        </w:rPr>
-        <w:t>mysqldump</w:t>
-      </w:r>
-      <w:proofErr w:type="spellEnd"/>
-      <w:r>
-        <w:rPr>
-          <w:rFonts w:eastAsia="Times New Roman" w:hAnsi="Georgia" w:cs="Times New Roman"/>
-          <w:b/>
-          <w:bCs/>
-          <w:sz w:val="24"/>
-          <w:szCs w:val="24"/>
-          <w:lang w:val="es-CO" w:eastAsia="es-CO"/>
-        </w:rPr>
-        <w:t>)</w:t>
+        <w:t>Paso 2: Exportar datos desde local (MySQL Workbench o mysqldump)</w:t>
       </w:r>
       <w:r>
         <w:rPr>
@@ -3502,47 +3105,7 @@
           <w:lang w:val="es-CO" w:eastAsia="es-CO"/>
         </w:rPr>
         <w:br/>
-        <w:t xml:space="preserve">Usar Data </w:t>
-      </w:r>
-      <w:proofErr w:type="spellStart"/>
-      <w:r>
-        <w:rPr>
-          <w:rFonts w:eastAsia="Times New Roman" w:hAnsi="Georgia" w:cs="Times New Roman"/>
-          <w:sz w:val="24"/>
-          <w:szCs w:val="24"/>
-          <w:lang w:val="es-CO" w:eastAsia="es-CO"/>
-        </w:rPr>
-        <w:t>Export</w:t>
-      </w:r>
-      <w:proofErr w:type="spellEnd"/>
-      <w:r>
-        <w:rPr>
-          <w:rFonts w:eastAsia="Times New Roman" w:hAnsi="Georgia" w:cs="Times New Roman"/>
-          <w:sz w:val="24"/>
-          <w:szCs w:val="24"/>
-          <w:lang w:val="es-CO" w:eastAsia="es-CO"/>
-        </w:rPr>
-        <w:t xml:space="preserve"> en </w:t>
-      </w:r>
-      <w:proofErr w:type="spellStart"/>
-      <w:r>
-        <w:rPr>
-          <w:rFonts w:eastAsia="Times New Roman" w:hAnsi="Georgia" w:cs="Times New Roman"/>
-          <w:sz w:val="24"/>
-          <w:szCs w:val="24"/>
-          <w:lang w:val="es-CO" w:eastAsia="es-CO"/>
-        </w:rPr>
-        <w:t>Workbench</w:t>
-      </w:r>
-      <w:proofErr w:type="spellEnd"/>
-      <w:r>
-        <w:rPr>
-          <w:rFonts w:eastAsia="Times New Roman" w:hAnsi="Georgia" w:cs="Times New Roman"/>
-          <w:sz w:val="24"/>
-          <w:szCs w:val="24"/>
-          <w:lang w:val="es-CO" w:eastAsia="es-CO"/>
-        </w:rPr>
-        <w:t xml:space="preserve"> para generar archivo SQL completo (estructura + datos). </w:t>
+        <w:t xml:space="preserve">Usar Data Export en Workbench para generar archivo SQL completo (estructura + datos). </w:t>
       </w:r>
     </w:p>
     <w:p>
@@ -3559,6 +3122,7 @@
       <w:r>
         <w:rPr>
           <w:rFonts w:eastAsia="Times New Roman" w:hAnsi="Georgia" w:cs="Times New Roman"/>
+          <w:noProof/>
           <w:sz w:val="20"/>
           <w:szCs w:val="20"/>
           <w:lang w:val="es-CO" w:eastAsia="es-CO"/>
@@ -3579,7 +3143,7 @@
                     <pic:cNvPicPr/>
                   </pic:nvPicPr>
                   <pic:blipFill>
-                    <a:blip r:embed="rId13"/>
+                    <a:blip r:embed="rId12"/>
                     <a:stretch>
                       <a:fillRect/>
                     </a:stretch>
@@ -3623,6 +3187,7 @@
       <w:r>
         <w:rPr>
           <w:rFonts w:eastAsia="Times New Roman" w:hAnsi="Georgia" w:cs="Times New Roman"/>
+          <w:noProof/>
           <w:sz w:val="24"/>
           <w:szCs w:val="24"/>
           <w:lang w:val="es-CO" w:eastAsia="es-CO"/>
@@ -3644,7 +3209,7 @@
                     <pic:cNvPicPr/>
                   </pic:nvPicPr>
                   <pic:blipFill>
-                    <a:blip r:embed="rId14"/>
+                    <a:blip r:embed="rId13"/>
                     <a:stretch>
                       <a:fillRect/>
                     </a:stretch>
@@ -3702,31 +3267,7 @@
           <w:szCs w:val="24"/>
           <w:lang w:val="es-CO" w:eastAsia="es-CO"/>
         </w:rPr>
-        <w:t xml:space="preserve">Paso 3: Configurar </w:t>
-      </w:r>
-      <w:proofErr w:type="spellStart"/>
-      <w:r>
-        <w:rPr>
-          <w:rFonts w:eastAsia="Times New Roman" w:hAnsi="Georgia" w:cs="Times New Roman"/>
-          <w:b/>
-          <w:bCs/>
-          <w:sz w:val="24"/>
-          <w:szCs w:val="24"/>
-          <w:lang w:val="es-CO" w:eastAsia="es-CO"/>
-        </w:rPr>
-        <w:t>MariaDB</w:t>
-      </w:r>
-      <w:proofErr w:type="spellEnd"/>
-      <w:r>
-        <w:rPr>
-          <w:rFonts w:eastAsia="Times New Roman" w:hAnsi="Georgia" w:cs="Times New Roman"/>
-          <w:b/>
-          <w:bCs/>
-          <w:sz w:val="24"/>
-          <w:szCs w:val="24"/>
-          <w:lang w:val="es-CO" w:eastAsia="es-CO"/>
-        </w:rPr>
-        <w:t xml:space="preserve"> en Hostinger</w:t>
+        <w:t>Paso 3: Configurar MariaDB en Hostinger</w:t>
       </w:r>
       <w:r>
         <w:rPr>
@@ -3755,39 +3296,8 @@
           <w:szCs w:val="24"/>
           <w:lang w:val="es-CO" w:eastAsia="es-CO"/>
         </w:rPr>
-        <w:t xml:space="preserve">Instalación/configuración </w:t>
-      </w:r>
-      <w:proofErr w:type="spellStart"/>
-      <w:r>
-        <w:rPr>
-          <w:rFonts w:eastAsia="Times New Roman" w:hAnsi="Georgia" w:cs="Times New Roman"/>
-          <w:sz w:val="24"/>
-          <w:szCs w:val="24"/>
-          <w:lang w:val="es-CO" w:eastAsia="es-CO"/>
-        </w:rPr>
-        <w:t>Nginx</w:t>
-      </w:r>
-      <w:proofErr w:type="spellEnd"/>
-      <w:r>
-        <w:rPr>
-          <w:rFonts w:eastAsia="Times New Roman" w:hAnsi="Georgia" w:cs="Times New Roman"/>
-          <w:sz w:val="24"/>
-          <w:szCs w:val="24"/>
-          <w:lang w:val="es-CO" w:eastAsia="es-CO"/>
-        </w:rPr>
-        <w:t xml:space="preserve"> y </w:t>
-      </w:r>
-      <w:proofErr w:type="spellStart"/>
-      <w:r>
-        <w:rPr>
-          <w:rFonts w:eastAsia="Times New Roman" w:hAnsi="Georgia" w:cs="Times New Roman"/>
-          <w:sz w:val="24"/>
-          <w:szCs w:val="24"/>
-          <w:lang w:val="es-CO" w:eastAsia="es-CO"/>
-        </w:rPr>
-        <w:t>MariaDB</w:t>
-      </w:r>
-      <w:proofErr w:type="spellEnd"/>
+        <w:t>Instalación/configuración Nginx y MariaDB</w:t>
+      </w:r>
       <w:r>
         <w:rPr>
           <w:rFonts w:eastAsia="Times New Roman" w:hAnsi="Georgia" w:cs="Times New Roman"/>
@@ -3826,7 +3336,7 @@
                     <pic:cNvPicPr/>
                   </pic:nvPicPr>
                   <pic:blipFill rotWithShape="1">
-                    <a:blip r:embed="rId15"/>
+                    <a:blip r:embed="rId14"/>
                     <a:srcRect l="1398" t="17739" r="2287" b="11273"/>
                     <a:stretch/>
                   </pic:blipFill>
@@ -3895,27 +3405,7 @@
           <w:szCs w:val="24"/>
           <w:lang w:val="es-CO" w:eastAsia="es-CO"/>
         </w:rPr>
-        <w:t xml:space="preserve">Acceso a la consola de </w:t>
-      </w:r>
-      <w:proofErr w:type="spellStart"/>
-      <w:r>
-        <w:rPr>
-          <w:rFonts w:eastAsia="Times New Roman" w:hAnsi="Georgia" w:cs="Times New Roman"/>
-          <w:sz w:val="24"/>
-          <w:szCs w:val="24"/>
-          <w:lang w:val="es-CO" w:eastAsia="es-CO"/>
-        </w:rPr>
-        <w:t>MariaDB</w:t>
-      </w:r>
-      <w:proofErr w:type="spellEnd"/>
-      <w:r>
-        <w:rPr>
-          <w:rFonts w:eastAsia="Times New Roman" w:hAnsi="Georgia" w:cs="Times New Roman"/>
-          <w:sz w:val="24"/>
-          <w:szCs w:val="24"/>
-          <w:lang w:val="es-CO" w:eastAsia="es-CO"/>
-        </w:rPr>
-        <w:t>:</w:t>
+        <w:t>Acceso a la consola de MariaDB:</w:t>
       </w:r>
     </w:p>
     <w:p>
@@ -3946,7 +3436,7 @@
                     <pic:cNvPicPr/>
                   </pic:nvPicPr>
                   <pic:blipFill>
-                    <a:blip r:embed="rId16"/>
+                    <a:blip r:embed="rId15"/>
                     <a:stretch>
                       <a:fillRect/>
                     </a:stretch>
@@ -4128,43 +3618,7 @@
           <w:szCs w:val="24"/>
           <w:lang w:eastAsia="es-CO"/>
         </w:rPr>
-        <w:t xml:space="preserve">Ejecutar sudo </w:t>
-      </w:r>
-      <w:proofErr w:type="spellStart"/>
-      <w:r>
-        <w:rPr>
-          <w:sz w:val="24"/>
-          <w:szCs w:val="24"/>
-          <w:lang w:eastAsia="es-CO"/>
-        </w:rPr>
-        <w:t>mysql_secure_installation</w:t>
-      </w:r>
-      <w:proofErr w:type="spellEnd"/>
-      <w:r>
-        <w:rPr>
-          <w:sz w:val="24"/>
-          <w:szCs w:val="24"/>
-          <w:lang w:eastAsia="es-CO"/>
-        </w:rPr>
-        <w:t xml:space="preserve"> para seguridad </w:t>
-      </w:r>
-      <w:proofErr w:type="spellStart"/>
-      <w:r>
-        <w:rPr>
-          <w:sz w:val="24"/>
-          <w:szCs w:val="24"/>
-          <w:lang w:eastAsia="es-CO"/>
-        </w:rPr>
-        <w:t>root</w:t>
-      </w:r>
-      <w:proofErr w:type="spellEnd"/>
-      <w:r>
-        <w:rPr>
-          <w:sz w:val="24"/>
-          <w:szCs w:val="24"/>
-          <w:lang w:eastAsia="es-CO"/>
-        </w:rPr>
-        <w:t>:</w:t>
+        <w:t>Ejecutar sudo mysql_secure_installation para seguridad root:</w:t>
       </w:r>
     </w:p>
     <w:p>
@@ -4204,7 +3658,7 @@
                     </pic:cNvPicPr>
                   </pic:nvPicPr>
                   <pic:blipFill>
-                    <a:blip r:embed="rId17">
+                    <a:blip r:embed="rId16">
                       <a:extLst>
                         <a:ext uri="{28A0092B-C50C-407E-A947-70E740481C1C}">
                           <a14:useLocalDpi xmlns:a14="http://schemas.microsoft.com/office/drawing/2010/main" val="0"/>
@@ -4278,27 +3732,7 @@
           <w:szCs w:val="24"/>
           <w:lang w:val="es-CO" w:eastAsia="es-CO"/>
         </w:rPr>
-        <w:t xml:space="preserve">Crear BD </w:t>
-      </w:r>
-      <w:proofErr w:type="spellStart"/>
-      <w:r>
-        <w:rPr>
-          <w:rFonts w:eastAsia="Times New Roman" w:hAnsi="Georgia" w:cs="Times New Roman"/>
-          <w:sz w:val="24"/>
-          <w:szCs w:val="24"/>
-          <w:lang w:val="es-CO" w:eastAsia="es-CO"/>
-        </w:rPr>
-        <w:t>MariaDB</w:t>
-      </w:r>
-      <w:proofErr w:type="spellEnd"/>
-      <w:r>
-        <w:rPr>
-          <w:rFonts w:eastAsia="Times New Roman" w:hAnsi="Georgia" w:cs="Times New Roman"/>
-          <w:sz w:val="24"/>
-          <w:szCs w:val="24"/>
-          <w:lang w:val="es-CO" w:eastAsia="es-CO"/>
-        </w:rPr>
-        <w:t>, usuario y asignar privilegios</w:t>
+        <w:t>Crear BD MariaDB, usuario y asignar privilegios</w:t>
       </w:r>
       <w:r>
         <w:rPr>
@@ -4372,6 +3806,7 @@
           <w:rFonts w:eastAsia="Times New Roman" w:hAnsi="Georgia" w:cs="Times New Roman"/>
           <w:b/>
           <w:bCs/>
+          <w:noProof/>
           <w:sz w:val="24"/>
           <w:szCs w:val="24"/>
           <w:lang w:val="es-CO" w:eastAsia="es-CO"/>
@@ -4392,7 +3827,7 @@
                     <pic:cNvPicPr/>
                   </pic:nvPicPr>
                   <pic:blipFill>
-                    <a:blip r:embed="rId18"/>
+                    <a:blip r:embed="rId17"/>
                     <a:stretch>
                       <a:fillRect/>
                     </a:stretch>
@@ -4485,31 +3920,7 @@
           <w:lang w:val="es-CO" w:eastAsia="es-CO"/>
         </w:rPr>
         <w:lastRenderedPageBreak/>
-        <w:t>Paso 4: Importar vía CMD a Hostinger (</w:t>
-      </w:r>
-      <w:proofErr w:type="spellStart"/>
-      <w:r>
-        <w:rPr>
-          <w:rFonts w:eastAsia="Times New Roman" w:hAnsi="Georgia" w:cs="Times New Roman"/>
-          <w:b/>
-          <w:bCs/>
-          <w:sz w:val="24"/>
-          <w:szCs w:val="24"/>
-          <w:lang w:val="es-CO" w:eastAsia="es-CO"/>
-        </w:rPr>
-        <w:t>MariaDB</w:t>
-      </w:r>
-      <w:proofErr w:type="spellEnd"/>
-      <w:r>
-        <w:rPr>
-          <w:rFonts w:eastAsia="Times New Roman" w:hAnsi="Georgia" w:cs="Times New Roman"/>
-          <w:b/>
-          <w:bCs/>
-          <w:sz w:val="24"/>
-          <w:szCs w:val="24"/>
-          <w:lang w:val="es-CO" w:eastAsia="es-CO"/>
-        </w:rPr>
-        <w:t xml:space="preserve"> remota)</w:t>
+        <w:t>Paso 4: Importar vía CMD a Hostinger (MariaDB remota)</w:t>
       </w:r>
       <w:r>
         <w:rPr>
@@ -4531,6 +3942,7 @@
       </w:pPr>
       <w:r>
         <w:rPr>
+          <w:noProof/>
           <w:lang w:val="es-CO" w:eastAsia="es-CO"/>
         </w:rPr>
         <w:drawing>
@@ -4549,7 +3961,7 @@
                     <pic:cNvPicPr/>
                   </pic:nvPicPr>
                   <pic:blipFill>
-                    <a:blip r:embed="rId19"/>
+                    <a:blip r:embed="rId18"/>
                     <a:stretch>
                       <a:fillRect/>
                     </a:stretch>
@@ -4683,6 +4095,7 @@
       </w:r>
       <w:r>
         <w:rPr>
+          <w:noProof/>
           <w:lang w:val="es-CO" w:eastAsia="es-CO"/>
         </w:rPr>
         <w:drawing>
@@ -4701,7 +4114,7 @@
                     <pic:cNvPicPr/>
                   </pic:nvPicPr>
                   <pic:blipFill>
-                    <a:blip r:embed="rId20"/>
+                    <a:blip r:embed="rId19"/>
                     <a:stretch>
                       <a:fillRect/>
                     </a:stretch>
@@ -4904,7 +4317,6 @@
         </w:rPr>
         <w:t xml:space="preserve">jecutar </w:t>
       </w:r>
-      <w:proofErr w:type="gramStart"/>
       <w:r>
         <w:rPr>
           <w:rFonts w:eastAsia="Times New Roman" w:hAnsi="Georgia" w:cs="Courier New"/>
@@ -4912,27 +4324,7 @@
           <w:szCs w:val="20"/>
           <w:lang w:val="es-CO" w:eastAsia="es-CO"/>
         </w:rPr>
-        <w:t>SHOW</w:t>
-      </w:r>
-      <w:proofErr w:type="gramEnd"/>
-      <w:r>
-        <w:rPr>
-          <w:rFonts w:eastAsia="Times New Roman" w:hAnsi="Georgia" w:cs="Courier New"/>
-          <w:sz w:val="20"/>
-          <w:szCs w:val="20"/>
-          <w:lang w:val="es-CO" w:eastAsia="es-CO"/>
-        </w:rPr>
-        <w:t xml:space="preserve"> </w:t>
-      </w:r>
-      <w:proofErr w:type="gramStart"/>
-      <w:r>
-        <w:rPr>
-          <w:rFonts w:eastAsia="Times New Roman" w:hAnsi="Georgia" w:cs="Courier New"/>
-          <w:sz w:val="20"/>
-          <w:szCs w:val="20"/>
-          <w:lang w:val="es-CO" w:eastAsia="es-CO"/>
-        </w:rPr>
-        <w:t>TABLES;</w:t>
+        <w:t>SHOW TABLES;</w:t>
       </w:r>
       <w:r>
         <w:rPr>
@@ -4943,7 +4335,6 @@
         </w:rPr>
         <w:t>.</w:t>
       </w:r>
-      <w:proofErr w:type="gramEnd"/>
     </w:p>
     <w:p>
       <w:pPr>
@@ -4954,6 +4345,7 @@
       </w:pPr>
       <w:r>
         <w:rPr>
+          <w:noProof/>
           <w:lang w:val="es-CO" w:eastAsia="es-CO"/>
         </w:rPr>
         <w:drawing>
@@ -4972,7 +4364,7 @@
                     <pic:cNvPicPr/>
                   </pic:nvPicPr>
                   <pic:blipFill>
-                    <a:blip r:embed="rId21"/>
+                    <a:blip r:embed="rId20"/>
                     <a:stretch>
                       <a:fillRect/>
                     </a:stretch>
@@ -5093,26 +4485,7 @@
           <w:lang w:val="es-CO" w:eastAsia="es-CO"/>
         </w:rPr>
         <w:br/>
-      </w:r>
-      <w:proofErr w:type="spellStart"/>
-      <w:r>
-        <w:rPr>
-          <w:rFonts w:eastAsia="Times New Roman" w:hAnsi="Georgia" w:cs="Times New Roman"/>
-          <w:sz w:val="24"/>
-          <w:szCs w:val="24"/>
-          <w:lang w:val="es-CO" w:eastAsia="es-CO"/>
-        </w:rPr>
-        <w:t>MariaDB</w:t>
-      </w:r>
-      <w:proofErr w:type="spellEnd"/>
-      <w:r>
-        <w:rPr>
-          <w:rFonts w:eastAsia="Times New Roman" w:hAnsi="Georgia" w:cs="Times New Roman"/>
-          <w:sz w:val="24"/>
-          <w:szCs w:val="24"/>
-          <w:lang w:val="es-CO" w:eastAsia="es-CO"/>
-        </w:rPr>
-        <w:t xml:space="preserve"> local y Hostinger muestran exactamente 21 tablas migradas sin pérdida.</w:t>
+        <w:t>MariaDB local y Hostinger muestran exactamente 21 tablas migradas sin pérdida.</w:t>
       </w:r>
     </w:p>
     <w:tbl>
@@ -5289,7 +4662,6 @@
                 <w:lang w:val="es-CO" w:eastAsia="es-CO"/>
               </w:rPr>
             </w:pPr>
-            <w:proofErr w:type="spellStart"/>
             <w:r>
               <w:rPr>
                 <w:rFonts w:eastAsia="Times New Roman" w:hAnsi="Georgia" w:cs="Times New Roman"/>
@@ -5299,7 +4671,6 @@
               </w:rPr>
               <w:t>pqrs</w:t>
             </w:r>
-            <w:proofErr w:type="spellEnd"/>
           </w:p>
         </w:tc>
         <w:tc>
@@ -5350,7 +4721,6 @@
                 <w:lang w:val="es-CO" w:eastAsia="es-CO"/>
               </w:rPr>
             </w:pPr>
-            <w:proofErr w:type="spellStart"/>
             <w:r>
               <w:rPr>
                 <w:rFonts w:eastAsia="Times New Roman" w:hAnsi="Georgia" w:cs="Times New Roman"/>
@@ -5358,277 +4728,7 @@
                 <w:szCs w:val="24"/>
                 <w:lang w:eastAsia="es-CO"/>
               </w:rPr>
-              <w:t>id_pqrs</w:t>
-            </w:r>
-            <w:proofErr w:type="spellEnd"/>
-            <w:r>
-              <w:rPr>
-                <w:rFonts w:eastAsia="Times New Roman" w:hAnsi="Georgia" w:cs="Times New Roman"/>
-                <w:sz w:val="24"/>
-                <w:szCs w:val="24"/>
-                <w:lang w:eastAsia="es-CO"/>
-              </w:rPr>
-              <w:t xml:space="preserve"> (PK, </w:t>
-            </w:r>
-            <w:proofErr w:type="spellStart"/>
-            <w:r>
-              <w:rPr>
-                <w:rFonts w:eastAsia="Times New Roman" w:hAnsi="Georgia" w:cs="Times New Roman"/>
-                <w:sz w:val="24"/>
-                <w:szCs w:val="24"/>
-                <w:lang w:eastAsia="es-CO"/>
-              </w:rPr>
-              <w:t>int</w:t>
-            </w:r>
-            <w:proofErr w:type="spellEnd"/>
-            <w:r>
-              <w:rPr>
-                <w:rFonts w:eastAsia="Times New Roman" w:hAnsi="Georgia" w:cs="Times New Roman"/>
-                <w:sz w:val="24"/>
-                <w:szCs w:val="24"/>
-                <w:lang w:eastAsia="es-CO"/>
-              </w:rPr>
-              <w:t xml:space="preserve">), nombre (varchar100), correo (varchar100), </w:t>
-            </w:r>
-            <w:proofErr w:type="spellStart"/>
-            <w:r>
-              <w:rPr>
-                <w:rFonts w:eastAsia="Times New Roman" w:hAnsi="Georgia" w:cs="Times New Roman"/>
-                <w:sz w:val="24"/>
-                <w:szCs w:val="24"/>
-                <w:lang w:eastAsia="es-CO"/>
-              </w:rPr>
-              <w:t>tipo_pqrs</w:t>
-            </w:r>
-            <w:proofErr w:type="spellEnd"/>
-            <w:r>
-              <w:rPr>
-                <w:rFonts w:eastAsia="Times New Roman" w:hAnsi="Georgia" w:cs="Times New Roman"/>
-                <w:sz w:val="24"/>
-                <w:szCs w:val="24"/>
-                <w:lang w:eastAsia="es-CO"/>
-              </w:rPr>
-              <w:t xml:space="preserve"> (</w:t>
-            </w:r>
-            <w:proofErr w:type="spellStart"/>
-            <w:r>
-              <w:rPr>
-                <w:rFonts w:eastAsia="Times New Roman" w:hAnsi="Georgia" w:cs="Times New Roman"/>
-                <w:sz w:val="24"/>
-                <w:szCs w:val="24"/>
-                <w:lang w:eastAsia="es-CO"/>
-              </w:rPr>
-              <w:t>enum</w:t>
-            </w:r>
-            <w:proofErr w:type="spellEnd"/>
-            <w:r>
-              <w:rPr>
-                <w:rFonts w:eastAsia="Times New Roman" w:hAnsi="Georgia" w:cs="Times New Roman"/>
-                <w:sz w:val="24"/>
-                <w:szCs w:val="24"/>
-                <w:lang w:eastAsia="es-CO"/>
-              </w:rPr>
-              <w:t xml:space="preserve">), </w:t>
-            </w:r>
-            <w:proofErr w:type="spellStart"/>
-            <w:r>
-              <w:rPr>
-                <w:rFonts w:eastAsia="Times New Roman" w:hAnsi="Georgia" w:cs="Times New Roman"/>
-                <w:sz w:val="24"/>
-                <w:szCs w:val="24"/>
-                <w:lang w:eastAsia="es-CO"/>
-              </w:rPr>
-              <w:t>descripcion</w:t>
-            </w:r>
-            <w:proofErr w:type="spellEnd"/>
-            <w:r>
-              <w:rPr>
-                <w:rFonts w:eastAsia="Times New Roman" w:hAnsi="Georgia" w:cs="Times New Roman"/>
-                <w:sz w:val="24"/>
-                <w:szCs w:val="24"/>
-                <w:lang w:eastAsia="es-CO"/>
-              </w:rPr>
-              <w:t xml:space="preserve"> (</w:t>
-            </w:r>
-            <w:proofErr w:type="spellStart"/>
-            <w:r>
-              <w:rPr>
-                <w:rFonts w:eastAsia="Times New Roman" w:hAnsi="Georgia" w:cs="Times New Roman"/>
-                <w:sz w:val="24"/>
-                <w:szCs w:val="24"/>
-                <w:lang w:eastAsia="es-CO"/>
-              </w:rPr>
-              <w:t>text</w:t>
-            </w:r>
-            <w:proofErr w:type="spellEnd"/>
-            <w:r>
-              <w:rPr>
-                <w:rFonts w:eastAsia="Times New Roman" w:hAnsi="Georgia" w:cs="Times New Roman"/>
-                <w:sz w:val="24"/>
-                <w:szCs w:val="24"/>
-                <w:lang w:eastAsia="es-CO"/>
-              </w:rPr>
-              <w:t>), estado (</w:t>
-            </w:r>
-            <w:proofErr w:type="spellStart"/>
-            <w:r>
-              <w:rPr>
-                <w:rFonts w:eastAsia="Times New Roman" w:hAnsi="Georgia" w:cs="Times New Roman"/>
-                <w:sz w:val="24"/>
-                <w:szCs w:val="24"/>
-                <w:lang w:eastAsia="es-CO"/>
-              </w:rPr>
-              <w:t>enum</w:t>
-            </w:r>
-            <w:proofErr w:type="spellEnd"/>
-            <w:r>
-              <w:rPr>
-                <w:rFonts w:eastAsia="Times New Roman" w:hAnsi="Georgia" w:cs="Times New Roman"/>
-                <w:sz w:val="24"/>
-                <w:szCs w:val="24"/>
-                <w:lang w:eastAsia="es-CO"/>
-              </w:rPr>
-              <w:t>), respuesta (</w:t>
-            </w:r>
-            <w:proofErr w:type="spellStart"/>
-            <w:r>
-              <w:rPr>
-                <w:rFonts w:eastAsia="Times New Roman" w:hAnsi="Georgia" w:cs="Times New Roman"/>
-                <w:sz w:val="24"/>
-                <w:szCs w:val="24"/>
-                <w:lang w:eastAsia="es-CO"/>
-              </w:rPr>
-              <w:t>text</w:t>
-            </w:r>
-            <w:proofErr w:type="spellEnd"/>
-            <w:r>
-              <w:rPr>
-                <w:rFonts w:eastAsia="Times New Roman" w:hAnsi="Georgia" w:cs="Times New Roman"/>
-                <w:sz w:val="24"/>
-                <w:szCs w:val="24"/>
-                <w:lang w:eastAsia="es-CO"/>
-              </w:rPr>
-              <w:t xml:space="preserve">), </w:t>
-            </w:r>
-            <w:proofErr w:type="spellStart"/>
-            <w:r>
-              <w:rPr>
-                <w:rFonts w:eastAsia="Times New Roman" w:hAnsi="Georgia" w:cs="Times New Roman"/>
-                <w:sz w:val="24"/>
-                <w:szCs w:val="24"/>
-                <w:lang w:eastAsia="es-CO"/>
-              </w:rPr>
-              <w:t>fecha_solicitud</w:t>
-            </w:r>
-            <w:proofErr w:type="spellEnd"/>
-            <w:r>
-              <w:rPr>
-                <w:rFonts w:eastAsia="Times New Roman" w:hAnsi="Georgia" w:cs="Times New Roman"/>
-                <w:sz w:val="24"/>
-                <w:szCs w:val="24"/>
-                <w:lang w:eastAsia="es-CO"/>
-              </w:rPr>
-              <w:t xml:space="preserve"> (</w:t>
-            </w:r>
-            <w:proofErr w:type="spellStart"/>
-            <w:r>
-              <w:rPr>
-                <w:rFonts w:eastAsia="Times New Roman" w:hAnsi="Georgia" w:cs="Times New Roman"/>
-                <w:sz w:val="24"/>
-                <w:szCs w:val="24"/>
-                <w:lang w:eastAsia="es-CO"/>
-              </w:rPr>
-              <w:t>timestamp</w:t>
-            </w:r>
-            <w:proofErr w:type="spellEnd"/>
-            <w:r>
-              <w:rPr>
-                <w:rFonts w:eastAsia="Times New Roman" w:hAnsi="Georgia" w:cs="Times New Roman"/>
-                <w:sz w:val="24"/>
-                <w:szCs w:val="24"/>
-                <w:lang w:eastAsia="es-CO"/>
-              </w:rPr>
-              <w:t xml:space="preserve">), </w:t>
-            </w:r>
-            <w:proofErr w:type="spellStart"/>
-            <w:r>
-              <w:rPr>
-                <w:rFonts w:eastAsia="Times New Roman" w:hAnsi="Georgia" w:cs="Times New Roman"/>
-                <w:sz w:val="24"/>
-                <w:szCs w:val="24"/>
-                <w:lang w:eastAsia="es-CO"/>
-              </w:rPr>
-              <w:t>fecha_respuesta</w:t>
-            </w:r>
-            <w:proofErr w:type="spellEnd"/>
-            <w:r>
-              <w:rPr>
-                <w:rFonts w:eastAsia="Times New Roman" w:hAnsi="Georgia" w:cs="Times New Roman"/>
-                <w:sz w:val="24"/>
-                <w:szCs w:val="24"/>
-                <w:lang w:eastAsia="es-CO"/>
-              </w:rPr>
-              <w:t xml:space="preserve"> (</w:t>
-            </w:r>
-            <w:proofErr w:type="spellStart"/>
-            <w:r>
-              <w:rPr>
-                <w:rFonts w:eastAsia="Times New Roman" w:hAnsi="Georgia" w:cs="Times New Roman"/>
-                <w:sz w:val="24"/>
-                <w:szCs w:val="24"/>
-                <w:lang w:eastAsia="es-CO"/>
-              </w:rPr>
-              <w:t>timestamp</w:t>
-            </w:r>
-            <w:proofErr w:type="spellEnd"/>
-            <w:r>
-              <w:rPr>
-                <w:rFonts w:eastAsia="Times New Roman" w:hAnsi="Georgia" w:cs="Times New Roman"/>
-                <w:sz w:val="24"/>
-                <w:szCs w:val="24"/>
-                <w:lang w:eastAsia="es-CO"/>
-              </w:rPr>
-              <w:t xml:space="preserve">), </w:t>
-            </w:r>
-            <w:proofErr w:type="spellStart"/>
-            <w:r>
-              <w:rPr>
-                <w:rFonts w:eastAsia="Times New Roman" w:hAnsi="Georgia" w:cs="Times New Roman"/>
-                <w:sz w:val="24"/>
-                <w:szCs w:val="24"/>
-                <w:lang w:eastAsia="es-CO"/>
-              </w:rPr>
-              <w:t>id_usuario</w:t>
-            </w:r>
-            <w:proofErr w:type="spellEnd"/>
-            <w:r>
-              <w:rPr>
-                <w:rFonts w:eastAsia="Times New Roman" w:hAnsi="Georgia" w:cs="Times New Roman"/>
-                <w:sz w:val="24"/>
-                <w:szCs w:val="24"/>
-                <w:lang w:eastAsia="es-CO"/>
-              </w:rPr>
-              <w:t xml:space="preserve"> (FK, </w:t>
-            </w:r>
-            <w:proofErr w:type="spellStart"/>
-            <w:r>
-              <w:rPr>
-                <w:rFonts w:eastAsia="Times New Roman" w:hAnsi="Georgia" w:cs="Times New Roman"/>
-                <w:sz w:val="24"/>
-                <w:szCs w:val="24"/>
-                <w:lang w:eastAsia="es-CO"/>
-              </w:rPr>
-              <w:t>int</w:t>
-            </w:r>
-            <w:proofErr w:type="spellEnd"/>
-            <w:r>
-              <w:rPr>
-                <w:rFonts w:eastAsia="Times New Roman" w:hAnsi="Georgia" w:cs="Times New Roman"/>
-                <w:sz w:val="24"/>
-                <w:szCs w:val="24"/>
-                <w:lang w:eastAsia="es-CO"/>
-              </w:rPr>
-              <w:t>)</w:t>
+              <w:t>id_pqrs (PK, int), nombre (varchar100), correo (varchar100), tipo_pqrs (enum), descripcion (text), estado (enum), respuesta (text), fecha_solicitud (timestamp), fecha_respuesta (timestamp), id_usuario (FK, int)</w:t>
             </w:r>
           </w:p>
         </w:tc>
@@ -5723,7 +4823,6 @@
                 <w:lang w:val="es-CO" w:eastAsia="es-CO"/>
               </w:rPr>
             </w:pPr>
-            <w:proofErr w:type="spellStart"/>
             <w:r>
               <w:rPr>
                 <w:rFonts w:eastAsia="Times New Roman" w:hAnsi="Georgia" w:cs="Times New Roman"/>
@@ -5731,77 +4830,7 @@
                 <w:szCs w:val="24"/>
                 <w:lang w:eastAsia="es-CO"/>
               </w:rPr>
-              <w:t>id_usuario</w:t>
-            </w:r>
-            <w:proofErr w:type="spellEnd"/>
-            <w:r>
-              <w:rPr>
-                <w:rFonts w:eastAsia="Times New Roman" w:hAnsi="Georgia" w:cs="Times New Roman"/>
-                <w:sz w:val="24"/>
-                <w:szCs w:val="24"/>
-                <w:lang w:eastAsia="es-CO"/>
-              </w:rPr>
-              <w:t xml:space="preserve"> (PK, </w:t>
-            </w:r>
-            <w:proofErr w:type="spellStart"/>
-            <w:r>
-              <w:rPr>
-                <w:rFonts w:eastAsia="Times New Roman" w:hAnsi="Georgia" w:cs="Times New Roman"/>
-                <w:sz w:val="24"/>
-                <w:szCs w:val="24"/>
-                <w:lang w:eastAsia="es-CO"/>
-              </w:rPr>
-              <w:t>int</w:t>
-            </w:r>
-            <w:proofErr w:type="spellEnd"/>
-            <w:r>
-              <w:rPr>
-                <w:rFonts w:eastAsia="Times New Roman" w:hAnsi="Georgia" w:cs="Times New Roman"/>
-                <w:sz w:val="24"/>
-                <w:szCs w:val="24"/>
-                <w:lang w:eastAsia="es-CO"/>
-              </w:rPr>
-              <w:t xml:space="preserve">), nombre (varchar45), apellido (varchar45), documento (varchar45), correo (varchar45), clave (varchar200), usuario (varchar45), </w:t>
-            </w:r>
-            <w:proofErr w:type="spellStart"/>
-            <w:r>
-              <w:rPr>
-                <w:rFonts w:eastAsia="Times New Roman" w:hAnsi="Georgia" w:cs="Times New Roman"/>
-                <w:sz w:val="24"/>
-                <w:szCs w:val="24"/>
-                <w:lang w:eastAsia="es-CO"/>
-              </w:rPr>
-              <w:t>id_rol</w:t>
-            </w:r>
-            <w:proofErr w:type="spellEnd"/>
-            <w:r>
-              <w:rPr>
-                <w:rFonts w:eastAsia="Times New Roman" w:hAnsi="Georgia" w:cs="Times New Roman"/>
-                <w:sz w:val="24"/>
-                <w:szCs w:val="24"/>
-                <w:lang w:eastAsia="es-CO"/>
-              </w:rPr>
-              <w:t xml:space="preserve"> (FK, </w:t>
-            </w:r>
-            <w:proofErr w:type="spellStart"/>
-            <w:r>
-              <w:rPr>
-                <w:rFonts w:eastAsia="Times New Roman" w:hAnsi="Georgia" w:cs="Times New Roman"/>
-                <w:sz w:val="24"/>
-                <w:szCs w:val="24"/>
-                <w:lang w:eastAsia="es-CO"/>
-              </w:rPr>
-              <w:t>int</w:t>
-            </w:r>
-            <w:proofErr w:type="spellEnd"/>
-            <w:r>
-              <w:rPr>
-                <w:rFonts w:eastAsia="Times New Roman" w:hAnsi="Georgia" w:cs="Times New Roman"/>
-                <w:sz w:val="24"/>
-                <w:szCs w:val="24"/>
-                <w:lang w:eastAsia="es-CO"/>
-              </w:rPr>
-              <w:t>)</w:t>
+              <w:t>id_usuario (PK, int), nombre (varchar45), apellido (varchar45), documento (varchar45), correo (varchar45), clave (varchar200), usuario (varchar45), id_rol (FK, int)</w:t>
             </w:r>
           </w:p>
         </w:tc>
@@ -5897,7 +4926,6 @@
                 <w:lang w:val="es-CO" w:eastAsia="es-CO"/>
               </w:rPr>
             </w:pPr>
-            <w:proofErr w:type="spellStart"/>
             <w:r>
               <w:rPr>
                 <w:rFonts w:eastAsia="Times New Roman" w:hAnsi="Georgia" w:cs="Times New Roman"/>
@@ -5905,117 +4933,7 @@
                 <w:szCs w:val="24"/>
                 <w:lang w:eastAsia="es-CO"/>
               </w:rPr>
-              <w:t>id_rol</w:t>
-            </w:r>
-            <w:proofErr w:type="spellEnd"/>
-            <w:r>
-              <w:rPr>
-                <w:rFonts w:eastAsia="Times New Roman" w:hAnsi="Georgia" w:cs="Times New Roman"/>
-                <w:sz w:val="24"/>
-                <w:szCs w:val="24"/>
-                <w:lang w:eastAsia="es-CO"/>
-              </w:rPr>
-              <w:t xml:space="preserve"> (PK, </w:t>
-            </w:r>
-            <w:proofErr w:type="spellStart"/>
-            <w:r>
-              <w:rPr>
-                <w:rFonts w:eastAsia="Times New Roman" w:hAnsi="Georgia" w:cs="Times New Roman"/>
-                <w:sz w:val="24"/>
-                <w:szCs w:val="24"/>
-                <w:lang w:eastAsia="es-CO"/>
-              </w:rPr>
-              <w:t>int</w:t>
-            </w:r>
-            <w:proofErr w:type="spellEnd"/>
-            <w:r>
-              <w:rPr>
-                <w:rFonts w:eastAsia="Times New Roman" w:hAnsi="Georgia" w:cs="Times New Roman"/>
-                <w:sz w:val="24"/>
-                <w:szCs w:val="24"/>
-                <w:lang w:eastAsia="es-CO"/>
-              </w:rPr>
-              <w:t xml:space="preserve">), </w:t>
-            </w:r>
-            <w:proofErr w:type="spellStart"/>
-            <w:r>
-              <w:rPr>
-                <w:rFonts w:eastAsia="Times New Roman" w:hAnsi="Georgia" w:cs="Times New Roman"/>
-                <w:sz w:val="24"/>
-                <w:szCs w:val="24"/>
-                <w:lang w:eastAsia="es-CO"/>
-              </w:rPr>
-              <w:t>id_usuario</w:t>
-            </w:r>
-            <w:proofErr w:type="spellEnd"/>
-            <w:r>
-              <w:rPr>
-                <w:rFonts w:eastAsia="Times New Roman" w:hAnsi="Georgia" w:cs="Times New Roman"/>
-                <w:sz w:val="24"/>
-                <w:szCs w:val="24"/>
-                <w:lang w:eastAsia="es-CO"/>
-              </w:rPr>
-              <w:t xml:space="preserve"> (FK, </w:t>
-            </w:r>
-            <w:proofErr w:type="spellStart"/>
-            <w:r>
-              <w:rPr>
-                <w:rFonts w:eastAsia="Times New Roman" w:hAnsi="Georgia" w:cs="Times New Roman"/>
-                <w:sz w:val="24"/>
-                <w:szCs w:val="24"/>
-                <w:lang w:eastAsia="es-CO"/>
-              </w:rPr>
-              <w:t>int</w:t>
-            </w:r>
-            <w:proofErr w:type="spellEnd"/>
-            <w:r>
-              <w:rPr>
-                <w:rFonts w:eastAsia="Times New Roman" w:hAnsi="Georgia" w:cs="Times New Roman"/>
-                <w:sz w:val="24"/>
-                <w:szCs w:val="24"/>
-                <w:lang w:eastAsia="es-CO"/>
-              </w:rPr>
-              <w:t xml:space="preserve">), </w:t>
-            </w:r>
-            <w:proofErr w:type="spellStart"/>
-            <w:r>
-              <w:rPr>
-                <w:rFonts w:eastAsia="Times New Roman" w:hAnsi="Georgia" w:cs="Times New Roman"/>
-                <w:sz w:val="24"/>
-                <w:szCs w:val="24"/>
-                <w:lang w:eastAsia="es-CO"/>
-              </w:rPr>
-              <w:t>nombre_rol</w:t>
-            </w:r>
-            <w:proofErr w:type="spellEnd"/>
-            <w:r>
-              <w:rPr>
-                <w:rFonts w:eastAsia="Times New Roman" w:hAnsi="Georgia" w:cs="Times New Roman"/>
-                <w:sz w:val="24"/>
-                <w:szCs w:val="24"/>
-                <w:lang w:eastAsia="es-CO"/>
-              </w:rPr>
-              <w:t xml:space="preserve"> (varchar45), </w:t>
-            </w:r>
-            <w:proofErr w:type="spellStart"/>
-            <w:r>
-              <w:rPr>
-                <w:rFonts w:eastAsia="Times New Roman" w:hAnsi="Georgia" w:cs="Times New Roman"/>
-                <w:sz w:val="24"/>
-                <w:szCs w:val="24"/>
-                <w:lang w:eastAsia="es-CO"/>
-              </w:rPr>
-              <w:t>descripcion</w:t>
-            </w:r>
-            <w:proofErr w:type="spellEnd"/>
-            <w:r>
-              <w:rPr>
-                <w:rFonts w:eastAsia="Times New Roman" w:hAnsi="Georgia" w:cs="Times New Roman"/>
-                <w:sz w:val="24"/>
-                <w:szCs w:val="24"/>
-                <w:lang w:eastAsia="es-CO"/>
-              </w:rPr>
-              <w:t xml:space="preserve"> (varchar100)</w:t>
+              <w:t>id_rol (PK, int), id_usuario (FK, int), nombre_rol (varchar45), descripcion (varchar100)</w:t>
             </w:r>
           </w:p>
         </w:tc>
@@ -6110,7 +5028,6 @@
                 <w:lang w:val="es-CO" w:eastAsia="es-CO"/>
               </w:rPr>
             </w:pPr>
-            <w:proofErr w:type="spellStart"/>
             <w:r>
               <w:rPr>
                 <w:rFonts w:eastAsia="Times New Roman" w:hAnsi="Georgia" w:cs="Times New Roman"/>
@@ -6118,117 +5035,7 @@
                 <w:szCs w:val="24"/>
                 <w:lang w:eastAsia="es-CO"/>
               </w:rPr>
-              <w:t>id_venta</w:t>
-            </w:r>
-            <w:proofErr w:type="spellEnd"/>
-            <w:r>
-              <w:rPr>
-                <w:rFonts w:eastAsia="Times New Roman" w:hAnsi="Georgia" w:cs="Times New Roman"/>
-                <w:sz w:val="24"/>
-                <w:szCs w:val="24"/>
-                <w:lang w:eastAsia="es-CO"/>
-              </w:rPr>
-              <w:t xml:space="preserve"> (PK, </w:t>
-            </w:r>
-            <w:proofErr w:type="spellStart"/>
-            <w:r>
-              <w:rPr>
-                <w:rFonts w:eastAsia="Times New Roman" w:hAnsi="Georgia" w:cs="Times New Roman"/>
-                <w:sz w:val="24"/>
-                <w:szCs w:val="24"/>
-                <w:lang w:eastAsia="es-CO"/>
-              </w:rPr>
-              <w:t>int</w:t>
-            </w:r>
-            <w:proofErr w:type="spellEnd"/>
-            <w:r>
-              <w:rPr>
-                <w:rFonts w:eastAsia="Times New Roman" w:hAnsi="Georgia" w:cs="Times New Roman"/>
-                <w:sz w:val="24"/>
-                <w:szCs w:val="24"/>
-                <w:lang w:eastAsia="es-CO"/>
-              </w:rPr>
-              <w:t xml:space="preserve">), </w:t>
-            </w:r>
-            <w:proofErr w:type="spellStart"/>
-            <w:r>
-              <w:rPr>
-                <w:rFonts w:eastAsia="Times New Roman" w:hAnsi="Georgia" w:cs="Times New Roman"/>
-                <w:sz w:val="24"/>
-                <w:szCs w:val="24"/>
-                <w:lang w:eastAsia="es-CO"/>
-              </w:rPr>
-              <w:t>id_usuario</w:t>
-            </w:r>
-            <w:proofErr w:type="spellEnd"/>
-            <w:r>
-              <w:rPr>
-                <w:rFonts w:eastAsia="Times New Roman" w:hAnsi="Georgia" w:cs="Times New Roman"/>
-                <w:sz w:val="24"/>
-                <w:szCs w:val="24"/>
-                <w:lang w:eastAsia="es-CO"/>
-              </w:rPr>
-              <w:t xml:space="preserve"> (FK, </w:t>
-            </w:r>
-            <w:proofErr w:type="spellStart"/>
-            <w:r>
-              <w:rPr>
-                <w:rFonts w:eastAsia="Times New Roman" w:hAnsi="Georgia" w:cs="Times New Roman"/>
-                <w:sz w:val="24"/>
-                <w:szCs w:val="24"/>
-                <w:lang w:eastAsia="es-CO"/>
-              </w:rPr>
-              <w:t>int</w:t>
-            </w:r>
-            <w:proofErr w:type="spellEnd"/>
-            <w:r>
-              <w:rPr>
-                <w:rFonts w:eastAsia="Times New Roman" w:hAnsi="Georgia" w:cs="Times New Roman"/>
-                <w:sz w:val="24"/>
-                <w:szCs w:val="24"/>
-                <w:lang w:eastAsia="es-CO"/>
-              </w:rPr>
-              <w:t xml:space="preserve">), </w:t>
-            </w:r>
-            <w:proofErr w:type="spellStart"/>
-            <w:r>
-              <w:rPr>
-                <w:rFonts w:eastAsia="Times New Roman" w:hAnsi="Georgia" w:cs="Times New Roman"/>
-                <w:sz w:val="24"/>
-                <w:szCs w:val="24"/>
-                <w:lang w:eastAsia="es-CO"/>
-              </w:rPr>
-              <w:t>id_pedido</w:t>
-            </w:r>
-            <w:proofErr w:type="spellEnd"/>
-            <w:r>
-              <w:rPr>
-                <w:rFonts w:eastAsia="Times New Roman" w:hAnsi="Georgia" w:cs="Times New Roman"/>
-                <w:sz w:val="24"/>
-                <w:szCs w:val="24"/>
-                <w:lang w:eastAsia="es-CO"/>
-              </w:rPr>
-              <w:t xml:space="preserve"> (FK, </w:t>
-            </w:r>
-            <w:proofErr w:type="spellStart"/>
-            <w:r>
-              <w:rPr>
-                <w:rFonts w:eastAsia="Times New Roman" w:hAnsi="Georgia" w:cs="Times New Roman"/>
-                <w:sz w:val="24"/>
-                <w:szCs w:val="24"/>
-                <w:lang w:eastAsia="es-CO"/>
-              </w:rPr>
-              <w:t>int</w:t>
-            </w:r>
-            <w:proofErr w:type="spellEnd"/>
-            <w:r>
-              <w:rPr>
-                <w:rFonts w:eastAsia="Times New Roman" w:hAnsi="Georgia" w:cs="Times New Roman"/>
-                <w:sz w:val="24"/>
-                <w:szCs w:val="24"/>
-                <w:lang w:eastAsia="es-CO"/>
-              </w:rPr>
-              <w:t>), total (decimal10,2), estado (varchar20), fecha (date)</w:t>
+              <w:t>id_venta (PK, int), id_usuario (FK, int), id_pedido (FK, int), total (decimal10,2), estado (varchar20), fecha (date)</w:t>
             </w:r>
           </w:p>
         </w:tc>
@@ -6273,7 +5080,6 @@
                 <w:lang w:val="es-CO" w:eastAsia="es-CO"/>
               </w:rPr>
             </w:pPr>
-            <w:proofErr w:type="spellStart"/>
             <w:r>
               <w:rPr>
                 <w:rFonts w:eastAsia="Times New Roman" w:hAnsi="Georgia" w:cs="Times New Roman"/>
@@ -6283,7 +5089,6 @@
               </w:rPr>
               <w:t>envio</w:t>
             </w:r>
-            <w:proofErr w:type="spellEnd"/>
           </w:p>
         </w:tc>
         <w:tc>
@@ -6325,7 +5130,6 @@
                 <w:lang w:val="es-CO" w:eastAsia="es-CO"/>
               </w:rPr>
             </w:pPr>
-            <w:proofErr w:type="spellStart"/>
             <w:r>
               <w:rPr>
                 <w:rFonts w:eastAsia="Times New Roman" w:hAnsi="Georgia" w:cs="Times New Roman"/>
@@ -6333,157 +5137,7 @@
                 <w:szCs w:val="24"/>
                 <w:lang w:eastAsia="es-CO"/>
               </w:rPr>
-              <w:t>id_envio</w:t>
-            </w:r>
-            <w:proofErr w:type="spellEnd"/>
-            <w:r>
-              <w:rPr>
-                <w:rFonts w:eastAsia="Times New Roman" w:hAnsi="Georgia" w:cs="Times New Roman"/>
-                <w:sz w:val="24"/>
-                <w:szCs w:val="24"/>
-                <w:lang w:eastAsia="es-CO"/>
-              </w:rPr>
-              <w:t xml:space="preserve"> (PK, </w:t>
-            </w:r>
-            <w:proofErr w:type="spellStart"/>
-            <w:r>
-              <w:rPr>
-                <w:rFonts w:eastAsia="Times New Roman" w:hAnsi="Georgia" w:cs="Times New Roman"/>
-                <w:sz w:val="24"/>
-                <w:szCs w:val="24"/>
-                <w:lang w:eastAsia="es-CO"/>
-              </w:rPr>
-              <w:t>int</w:t>
-            </w:r>
-            <w:proofErr w:type="spellEnd"/>
-            <w:r>
-              <w:rPr>
-                <w:rFonts w:eastAsia="Times New Roman" w:hAnsi="Georgia" w:cs="Times New Roman"/>
-                <w:sz w:val="24"/>
-                <w:szCs w:val="24"/>
-                <w:lang w:eastAsia="es-CO"/>
-              </w:rPr>
-              <w:t xml:space="preserve">), </w:t>
-            </w:r>
-            <w:proofErr w:type="spellStart"/>
-            <w:r>
-              <w:rPr>
-                <w:rFonts w:eastAsia="Times New Roman" w:hAnsi="Georgia" w:cs="Times New Roman"/>
-                <w:sz w:val="24"/>
-                <w:szCs w:val="24"/>
-                <w:lang w:eastAsia="es-CO"/>
-              </w:rPr>
-              <w:t>id_pedido</w:t>
-            </w:r>
-            <w:proofErr w:type="spellEnd"/>
-            <w:r>
-              <w:rPr>
-                <w:rFonts w:eastAsia="Times New Roman" w:hAnsi="Georgia" w:cs="Times New Roman"/>
-                <w:sz w:val="24"/>
-                <w:szCs w:val="24"/>
-                <w:lang w:eastAsia="es-CO"/>
-              </w:rPr>
-              <w:t xml:space="preserve"> (FK, </w:t>
-            </w:r>
-            <w:proofErr w:type="spellStart"/>
-            <w:r>
-              <w:rPr>
-                <w:rFonts w:eastAsia="Times New Roman" w:hAnsi="Georgia" w:cs="Times New Roman"/>
-                <w:sz w:val="24"/>
-                <w:szCs w:val="24"/>
-                <w:lang w:eastAsia="es-CO"/>
-              </w:rPr>
-              <w:t>int</w:t>
-            </w:r>
-            <w:proofErr w:type="spellEnd"/>
-            <w:r>
-              <w:rPr>
-                <w:rFonts w:eastAsia="Times New Roman" w:hAnsi="Georgia" w:cs="Times New Roman"/>
-                <w:sz w:val="24"/>
-                <w:szCs w:val="24"/>
-                <w:lang w:eastAsia="es-CO"/>
-              </w:rPr>
-              <w:t xml:space="preserve">), </w:t>
-            </w:r>
-            <w:proofErr w:type="spellStart"/>
-            <w:r>
-              <w:rPr>
-                <w:rFonts w:eastAsia="Times New Roman" w:hAnsi="Georgia" w:cs="Times New Roman"/>
-                <w:sz w:val="24"/>
-                <w:szCs w:val="24"/>
-                <w:lang w:eastAsia="es-CO"/>
-              </w:rPr>
-              <w:t>direccion</w:t>
-            </w:r>
-            <w:proofErr w:type="spellEnd"/>
-            <w:r>
-              <w:rPr>
-                <w:rFonts w:eastAsia="Times New Roman" w:hAnsi="Georgia" w:cs="Times New Roman"/>
-                <w:sz w:val="24"/>
-                <w:szCs w:val="24"/>
-                <w:lang w:eastAsia="es-CO"/>
-              </w:rPr>
-              <w:t xml:space="preserve"> (varchar255), ciudad (varchar100), </w:t>
-            </w:r>
-            <w:proofErr w:type="spellStart"/>
-            <w:r>
-              <w:rPr>
-                <w:rFonts w:eastAsia="Times New Roman" w:hAnsi="Georgia" w:cs="Times New Roman"/>
-                <w:sz w:val="24"/>
-                <w:szCs w:val="24"/>
-                <w:lang w:eastAsia="es-CO"/>
-              </w:rPr>
-              <w:t>telefono</w:t>
-            </w:r>
-            <w:proofErr w:type="spellEnd"/>
-            <w:r>
-              <w:rPr>
-                <w:rFonts w:eastAsia="Times New Roman" w:hAnsi="Georgia" w:cs="Times New Roman"/>
-                <w:sz w:val="24"/>
-                <w:szCs w:val="24"/>
-                <w:lang w:eastAsia="es-CO"/>
-              </w:rPr>
-              <w:t xml:space="preserve"> (varchar20), </w:t>
-            </w:r>
-            <w:proofErr w:type="spellStart"/>
-            <w:r>
-              <w:rPr>
-                <w:rFonts w:eastAsia="Times New Roman" w:hAnsi="Georgia" w:cs="Times New Roman"/>
-                <w:sz w:val="24"/>
-                <w:szCs w:val="24"/>
-                <w:lang w:eastAsia="es-CO"/>
-              </w:rPr>
-              <w:t>estado_envio</w:t>
-            </w:r>
-            <w:proofErr w:type="spellEnd"/>
-            <w:r>
-              <w:rPr>
-                <w:rFonts w:eastAsia="Times New Roman" w:hAnsi="Georgia" w:cs="Times New Roman"/>
-                <w:sz w:val="24"/>
-                <w:szCs w:val="24"/>
-                <w:lang w:eastAsia="es-CO"/>
-              </w:rPr>
-              <w:t xml:space="preserve"> (varchar50), fecha (</w:t>
-            </w:r>
-            <w:proofErr w:type="spellStart"/>
-            <w:r>
-              <w:rPr>
-                <w:rFonts w:eastAsia="Times New Roman" w:hAnsi="Georgia" w:cs="Times New Roman"/>
-                <w:sz w:val="24"/>
-                <w:szCs w:val="24"/>
-                <w:lang w:eastAsia="es-CO"/>
-              </w:rPr>
-              <w:t>timestamp</w:t>
-            </w:r>
-            <w:proofErr w:type="spellEnd"/>
-            <w:r>
-              <w:rPr>
-                <w:rFonts w:eastAsia="Times New Roman" w:hAnsi="Georgia" w:cs="Times New Roman"/>
-                <w:sz w:val="24"/>
-                <w:szCs w:val="24"/>
-                <w:lang w:eastAsia="es-CO"/>
-              </w:rPr>
-              <w:t>)</w:t>
+              <w:t>id_envio (PK, int), id_pedido (FK, int), direccion (varchar255), ciudad (varchar100), telefono (varchar20), estado_envio (varchar50), fecha (timestamp)</w:t>
             </w:r>
           </w:p>
         </w:tc>
@@ -6578,7 +5232,6 @@
                 <w:lang w:val="es-CO" w:eastAsia="es-CO"/>
               </w:rPr>
             </w:pPr>
-            <w:proofErr w:type="spellStart"/>
             <w:r>
               <w:rPr>
                 <w:rFonts w:eastAsia="Times New Roman" w:hAnsi="Georgia" w:cs="Times New Roman"/>
@@ -6586,117 +5239,7 @@
                 <w:szCs w:val="24"/>
                 <w:lang w:eastAsia="es-CO"/>
               </w:rPr>
-              <w:t>id_pedido</w:t>
-            </w:r>
-            <w:proofErr w:type="spellEnd"/>
-            <w:r>
-              <w:rPr>
-                <w:rFonts w:eastAsia="Times New Roman" w:hAnsi="Georgia" w:cs="Times New Roman"/>
-                <w:sz w:val="24"/>
-                <w:szCs w:val="24"/>
-                <w:lang w:eastAsia="es-CO"/>
-              </w:rPr>
-              <w:t xml:space="preserve"> (PK, </w:t>
-            </w:r>
-            <w:proofErr w:type="spellStart"/>
-            <w:r>
-              <w:rPr>
-                <w:rFonts w:eastAsia="Times New Roman" w:hAnsi="Georgia" w:cs="Times New Roman"/>
-                <w:sz w:val="24"/>
-                <w:szCs w:val="24"/>
-                <w:lang w:eastAsia="es-CO"/>
-              </w:rPr>
-              <w:t>int</w:t>
-            </w:r>
-            <w:proofErr w:type="spellEnd"/>
-            <w:r>
-              <w:rPr>
-                <w:rFonts w:eastAsia="Times New Roman" w:hAnsi="Georgia" w:cs="Times New Roman"/>
-                <w:sz w:val="24"/>
-                <w:szCs w:val="24"/>
-                <w:lang w:eastAsia="es-CO"/>
-              </w:rPr>
-              <w:t xml:space="preserve">), </w:t>
-            </w:r>
-            <w:proofErr w:type="spellStart"/>
-            <w:r>
-              <w:rPr>
-                <w:rFonts w:eastAsia="Times New Roman" w:hAnsi="Georgia" w:cs="Times New Roman"/>
-                <w:sz w:val="24"/>
-                <w:szCs w:val="24"/>
-                <w:lang w:eastAsia="es-CO"/>
-              </w:rPr>
-              <w:t>fecha_pedido</w:t>
-            </w:r>
-            <w:proofErr w:type="spellEnd"/>
-            <w:r>
-              <w:rPr>
-                <w:rFonts w:eastAsia="Times New Roman" w:hAnsi="Georgia" w:cs="Times New Roman"/>
-                <w:sz w:val="24"/>
-                <w:szCs w:val="24"/>
-                <w:lang w:eastAsia="es-CO"/>
-              </w:rPr>
-              <w:t xml:space="preserve"> (date), total (decimal10,2), estado (varchar50), </w:t>
-            </w:r>
-            <w:proofErr w:type="spellStart"/>
-            <w:r>
-              <w:rPr>
-                <w:rFonts w:eastAsia="Times New Roman" w:hAnsi="Georgia" w:cs="Times New Roman"/>
-                <w:sz w:val="24"/>
-                <w:szCs w:val="24"/>
-                <w:lang w:eastAsia="es-CO"/>
-              </w:rPr>
-              <w:t>metodo_pago</w:t>
-            </w:r>
-            <w:proofErr w:type="spellEnd"/>
-            <w:r>
-              <w:rPr>
-                <w:rFonts w:eastAsia="Times New Roman" w:hAnsi="Georgia" w:cs="Times New Roman"/>
-                <w:sz w:val="24"/>
-                <w:szCs w:val="24"/>
-                <w:lang w:eastAsia="es-CO"/>
-              </w:rPr>
-              <w:t xml:space="preserve"> (varchar50), </w:t>
-            </w:r>
-            <w:proofErr w:type="spellStart"/>
-            <w:r>
-              <w:rPr>
-                <w:rFonts w:eastAsia="Times New Roman" w:hAnsi="Georgia" w:cs="Times New Roman"/>
-                <w:sz w:val="24"/>
-                <w:szCs w:val="24"/>
-                <w:lang w:eastAsia="es-CO"/>
-              </w:rPr>
-              <w:t>id_usuario</w:t>
-            </w:r>
-            <w:proofErr w:type="spellEnd"/>
-            <w:r>
-              <w:rPr>
-                <w:rFonts w:eastAsia="Times New Roman" w:hAnsi="Georgia" w:cs="Times New Roman"/>
-                <w:sz w:val="24"/>
-                <w:szCs w:val="24"/>
-                <w:lang w:eastAsia="es-CO"/>
-              </w:rPr>
-              <w:t xml:space="preserve"> (FK, </w:t>
-            </w:r>
-            <w:proofErr w:type="spellStart"/>
-            <w:r>
-              <w:rPr>
-                <w:rFonts w:eastAsia="Times New Roman" w:hAnsi="Georgia" w:cs="Times New Roman"/>
-                <w:sz w:val="24"/>
-                <w:szCs w:val="24"/>
-                <w:lang w:eastAsia="es-CO"/>
-              </w:rPr>
-              <w:t>int</w:t>
-            </w:r>
-            <w:proofErr w:type="spellEnd"/>
-            <w:r>
-              <w:rPr>
-                <w:rFonts w:eastAsia="Times New Roman" w:hAnsi="Georgia" w:cs="Times New Roman"/>
-                <w:sz w:val="24"/>
-                <w:szCs w:val="24"/>
-                <w:lang w:eastAsia="es-CO"/>
-              </w:rPr>
-              <w:t>)</w:t>
+              <w:t>id_pedido (PK, int), fecha_pedido (date), total (decimal10,2), estado (varchar50), metodo_pago (varchar50), id_usuario (FK, int)</w:t>
             </w:r>
           </w:p>
         </w:tc>
@@ -6791,7 +5334,6 @@
                 <w:lang w:val="es-CO" w:eastAsia="es-CO"/>
               </w:rPr>
             </w:pPr>
-            <w:proofErr w:type="spellStart"/>
             <w:r>
               <w:rPr>
                 <w:rFonts w:eastAsia="Times New Roman" w:hAnsi="Georgia" w:cs="Times New Roman"/>
@@ -6799,137 +5341,7 @@
                 <w:szCs w:val="24"/>
                 <w:lang w:eastAsia="es-CO"/>
               </w:rPr>
-              <w:t>id_pago</w:t>
-            </w:r>
-            <w:proofErr w:type="spellEnd"/>
-            <w:r>
-              <w:rPr>
-                <w:rFonts w:eastAsia="Times New Roman" w:hAnsi="Georgia" w:cs="Times New Roman"/>
-                <w:sz w:val="24"/>
-                <w:szCs w:val="24"/>
-                <w:lang w:eastAsia="es-CO"/>
-              </w:rPr>
-              <w:t xml:space="preserve"> (PK, </w:t>
-            </w:r>
-            <w:proofErr w:type="spellStart"/>
-            <w:r>
-              <w:rPr>
-                <w:rFonts w:eastAsia="Times New Roman" w:hAnsi="Georgia" w:cs="Times New Roman"/>
-                <w:sz w:val="24"/>
-                <w:szCs w:val="24"/>
-                <w:lang w:eastAsia="es-CO"/>
-              </w:rPr>
-              <w:t>int</w:t>
-            </w:r>
-            <w:proofErr w:type="spellEnd"/>
-            <w:r>
-              <w:rPr>
-                <w:rFonts w:eastAsia="Times New Roman" w:hAnsi="Georgia" w:cs="Times New Roman"/>
-                <w:sz w:val="24"/>
-                <w:szCs w:val="24"/>
-                <w:lang w:eastAsia="es-CO"/>
-              </w:rPr>
-              <w:t xml:space="preserve">), </w:t>
-            </w:r>
-            <w:proofErr w:type="spellStart"/>
-            <w:r>
-              <w:rPr>
-                <w:rFonts w:eastAsia="Times New Roman" w:hAnsi="Georgia" w:cs="Times New Roman"/>
-                <w:sz w:val="24"/>
-                <w:szCs w:val="24"/>
-                <w:lang w:eastAsia="es-CO"/>
-              </w:rPr>
-              <w:t>id_pedido</w:t>
-            </w:r>
-            <w:proofErr w:type="spellEnd"/>
-            <w:r>
-              <w:rPr>
-                <w:rFonts w:eastAsia="Times New Roman" w:hAnsi="Georgia" w:cs="Times New Roman"/>
-                <w:sz w:val="24"/>
-                <w:szCs w:val="24"/>
-                <w:lang w:eastAsia="es-CO"/>
-              </w:rPr>
-              <w:t xml:space="preserve"> (FK, </w:t>
-            </w:r>
-            <w:proofErr w:type="spellStart"/>
-            <w:r>
-              <w:rPr>
-                <w:rFonts w:eastAsia="Times New Roman" w:hAnsi="Georgia" w:cs="Times New Roman"/>
-                <w:sz w:val="24"/>
-                <w:szCs w:val="24"/>
-                <w:lang w:eastAsia="es-CO"/>
-              </w:rPr>
-              <w:t>int</w:t>
-            </w:r>
-            <w:proofErr w:type="spellEnd"/>
-            <w:r>
-              <w:rPr>
-                <w:rFonts w:eastAsia="Times New Roman" w:hAnsi="Georgia" w:cs="Times New Roman"/>
-                <w:sz w:val="24"/>
-                <w:szCs w:val="24"/>
-                <w:lang w:eastAsia="es-CO"/>
-              </w:rPr>
-              <w:t xml:space="preserve">), </w:t>
-            </w:r>
-            <w:proofErr w:type="spellStart"/>
-            <w:r>
-              <w:rPr>
-                <w:rFonts w:eastAsia="Times New Roman" w:hAnsi="Georgia" w:cs="Times New Roman"/>
-                <w:sz w:val="24"/>
-                <w:szCs w:val="24"/>
-                <w:lang w:eastAsia="es-CO"/>
-              </w:rPr>
-              <w:t>metodo_pago</w:t>
-            </w:r>
-            <w:proofErr w:type="spellEnd"/>
-            <w:r>
-              <w:rPr>
-                <w:rFonts w:eastAsia="Times New Roman" w:hAnsi="Georgia" w:cs="Times New Roman"/>
-                <w:sz w:val="24"/>
-                <w:szCs w:val="24"/>
-                <w:lang w:eastAsia="es-CO"/>
-              </w:rPr>
-              <w:t xml:space="preserve"> (varchar255), monto (decimal10,2), </w:t>
-            </w:r>
-            <w:proofErr w:type="spellStart"/>
-            <w:r>
-              <w:rPr>
-                <w:rFonts w:eastAsia="Times New Roman" w:hAnsi="Georgia" w:cs="Times New Roman"/>
-                <w:sz w:val="24"/>
-                <w:szCs w:val="24"/>
-                <w:lang w:eastAsia="es-CO"/>
-              </w:rPr>
-              <w:t>estado_pago</w:t>
-            </w:r>
-            <w:proofErr w:type="spellEnd"/>
-            <w:r>
-              <w:rPr>
-                <w:rFonts w:eastAsia="Times New Roman" w:hAnsi="Georgia" w:cs="Times New Roman"/>
-                <w:sz w:val="24"/>
-                <w:szCs w:val="24"/>
-                <w:lang w:eastAsia="es-CO"/>
-              </w:rPr>
-              <w:t xml:space="preserve"> (varchar20), referencia (varchar100), </w:t>
-            </w:r>
-            <w:proofErr w:type="spellStart"/>
-            <w:r>
-              <w:rPr>
-                <w:rFonts w:eastAsia="Times New Roman" w:hAnsi="Georgia" w:cs="Times New Roman"/>
-                <w:sz w:val="24"/>
-                <w:szCs w:val="24"/>
-                <w:lang w:eastAsia="es-CO"/>
-              </w:rPr>
-              <w:t>fecha_pago</w:t>
-            </w:r>
-            <w:proofErr w:type="spellEnd"/>
-            <w:r>
-              <w:rPr>
-                <w:rFonts w:eastAsia="Times New Roman" w:hAnsi="Georgia" w:cs="Times New Roman"/>
-                <w:sz w:val="24"/>
-                <w:szCs w:val="24"/>
-                <w:lang w:eastAsia="es-CO"/>
-              </w:rPr>
-              <w:t xml:space="preserve"> (date)</w:t>
+              <w:t>id_pago (PK, int), id_pedido (FK, int), metodo_pago (varchar255), monto (decimal10,2), estado_pago (varchar20), referencia (varchar100), fecha_pago (date)</w:t>
             </w:r>
           </w:p>
         </w:tc>
@@ -7024,7 +5436,6 @@
                 <w:lang w:val="es-CO" w:eastAsia="es-CO"/>
               </w:rPr>
             </w:pPr>
-            <w:proofErr w:type="spellStart"/>
             <w:r>
               <w:rPr>
                 <w:rFonts w:eastAsia="Times New Roman" w:hAnsi="Georgia" w:cs="Times New Roman"/>
@@ -7032,217 +5443,7 @@
                 <w:szCs w:val="24"/>
                 <w:lang w:eastAsia="es-CO"/>
               </w:rPr>
-              <w:t>id_producto</w:t>
-            </w:r>
-            <w:proofErr w:type="spellEnd"/>
-            <w:r>
-              <w:rPr>
-                <w:rFonts w:eastAsia="Times New Roman" w:hAnsi="Georgia" w:cs="Times New Roman"/>
-                <w:sz w:val="24"/>
-                <w:szCs w:val="24"/>
-                <w:lang w:eastAsia="es-CO"/>
-              </w:rPr>
-              <w:t xml:space="preserve"> (PK, </w:t>
-            </w:r>
-            <w:proofErr w:type="spellStart"/>
-            <w:r>
-              <w:rPr>
-                <w:rFonts w:eastAsia="Times New Roman" w:hAnsi="Georgia" w:cs="Times New Roman"/>
-                <w:sz w:val="24"/>
-                <w:szCs w:val="24"/>
-                <w:lang w:eastAsia="es-CO"/>
-              </w:rPr>
-              <w:t>int</w:t>
-            </w:r>
-            <w:proofErr w:type="spellEnd"/>
-            <w:r>
-              <w:rPr>
-                <w:rFonts w:eastAsia="Times New Roman" w:hAnsi="Georgia" w:cs="Times New Roman"/>
-                <w:sz w:val="24"/>
-                <w:szCs w:val="24"/>
-                <w:lang w:eastAsia="es-CO"/>
-              </w:rPr>
-              <w:t xml:space="preserve">), </w:t>
-            </w:r>
-            <w:proofErr w:type="spellStart"/>
-            <w:r>
-              <w:rPr>
-                <w:rFonts w:eastAsia="Times New Roman" w:hAnsi="Georgia" w:cs="Times New Roman"/>
-                <w:sz w:val="24"/>
-                <w:szCs w:val="24"/>
-                <w:lang w:eastAsia="es-CO"/>
-              </w:rPr>
-              <w:t>nombre_producto</w:t>
-            </w:r>
-            <w:proofErr w:type="spellEnd"/>
-            <w:r>
-              <w:rPr>
-                <w:rFonts w:eastAsia="Times New Roman" w:hAnsi="Georgia" w:cs="Times New Roman"/>
-                <w:sz w:val="24"/>
-                <w:szCs w:val="24"/>
-                <w:lang w:eastAsia="es-CO"/>
-              </w:rPr>
-              <w:t xml:space="preserve"> (varchar100), </w:t>
-            </w:r>
-            <w:proofErr w:type="spellStart"/>
-            <w:r>
-              <w:rPr>
-                <w:rFonts w:eastAsia="Times New Roman" w:hAnsi="Georgia" w:cs="Times New Roman"/>
-                <w:sz w:val="24"/>
-                <w:szCs w:val="24"/>
-                <w:lang w:eastAsia="es-CO"/>
-              </w:rPr>
-              <w:t>descripcion</w:t>
-            </w:r>
-            <w:proofErr w:type="spellEnd"/>
-            <w:r>
-              <w:rPr>
-                <w:rFonts w:eastAsia="Times New Roman" w:hAnsi="Georgia" w:cs="Times New Roman"/>
-                <w:sz w:val="24"/>
-                <w:szCs w:val="24"/>
-                <w:lang w:eastAsia="es-CO"/>
-              </w:rPr>
-              <w:t xml:space="preserve"> (</w:t>
-            </w:r>
-            <w:proofErr w:type="spellStart"/>
-            <w:r>
-              <w:rPr>
-                <w:rFonts w:eastAsia="Times New Roman" w:hAnsi="Georgia" w:cs="Times New Roman"/>
-                <w:sz w:val="24"/>
-                <w:szCs w:val="24"/>
-                <w:lang w:eastAsia="es-CO"/>
-              </w:rPr>
-              <w:t>text</w:t>
-            </w:r>
-            <w:proofErr w:type="spellEnd"/>
-            <w:r>
-              <w:rPr>
-                <w:rFonts w:eastAsia="Times New Roman" w:hAnsi="Georgia" w:cs="Times New Roman"/>
-                <w:sz w:val="24"/>
-                <w:szCs w:val="24"/>
-                <w:lang w:eastAsia="es-CO"/>
-              </w:rPr>
-              <w:t xml:space="preserve">), </w:t>
-            </w:r>
-            <w:proofErr w:type="spellStart"/>
-            <w:r>
-              <w:rPr>
-                <w:rFonts w:eastAsia="Times New Roman" w:hAnsi="Georgia" w:cs="Times New Roman"/>
-                <w:sz w:val="24"/>
-                <w:szCs w:val="24"/>
-                <w:lang w:eastAsia="es-CO"/>
-              </w:rPr>
-              <w:t>precio_base</w:t>
-            </w:r>
-            <w:proofErr w:type="spellEnd"/>
-            <w:r>
-              <w:rPr>
-                <w:rFonts w:eastAsia="Times New Roman" w:hAnsi="Georgia" w:cs="Times New Roman"/>
-                <w:sz w:val="24"/>
-                <w:szCs w:val="24"/>
-                <w:lang w:eastAsia="es-CO"/>
-              </w:rPr>
-              <w:t xml:space="preserve"> (decimal10,2), </w:t>
-            </w:r>
-            <w:proofErr w:type="spellStart"/>
-            <w:r>
-              <w:rPr>
-                <w:rFonts w:eastAsia="Times New Roman" w:hAnsi="Georgia" w:cs="Times New Roman"/>
-                <w:sz w:val="24"/>
-                <w:szCs w:val="24"/>
-                <w:lang w:eastAsia="es-CO"/>
-              </w:rPr>
-              <w:t>categoria</w:t>
-            </w:r>
-            <w:proofErr w:type="spellEnd"/>
-            <w:r>
-              <w:rPr>
-                <w:rFonts w:eastAsia="Times New Roman" w:hAnsi="Georgia" w:cs="Times New Roman"/>
-                <w:sz w:val="24"/>
-                <w:szCs w:val="24"/>
-                <w:lang w:eastAsia="es-CO"/>
-              </w:rPr>
-              <w:t xml:space="preserve"> (varchar50), </w:t>
-            </w:r>
-            <w:proofErr w:type="spellStart"/>
-            <w:r>
-              <w:rPr>
-                <w:rFonts w:eastAsia="Times New Roman" w:hAnsi="Georgia" w:cs="Times New Roman"/>
-                <w:sz w:val="24"/>
-                <w:szCs w:val="24"/>
-                <w:lang w:eastAsia="es-CO"/>
-              </w:rPr>
-              <w:t>stock_disponible</w:t>
-            </w:r>
-            <w:proofErr w:type="spellEnd"/>
-            <w:r>
-              <w:rPr>
-                <w:rFonts w:eastAsia="Times New Roman" w:hAnsi="Georgia" w:cs="Times New Roman"/>
-                <w:sz w:val="24"/>
-                <w:szCs w:val="24"/>
-                <w:lang w:eastAsia="es-CO"/>
-              </w:rPr>
-              <w:t xml:space="preserve"> (</w:t>
-            </w:r>
-            <w:proofErr w:type="spellStart"/>
-            <w:r>
-              <w:rPr>
-                <w:rFonts w:eastAsia="Times New Roman" w:hAnsi="Georgia" w:cs="Times New Roman"/>
-                <w:sz w:val="24"/>
-                <w:szCs w:val="24"/>
-                <w:lang w:eastAsia="es-CO"/>
-              </w:rPr>
-              <w:t>int</w:t>
-            </w:r>
-            <w:proofErr w:type="spellEnd"/>
-            <w:r>
-              <w:rPr>
-                <w:rFonts w:eastAsia="Times New Roman" w:hAnsi="Georgia" w:cs="Times New Roman"/>
-                <w:sz w:val="24"/>
-                <w:szCs w:val="24"/>
-                <w:lang w:eastAsia="es-CO"/>
-              </w:rPr>
-              <w:t xml:space="preserve">), activo (tinyint1), </w:t>
-            </w:r>
-            <w:proofErr w:type="spellStart"/>
-            <w:r>
-              <w:rPr>
-                <w:rFonts w:eastAsia="Times New Roman" w:hAnsi="Georgia" w:cs="Times New Roman"/>
-                <w:sz w:val="24"/>
-                <w:szCs w:val="24"/>
-                <w:lang w:eastAsia="es-CO"/>
-              </w:rPr>
-              <w:t>fecha_creacion</w:t>
-            </w:r>
-            <w:proofErr w:type="spellEnd"/>
-            <w:r>
-              <w:rPr>
-                <w:rFonts w:eastAsia="Times New Roman" w:hAnsi="Georgia" w:cs="Times New Roman"/>
-                <w:sz w:val="24"/>
-                <w:szCs w:val="24"/>
-                <w:lang w:eastAsia="es-CO"/>
-              </w:rPr>
-              <w:t xml:space="preserve"> (</w:t>
-            </w:r>
-            <w:proofErr w:type="spellStart"/>
-            <w:r>
-              <w:rPr>
-                <w:rFonts w:eastAsia="Times New Roman" w:hAnsi="Georgia" w:cs="Times New Roman"/>
-                <w:sz w:val="24"/>
-                <w:szCs w:val="24"/>
-                <w:lang w:eastAsia="es-CO"/>
-              </w:rPr>
-              <w:t>timestamp</w:t>
-            </w:r>
-            <w:proofErr w:type="spellEnd"/>
-            <w:r>
-              <w:rPr>
-                <w:rFonts w:eastAsia="Times New Roman" w:hAnsi="Georgia" w:cs="Times New Roman"/>
-                <w:sz w:val="24"/>
-                <w:szCs w:val="24"/>
-                <w:lang w:eastAsia="es-CO"/>
-              </w:rPr>
-              <w:t>), imagen (varchar255)</w:t>
+              <w:t>id_producto (PK, int), nombre_producto (varchar100), descripcion (text), precio_base (decimal10,2), categoria (varchar50), stock_disponible (int), activo (tinyint1), fecha_creacion (timestamp), imagen (varchar255)</w:t>
             </w:r>
           </w:p>
         </w:tc>
@@ -7287,7 +5488,6 @@
                 <w:lang w:val="es-CO" w:eastAsia="es-CO"/>
               </w:rPr>
             </w:pPr>
-            <w:proofErr w:type="spellStart"/>
             <w:r>
               <w:rPr>
                 <w:rFonts w:eastAsia="Times New Roman" w:hAnsi="Georgia" w:cs="Times New Roman"/>
@@ -7297,7 +5497,6 @@
               </w:rPr>
               <w:t>detalle_pedido</w:t>
             </w:r>
-            <w:proofErr w:type="spellEnd"/>
           </w:p>
         </w:tc>
         <w:tc>
@@ -7339,7 +5538,6 @@
                 <w:lang w:val="es-CO" w:eastAsia="es-CO"/>
               </w:rPr>
             </w:pPr>
-            <w:proofErr w:type="spellStart"/>
             <w:r>
               <w:rPr>
                 <w:rFonts w:eastAsia="Times New Roman" w:hAnsi="Georgia" w:cs="Times New Roman"/>
@@ -7347,217 +5545,7 @@
                 <w:szCs w:val="24"/>
                 <w:lang w:eastAsia="es-CO"/>
               </w:rPr>
-              <w:t>id_detalle</w:t>
-            </w:r>
-            <w:proofErr w:type="spellEnd"/>
-            <w:r>
-              <w:rPr>
-                <w:rFonts w:eastAsia="Times New Roman" w:hAnsi="Georgia" w:cs="Times New Roman"/>
-                <w:sz w:val="24"/>
-                <w:szCs w:val="24"/>
-                <w:lang w:eastAsia="es-CO"/>
-              </w:rPr>
-              <w:t xml:space="preserve"> (PK, </w:t>
-            </w:r>
-            <w:proofErr w:type="spellStart"/>
-            <w:r>
-              <w:rPr>
-                <w:rFonts w:eastAsia="Times New Roman" w:hAnsi="Georgia" w:cs="Times New Roman"/>
-                <w:sz w:val="24"/>
-                <w:szCs w:val="24"/>
-                <w:lang w:eastAsia="es-CO"/>
-              </w:rPr>
-              <w:t>int</w:t>
-            </w:r>
-            <w:proofErr w:type="spellEnd"/>
-            <w:r>
-              <w:rPr>
-                <w:rFonts w:eastAsia="Times New Roman" w:hAnsi="Georgia" w:cs="Times New Roman"/>
-                <w:sz w:val="24"/>
-                <w:szCs w:val="24"/>
-                <w:lang w:eastAsia="es-CO"/>
-              </w:rPr>
-              <w:t xml:space="preserve">), </w:t>
-            </w:r>
-            <w:proofErr w:type="spellStart"/>
-            <w:r>
-              <w:rPr>
-                <w:rFonts w:eastAsia="Times New Roman" w:hAnsi="Georgia" w:cs="Times New Roman"/>
-                <w:sz w:val="24"/>
-                <w:szCs w:val="24"/>
-                <w:lang w:eastAsia="es-CO"/>
-              </w:rPr>
-              <w:t>id_producto</w:t>
-            </w:r>
-            <w:proofErr w:type="spellEnd"/>
-            <w:r>
-              <w:rPr>
-                <w:rFonts w:eastAsia="Times New Roman" w:hAnsi="Georgia" w:cs="Times New Roman"/>
-                <w:sz w:val="24"/>
-                <w:szCs w:val="24"/>
-                <w:lang w:eastAsia="es-CO"/>
-              </w:rPr>
-              <w:t xml:space="preserve"> (FK, </w:t>
-            </w:r>
-            <w:proofErr w:type="spellStart"/>
-            <w:r>
-              <w:rPr>
-                <w:rFonts w:eastAsia="Times New Roman" w:hAnsi="Georgia" w:cs="Times New Roman"/>
-                <w:sz w:val="24"/>
-                <w:szCs w:val="24"/>
-                <w:lang w:eastAsia="es-CO"/>
-              </w:rPr>
-              <w:t>int</w:t>
-            </w:r>
-            <w:proofErr w:type="spellEnd"/>
-            <w:r>
-              <w:rPr>
-                <w:rFonts w:eastAsia="Times New Roman" w:hAnsi="Georgia" w:cs="Times New Roman"/>
-                <w:sz w:val="24"/>
-                <w:szCs w:val="24"/>
-                <w:lang w:eastAsia="es-CO"/>
-              </w:rPr>
-              <w:t xml:space="preserve">), </w:t>
-            </w:r>
-            <w:proofErr w:type="spellStart"/>
-            <w:r>
-              <w:rPr>
-                <w:rFonts w:eastAsia="Times New Roman" w:hAnsi="Georgia" w:cs="Times New Roman"/>
-                <w:sz w:val="24"/>
-                <w:szCs w:val="24"/>
-                <w:lang w:eastAsia="es-CO"/>
-              </w:rPr>
-              <w:t>nombre_producto</w:t>
-            </w:r>
-            <w:proofErr w:type="spellEnd"/>
-            <w:r>
-              <w:rPr>
-                <w:rFonts w:eastAsia="Times New Roman" w:hAnsi="Georgia" w:cs="Times New Roman"/>
-                <w:sz w:val="24"/>
-                <w:szCs w:val="24"/>
-                <w:lang w:eastAsia="es-CO"/>
-              </w:rPr>
-              <w:t xml:space="preserve"> (varchar100), imagen (varchar255), </w:t>
-            </w:r>
-            <w:proofErr w:type="spellStart"/>
-            <w:r>
-              <w:rPr>
-                <w:rFonts w:eastAsia="Times New Roman" w:hAnsi="Georgia" w:cs="Times New Roman"/>
-                <w:sz w:val="24"/>
-                <w:szCs w:val="24"/>
-                <w:lang w:eastAsia="es-CO"/>
-              </w:rPr>
-              <w:t>id_pedido</w:t>
-            </w:r>
-            <w:proofErr w:type="spellEnd"/>
-            <w:r>
-              <w:rPr>
-                <w:rFonts w:eastAsia="Times New Roman" w:hAnsi="Georgia" w:cs="Times New Roman"/>
-                <w:sz w:val="24"/>
-                <w:szCs w:val="24"/>
-                <w:lang w:eastAsia="es-CO"/>
-              </w:rPr>
-              <w:t xml:space="preserve"> (FK, </w:t>
-            </w:r>
-            <w:proofErr w:type="spellStart"/>
-            <w:r>
-              <w:rPr>
-                <w:rFonts w:eastAsia="Times New Roman" w:hAnsi="Georgia" w:cs="Times New Roman"/>
-                <w:sz w:val="24"/>
-                <w:szCs w:val="24"/>
-                <w:lang w:eastAsia="es-CO"/>
-              </w:rPr>
-              <w:t>int</w:t>
-            </w:r>
-            <w:proofErr w:type="spellEnd"/>
-            <w:r>
-              <w:rPr>
-                <w:rFonts w:eastAsia="Times New Roman" w:hAnsi="Georgia" w:cs="Times New Roman"/>
-                <w:sz w:val="24"/>
-                <w:szCs w:val="24"/>
-                <w:lang w:eastAsia="es-CO"/>
-              </w:rPr>
-              <w:t xml:space="preserve">), </w:t>
-            </w:r>
-            <w:proofErr w:type="spellStart"/>
-            <w:r>
-              <w:rPr>
-                <w:rFonts w:eastAsia="Times New Roman" w:hAnsi="Georgia" w:cs="Times New Roman"/>
-                <w:sz w:val="24"/>
-                <w:szCs w:val="24"/>
-                <w:lang w:eastAsia="es-CO"/>
-              </w:rPr>
-              <w:t>id_personalizacion</w:t>
-            </w:r>
-            <w:proofErr w:type="spellEnd"/>
-            <w:r>
-              <w:rPr>
-                <w:rFonts w:eastAsia="Times New Roman" w:hAnsi="Georgia" w:cs="Times New Roman"/>
-                <w:sz w:val="24"/>
-                <w:szCs w:val="24"/>
-                <w:lang w:eastAsia="es-CO"/>
-              </w:rPr>
-              <w:t xml:space="preserve"> (FK, </w:t>
-            </w:r>
-            <w:proofErr w:type="spellStart"/>
-            <w:r>
-              <w:rPr>
-                <w:rFonts w:eastAsia="Times New Roman" w:hAnsi="Georgia" w:cs="Times New Roman"/>
-                <w:sz w:val="24"/>
-                <w:szCs w:val="24"/>
-                <w:lang w:eastAsia="es-CO"/>
-              </w:rPr>
-              <w:t>int</w:t>
-            </w:r>
-            <w:proofErr w:type="spellEnd"/>
-            <w:r>
-              <w:rPr>
-                <w:rFonts w:eastAsia="Times New Roman" w:hAnsi="Georgia" w:cs="Times New Roman"/>
-                <w:sz w:val="24"/>
-                <w:szCs w:val="24"/>
-                <w:lang w:eastAsia="es-CO"/>
-              </w:rPr>
-              <w:t>), cantidad (</w:t>
-            </w:r>
-            <w:proofErr w:type="spellStart"/>
-            <w:r>
-              <w:rPr>
-                <w:rFonts w:eastAsia="Times New Roman" w:hAnsi="Georgia" w:cs="Times New Roman"/>
-                <w:sz w:val="24"/>
-                <w:szCs w:val="24"/>
-                <w:lang w:eastAsia="es-CO"/>
-              </w:rPr>
-              <w:t>int</w:t>
-            </w:r>
-            <w:proofErr w:type="spellEnd"/>
-            <w:r>
-              <w:rPr>
-                <w:rFonts w:eastAsia="Times New Roman" w:hAnsi="Georgia" w:cs="Times New Roman"/>
-                <w:sz w:val="24"/>
-                <w:szCs w:val="24"/>
-                <w:lang w:eastAsia="es-CO"/>
-              </w:rPr>
-              <w:t xml:space="preserve">), </w:t>
-            </w:r>
-            <w:proofErr w:type="spellStart"/>
-            <w:r>
-              <w:rPr>
-                <w:rFonts w:eastAsia="Times New Roman" w:hAnsi="Georgia" w:cs="Times New Roman"/>
-                <w:sz w:val="24"/>
-                <w:szCs w:val="24"/>
-                <w:lang w:eastAsia="es-CO"/>
-              </w:rPr>
-              <w:t>precio_unitario</w:t>
-            </w:r>
-            <w:proofErr w:type="spellEnd"/>
-            <w:r>
-              <w:rPr>
-                <w:rFonts w:eastAsia="Times New Roman" w:hAnsi="Georgia" w:cs="Times New Roman"/>
-                <w:sz w:val="24"/>
-                <w:szCs w:val="24"/>
-                <w:lang w:eastAsia="es-CO"/>
-              </w:rPr>
-              <w:t xml:space="preserve"> (decimal10,2), subtotal (decimal10,2)</w:t>
+              <w:t>id_detalle (PK, int), id_producto (FK, int), nombre_producto (varchar100), imagen (varchar255), id_pedido (FK, int), id_personalizacion (FK, int), cantidad (int), precio_unitario (decimal10,2), subtotal (decimal10,2)</w:t>
             </w:r>
           </w:p>
         </w:tc>
@@ -7652,7 +5640,6 @@
                 <w:lang w:val="es-CO" w:eastAsia="es-CO"/>
               </w:rPr>
             </w:pPr>
-            <w:proofErr w:type="spellStart"/>
             <w:r>
               <w:rPr>
                 <w:rFonts w:eastAsia="Times New Roman" w:hAnsi="Georgia" w:cs="Times New Roman"/>
@@ -7660,277 +5647,7 @@
                 <w:szCs w:val="24"/>
                 <w:lang w:eastAsia="es-CO"/>
               </w:rPr>
-              <w:t>id_inventario</w:t>
-            </w:r>
-            <w:proofErr w:type="spellEnd"/>
-            <w:r>
-              <w:rPr>
-                <w:rFonts w:eastAsia="Times New Roman" w:hAnsi="Georgia" w:cs="Times New Roman"/>
-                <w:sz w:val="24"/>
-                <w:szCs w:val="24"/>
-                <w:lang w:eastAsia="es-CO"/>
-              </w:rPr>
-              <w:t xml:space="preserve"> (PK, </w:t>
-            </w:r>
-            <w:proofErr w:type="spellStart"/>
-            <w:r>
-              <w:rPr>
-                <w:rFonts w:eastAsia="Times New Roman" w:hAnsi="Georgia" w:cs="Times New Roman"/>
-                <w:sz w:val="24"/>
-                <w:szCs w:val="24"/>
-                <w:lang w:eastAsia="es-CO"/>
-              </w:rPr>
-              <w:t>int</w:t>
-            </w:r>
-            <w:proofErr w:type="spellEnd"/>
-            <w:r>
-              <w:rPr>
-                <w:rFonts w:eastAsia="Times New Roman" w:hAnsi="Georgia" w:cs="Times New Roman"/>
-                <w:sz w:val="24"/>
-                <w:szCs w:val="24"/>
-                <w:lang w:eastAsia="es-CO"/>
-              </w:rPr>
-              <w:t xml:space="preserve">), </w:t>
-            </w:r>
-            <w:proofErr w:type="spellStart"/>
-            <w:r>
-              <w:rPr>
-                <w:rFonts w:eastAsia="Times New Roman" w:hAnsi="Georgia" w:cs="Times New Roman"/>
-                <w:sz w:val="24"/>
-                <w:szCs w:val="24"/>
-                <w:lang w:eastAsia="es-CO"/>
-              </w:rPr>
-              <w:t>id_producto</w:t>
-            </w:r>
-            <w:proofErr w:type="spellEnd"/>
-            <w:r>
-              <w:rPr>
-                <w:rFonts w:eastAsia="Times New Roman" w:hAnsi="Georgia" w:cs="Times New Roman"/>
-                <w:sz w:val="24"/>
-                <w:szCs w:val="24"/>
-                <w:lang w:eastAsia="es-CO"/>
-              </w:rPr>
-              <w:t xml:space="preserve"> (FK, </w:t>
-            </w:r>
-            <w:proofErr w:type="spellStart"/>
-            <w:r>
-              <w:rPr>
-                <w:rFonts w:eastAsia="Times New Roman" w:hAnsi="Georgia" w:cs="Times New Roman"/>
-                <w:sz w:val="24"/>
-                <w:szCs w:val="24"/>
-                <w:lang w:eastAsia="es-CO"/>
-              </w:rPr>
-              <w:t>int</w:t>
-            </w:r>
-            <w:proofErr w:type="spellEnd"/>
-            <w:r>
-              <w:rPr>
-                <w:rFonts w:eastAsia="Times New Roman" w:hAnsi="Georgia" w:cs="Times New Roman"/>
-                <w:sz w:val="24"/>
-                <w:szCs w:val="24"/>
-                <w:lang w:eastAsia="es-CO"/>
-              </w:rPr>
-              <w:t>), tipo (</w:t>
-            </w:r>
-            <w:proofErr w:type="spellStart"/>
-            <w:r>
-              <w:rPr>
-                <w:rFonts w:eastAsia="Times New Roman" w:hAnsi="Georgia" w:cs="Times New Roman"/>
-                <w:sz w:val="24"/>
-                <w:szCs w:val="24"/>
-                <w:lang w:eastAsia="es-CO"/>
-              </w:rPr>
-              <w:t>enum</w:t>
-            </w:r>
-            <w:proofErr w:type="spellEnd"/>
-            <w:r>
-              <w:rPr>
-                <w:rFonts w:eastAsia="Times New Roman" w:hAnsi="Georgia" w:cs="Times New Roman"/>
-                <w:sz w:val="24"/>
-                <w:szCs w:val="24"/>
-                <w:lang w:eastAsia="es-CO"/>
-              </w:rPr>
-              <w:t>), cantidad (</w:t>
-            </w:r>
-            <w:proofErr w:type="spellStart"/>
-            <w:r>
-              <w:rPr>
-                <w:rFonts w:eastAsia="Times New Roman" w:hAnsi="Georgia" w:cs="Times New Roman"/>
-                <w:sz w:val="24"/>
-                <w:szCs w:val="24"/>
-                <w:lang w:eastAsia="es-CO"/>
-              </w:rPr>
-              <w:t>int</w:t>
-            </w:r>
-            <w:proofErr w:type="spellEnd"/>
-            <w:r>
-              <w:rPr>
-                <w:rFonts w:eastAsia="Times New Roman" w:hAnsi="Georgia" w:cs="Times New Roman"/>
-                <w:sz w:val="24"/>
-                <w:szCs w:val="24"/>
-                <w:lang w:eastAsia="es-CO"/>
-              </w:rPr>
-              <w:t xml:space="preserve">), </w:t>
-            </w:r>
-            <w:proofErr w:type="spellStart"/>
-            <w:r>
-              <w:rPr>
-                <w:rFonts w:eastAsia="Times New Roman" w:hAnsi="Georgia" w:cs="Times New Roman"/>
-                <w:sz w:val="24"/>
-                <w:szCs w:val="24"/>
-                <w:lang w:eastAsia="es-CO"/>
-              </w:rPr>
-              <w:t>stock_resultante</w:t>
-            </w:r>
-            <w:proofErr w:type="spellEnd"/>
-            <w:r>
-              <w:rPr>
-                <w:rFonts w:eastAsia="Times New Roman" w:hAnsi="Georgia" w:cs="Times New Roman"/>
-                <w:sz w:val="24"/>
-                <w:szCs w:val="24"/>
-                <w:lang w:eastAsia="es-CO"/>
-              </w:rPr>
-              <w:t xml:space="preserve"> (</w:t>
-            </w:r>
-            <w:proofErr w:type="spellStart"/>
-            <w:r>
-              <w:rPr>
-                <w:rFonts w:eastAsia="Times New Roman" w:hAnsi="Georgia" w:cs="Times New Roman"/>
-                <w:sz w:val="24"/>
-                <w:szCs w:val="24"/>
-                <w:lang w:eastAsia="es-CO"/>
-              </w:rPr>
-              <w:t>int</w:t>
-            </w:r>
-            <w:proofErr w:type="spellEnd"/>
-            <w:r>
-              <w:rPr>
-                <w:rFonts w:eastAsia="Times New Roman" w:hAnsi="Georgia" w:cs="Times New Roman"/>
-                <w:sz w:val="24"/>
-                <w:szCs w:val="24"/>
-                <w:lang w:eastAsia="es-CO"/>
-              </w:rPr>
-              <w:t xml:space="preserve">), </w:t>
-            </w:r>
-            <w:proofErr w:type="spellStart"/>
-            <w:r>
-              <w:rPr>
-                <w:rFonts w:eastAsia="Times New Roman" w:hAnsi="Georgia" w:cs="Times New Roman"/>
-                <w:sz w:val="24"/>
-                <w:szCs w:val="24"/>
-                <w:lang w:eastAsia="es-CO"/>
-              </w:rPr>
-              <w:t>stock_minimo</w:t>
-            </w:r>
-            <w:proofErr w:type="spellEnd"/>
-            <w:r>
-              <w:rPr>
-                <w:rFonts w:eastAsia="Times New Roman" w:hAnsi="Georgia" w:cs="Times New Roman"/>
-                <w:sz w:val="24"/>
-                <w:szCs w:val="24"/>
-                <w:lang w:eastAsia="es-CO"/>
-              </w:rPr>
-              <w:t xml:space="preserve"> (</w:t>
-            </w:r>
-            <w:proofErr w:type="spellStart"/>
-            <w:r>
-              <w:rPr>
-                <w:rFonts w:eastAsia="Times New Roman" w:hAnsi="Georgia" w:cs="Times New Roman"/>
-                <w:sz w:val="24"/>
-                <w:szCs w:val="24"/>
-                <w:lang w:eastAsia="es-CO"/>
-              </w:rPr>
-              <w:t>int</w:t>
-            </w:r>
-            <w:proofErr w:type="spellEnd"/>
-            <w:r>
-              <w:rPr>
-                <w:rFonts w:eastAsia="Times New Roman" w:hAnsi="Georgia" w:cs="Times New Roman"/>
-                <w:sz w:val="24"/>
-                <w:szCs w:val="24"/>
-                <w:lang w:eastAsia="es-CO"/>
-              </w:rPr>
-              <w:t xml:space="preserve">), motivo (varchar255), </w:t>
-            </w:r>
-            <w:proofErr w:type="spellStart"/>
-            <w:r>
-              <w:rPr>
-                <w:rFonts w:eastAsia="Times New Roman" w:hAnsi="Georgia" w:cs="Times New Roman"/>
-                <w:sz w:val="24"/>
-                <w:szCs w:val="24"/>
-                <w:lang w:eastAsia="es-CO"/>
-              </w:rPr>
-              <w:t>id_referencia</w:t>
-            </w:r>
-            <w:proofErr w:type="spellEnd"/>
-            <w:r>
-              <w:rPr>
-                <w:rFonts w:eastAsia="Times New Roman" w:hAnsi="Georgia" w:cs="Times New Roman"/>
-                <w:sz w:val="24"/>
-                <w:szCs w:val="24"/>
-                <w:lang w:eastAsia="es-CO"/>
-              </w:rPr>
-              <w:t xml:space="preserve"> (</w:t>
-            </w:r>
-            <w:proofErr w:type="spellStart"/>
-            <w:r>
-              <w:rPr>
-                <w:rFonts w:eastAsia="Times New Roman" w:hAnsi="Georgia" w:cs="Times New Roman"/>
-                <w:sz w:val="24"/>
-                <w:szCs w:val="24"/>
-                <w:lang w:eastAsia="es-CO"/>
-              </w:rPr>
-              <w:t>int</w:t>
-            </w:r>
-            <w:proofErr w:type="spellEnd"/>
-            <w:r>
-              <w:rPr>
-                <w:rFonts w:eastAsia="Times New Roman" w:hAnsi="Georgia" w:cs="Times New Roman"/>
-                <w:sz w:val="24"/>
-                <w:szCs w:val="24"/>
-                <w:lang w:eastAsia="es-CO"/>
-              </w:rPr>
-              <w:t xml:space="preserve">), </w:t>
-            </w:r>
-            <w:proofErr w:type="spellStart"/>
-            <w:r>
-              <w:rPr>
-                <w:rFonts w:eastAsia="Times New Roman" w:hAnsi="Georgia" w:cs="Times New Roman"/>
-                <w:sz w:val="24"/>
-                <w:szCs w:val="24"/>
-                <w:lang w:eastAsia="es-CO"/>
-              </w:rPr>
-              <w:t>fecha_movimiento</w:t>
-            </w:r>
-            <w:proofErr w:type="spellEnd"/>
-            <w:r>
-              <w:rPr>
-                <w:rFonts w:eastAsia="Times New Roman" w:hAnsi="Georgia" w:cs="Times New Roman"/>
-                <w:sz w:val="24"/>
-                <w:szCs w:val="24"/>
-                <w:lang w:eastAsia="es-CO"/>
-              </w:rPr>
-              <w:t xml:space="preserve"> (</w:t>
-            </w:r>
-            <w:proofErr w:type="spellStart"/>
-            <w:r>
-              <w:rPr>
-                <w:rFonts w:eastAsia="Times New Roman" w:hAnsi="Georgia" w:cs="Times New Roman"/>
-                <w:sz w:val="24"/>
-                <w:szCs w:val="24"/>
-                <w:lang w:eastAsia="es-CO"/>
-              </w:rPr>
-              <w:t>datetime</w:t>
-            </w:r>
-            <w:proofErr w:type="spellEnd"/>
-            <w:r>
-              <w:rPr>
-                <w:rFonts w:eastAsia="Times New Roman" w:hAnsi="Georgia" w:cs="Times New Roman"/>
-                <w:sz w:val="24"/>
-                <w:szCs w:val="24"/>
-                <w:lang w:eastAsia="es-CO"/>
-              </w:rPr>
-              <w:t>)</w:t>
+              <w:t>id_inventario (PK, int), id_producto (FK, int), tipo (enum), cantidad (int), stock_resultante (int), stock_minimo (int), motivo (varchar255), id_referencia (int), fecha_movimiento (datetime)</w:t>
             </w:r>
           </w:p>
         </w:tc>
@@ -7975,7 +5692,6 @@
                 <w:lang w:val="es-CO" w:eastAsia="es-CO"/>
               </w:rPr>
             </w:pPr>
-            <w:proofErr w:type="spellStart"/>
             <w:r>
               <w:rPr>
                 <w:rFonts w:eastAsia="Times New Roman" w:hAnsi="Georgia" w:cs="Times New Roman"/>
@@ -7985,7 +5701,6 @@
               </w:rPr>
               <w:t>personalizacion</w:t>
             </w:r>
-            <w:proofErr w:type="spellEnd"/>
           </w:p>
         </w:tc>
         <w:tc>
@@ -8027,7 +5742,6 @@
                 <w:lang w:val="es-CO" w:eastAsia="es-CO"/>
               </w:rPr>
             </w:pPr>
-            <w:proofErr w:type="spellStart"/>
             <w:r>
               <w:rPr>
                 <w:rFonts w:eastAsia="Times New Roman" w:hAnsi="Georgia" w:cs="Times New Roman"/>
@@ -8035,217 +5749,7 @@
                 <w:szCs w:val="24"/>
                 <w:lang w:eastAsia="es-CO"/>
               </w:rPr>
-              <w:t>id_personalizacion</w:t>
-            </w:r>
-            <w:proofErr w:type="spellEnd"/>
-            <w:r>
-              <w:rPr>
-                <w:rFonts w:eastAsia="Times New Roman" w:hAnsi="Georgia" w:cs="Times New Roman"/>
-                <w:sz w:val="24"/>
-                <w:szCs w:val="24"/>
-                <w:lang w:eastAsia="es-CO"/>
-              </w:rPr>
-              <w:t xml:space="preserve"> (PK, </w:t>
-            </w:r>
-            <w:proofErr w:type="spellStart"/>
-            <w:r>
-              <w:rPr>
-                <w:rFonts w:eastAsia="Times New Roman" w:hAnsi="Georgia" w:cs="Times New Roman"/>
-                <w:sz w:val="24"/>
-                <w:szCs w:val="24"/>
-                <w:lang w:eastAsia="es-CO"/>
-              </w:rPr>
-              <w:t>int</w:t>
-            </w:r>
-            <w:proofErr w:type="spellEnd"/>
-            <w:r>
-              <w:rPr>
-                <w:rFonts w:eastAsia="Times New Roman" w:hAnsi="Georgia" w:cs="Times New Roman"/>
-                <w:sz w:val="24"/>
-                <w:szCs w:val="24"/>
-                <w:lang w:eastAsia="es-CO"/>
-              </w:rPr>
-              <w:t xml:space="preserve">), </w:t>
-            </w:r>
-            <w:proofErr w:type="spellStart"/>
-            <w:r>
-              <w:rPr>
-                <w:rFonts w:eastAsia="Times New Roman" w:hAnsi="Georgia" w:cs="Times New Roman"/>
-                <w:sz w:val="24"/>
-                <w:szCs w:val="24"/>
-                <w:lang w:eastAsia="es-CO"/>
-              </w:rPr>
-              <w:t>id_pedido</w:t>
-            </w:r>
-            <w:proofErr w:type="spellEnd"/>
-            <w:r>
-              <w:rPr>
-                <w:rFonts w:eastAsia="Times New Roman" w:hAnsi="Georgia" w:cs="Times New Roman"/>
-                <w:sz w:val="24"/>
-                <w:szCs w:val="24"/>
-                <w:lang w:eastAsia="es-CO"/>
-              </w:rPr>
-              <w:t xml:space="preserve"> (FK, </w:t>
-            </w:r>
-            <w:proofErr w:type="spellStart"/>
-            <w:r>
-              <w:rPr>
-                <w:rFonts w:eastAsia="Times New Roman" w:hAnsi="Georgia" w:cs="Times New Roman"/>
-                <w:sz w:val="24"/>
-                <w:szCs w:val="24"/>
-                <w:lang w:eastAsia="es-CO"/>
-              </w:rPr>
-              <w:t>int</w:t>
-            </w:r>
-            <w:proofErr w:type="spellEnd"/>
-            <w:r>
-              <w:rPr>
-                <w:rFonts w:eastAsia="Times New Roman" w:hAnsi="Georgia" w:cs="Times New Roman"/>
-                <w:sz w:val="24"/>
-                <w:szCs w:val="24"/>
-                <w:lang w:eastAsia="es-CO"/>
-              </w:rPr>
-              <w:t xml:space="preserve">), </w:t>
-            </w:r>
-            <w:proofErr w:type="spellStart"/>
-            <w:r>
-              <w:rPr>
-                <w:rFonts w:eastAsia="Times New Roman" w:hAnsi="Georgia" w:cs="Times New Roman"/>
-                <w:sz w:val="24"/>
-                <w:szCs w:val="24"/>
-                <w:lang w:eastAsia="es-CO"/>
-              </w:rPr>
-              <w:t>id_producto</w:t>
-            </w:r>
-            <w:proofErr w:type="spellEnd"/>
-            <w:r>
-              <w:rPr>
-                <w:rFonts w:eastAsia="Times New Roman" w:hAnsi="Georgia" w:cs="Times New Roman"/>
-                <w:sz w:val="24"/>
-                <w:szCs w:val="24"/>
-                <w:lang w:eastAsia="es-CO"/>
-              </w:rPr>
-              <w:t xml:space="preserve"> (FK, </w:t>
-            </w:r>
-            <w:proofErr w:type="spellStart"/>
-            <w:r>
-              <w:rPr>
-                <w:rFonts w:eastAsia="Times New Roman" w:hAnsi="Georgia" w:cs="Times New Roman"/>
-                <w:sz w:val="24"/>
-                <w:szCs w:val="24"/>
-                <w:lang w:eastAsia="es-CO"/>
-              </w:rPr>
-              <w:t>int</w:t>
-            </w:r>
-            <w:proofErr w:type="spellEnd"/>
-            <w:r>
-              <w:rPr>
-                <w:rFonts w:eastAsia="Times New Roman" w:hAnsi="Georgia" w:cs="Times New Roman"/>
-                <w:sz w:val="24"/>
-                <w:szCs w:val="24"/>
-                <w:lang w:eastAsia="es-CO"/>
-              </w:rPr>
-              <w:t xml:space="preserve">), </w:t>
-            </w:r>
-            <w:proofErr w:type="spellStart"/>
-            <w:r>
-              <w:rPr>
-                <w:rFonts w:eastAsia="Times New Roman" w:hAnsi="Georgia" w:cs="Times New Roman"/>
-                <w:sz w:val="24"/>
-                <w:szCs w:val="24"/>
-                <w:lang w:eastAsia="es-CO"/>
-              </w:rPr>
-              <w:t>descripcion_personalizacion</w:t>
-            </w:r>
-            <w:proofErr w:type="spellEnd"/>
-            <w:r>
-              <w:rPr>
-                <w:rFonts w:eastAsia="Times New Roman" w:hAnsi="Georgia" w:cs="Times New Roman"/>
-                <w:sz w:val="24"/>
-                <w:szCs w:val="24"/>
-                <w:lang w:eastAsia="es-CO"/>
-              </w:rPr>
-              <w:t xml:space="preserve"> (varchar100), </w:t>
-            </w:r>
-            <w:proofErr w:type="spellStart"/>
-            <w:r>
-              <w:rPr>
-                <w:rFonts w:eastAsia="Times New Roman" w:hAnsi="Georgia" w:cs="Times New Roman"/>
-                <w:sz w:val="24"/>
-                <w:szCs w:val="24"/>
-                <w:lang w:eastAsia="es-CO"/>
-              </w:rPr>
-              <w:t>tipo_personalizacion</w:t>
-            </w:r>
-            <w:proofErr w:type="spellEnd"/>
-            <w:r>
-              <w:rPr>
-                <w:rFonts w:eastAsia="Times New Roman" w:hAnsi="Georgia" w:cs="Times New Roman"/>
-                <w:sz w:val="24"/>
-                <w:szCs w:val="24"/>
-                <w:lang w:eastAsia="es-CO"/>
-              </w:rPr>
-              <w:t xml:space="preserve"> (varchar50), </w:t>
-            </w:r>
-            <w:proofErr w:type="spellStart"/>
-            <w:r>
-              <w:rPr>
-                <w:rFonts w:eastAsia="Times New Roman" w:hAnsi="Georgia" w:cs="Times New Roman"/>
-                <w:sz w:val="24"/>
-                <w:szCs w:val="24"/>
-                <w:lang w:eastAsia="es-CO"/>
-              </w:rPr>
-              <w:t>imagen_referencia</w:t>
-            </w:r>
-            <w:proofErr w:type="spellEnd"/>
-            <w:r>
-              <w:rPr>
-                <w:rFonts w:eastAsia="Times New Roman" w:hAnsi="Georgia" w:cs="Times New Roman"/>
-                <w:sz w:val="24"/>
-                <w:szCs w:val="24"/>
-                <w:lang w:eastAsia="es-CO"/>
-              </w:rPr>
-              <w:t xml:space="preserve"> (varchar500), </w:t>
-            </w:r>
-            <w:proofErr w:type="spellStart"/>
-            <w:r>
-              <w:rPr>
-                <w:rFonts w:eastAsia="Times New Roman" w:hAnsi="Georgia" w:cs="Times New Roman"/>
-                <w:sz w:val="24"/>
-                <w:szCs w:val="24"/>
-                <w:lang w:eastAsia="es-CO"/>
-              </w:rPr>
-              <w:t>color_deseado</w:t>
-            </w:r>
-            <w:proofErr w:type="spellEnd"/>
-            <w:r>
-              <w:rPr>
-                <w:rFonts w:eastAsia="Times New Roman" w:hAnsi="Georgia" w:cs="Times New Roman"/>
-                <w:sz w:val="24"/>
-                <w:szCs w:val="24"/>
-                <w:lang w:eastAsia="es-CO"/>
-              </w:rPr>
-              <w:t xml:space="preserve"> (varchar60), talla (varchar10), estado (varchar20), </w:t>
-            </w:r>
-            <w:proofErr w:type="spellStart"/>
-            <w:r>
-              <w:rPr>
-                <w:rFonts w:eastAsia="Times New Roman" w:hAnsi="Georgia" w:cs="Times New Roman"/>
-                <w:sz w:val="24"/>
-                <w:szCs w:val="24"/>
-                <w:lang w:eastAsia="es-CO"/>
-              </w:rPr>
-              <w:t>precio_adicional</w:t>
-            </w:r>
-            <w:proofErr w:type="spellEnd"/>
-            <w:r>
-              <w:rPr>
-                <w:rFonts w:eastAsia="Times New Roman" w:hAnsi="Georgia" w:cs="Times New Roman"/>
-                <w:sz w:val="24"/>
-                <w:szCs w:val="24"/>
-                <w:lang w:eastAsia="es-CO"/>
-              </w:rPr>
-              <w:t xml:space="preserve"> (decimal10,2)</w:t>
+              <w:t>id_personalizacion (PK, int), id_pedido (FK, int), id_producto (FK, int), descripcion_personalizacion (varchar100), tipo_personalizacion (varchar50), imagen_referencia (varchar500), color_deseado (varchar60), talla (varchar10), estado (varchar20), precio_adicional (decimal10,2)</w:t>
             </w:r>
           </w:p>
         </w:tc>
@@ -8323,10 +5827,18 @@
                 <w:szCs w:val="24"/>
                 <w:lang w:val="es-CO" w:eastAsia="es-CO"/>
               </w:rPr>
-              <w:t>Tipo Original (</w:t>
-            </w:r>
-            <w:proofErr w:type="spellStart"/>
-            <w:r>
+              <w:t>Tipo Original (MariaDB local)</w:t>
+            </w:r>
+          </w:p>
+        </w:tc>
+        <w:tc>
+          <w:tcPr>
+            <w:tcW w:w="0" w:type="auto"/>
+            <w:hideMark/>
+          </w:tcPr>
+          <w:p>
+            <w:pPr>
+              <w:jc w:val="center"/>
               <w:rPr>
                 <w:rFonts w:eastAsia="Times New Roman" w:hAnsi="Georgia" w:cs="Times New Roman"/>
                 <w:b/>
@@ -8335,9 +5847,7 @@
                 <w:szCs w:val="24"/>
                 <w:lang w:val="es-CO" w:eastAsia="es-CO"/>
               </w:rPr>
-              <w:t>MariaDB</w:t>
-            </w:r>
-            <w:proofErr w:type="spellEnd"/>
+            </w:pPr>
             <w:r>
               <w:rPr>
                 <w:rFonts w:eastAsia="Times New Roman" w:hAnsi="Georgia" w:cs="Times New Roman"/>
@@ -8347,7 +5857,7 @@
                 <w:szCs w:val="24"/>
                 <w:lang w:val="es-CO" w:eastAsia="es-CO"/>
               </w:rPr>
-              <w:t xml:space="preserve"> local)</w:t>
+              <w:t>Ejemplos Campos</w:t>
             </w:r>
           </w:p>
         </w:tc>
@@ -8377,7 +5887,7 @@
                 <w:szCs w:val="24"/>
                 <w:lang w:val="es-CO" w:eastAsia="es-CO"/>
               </w:rPr>
-              <w:t>Ejemplos Campos</w:t>
+              <w:t>Tipo Destino (MariaDB Hostinger)</w:t>
             </w:r>
           </w:p>
         </w:tc>
@@ -8407,60 +5917,6 @@
                 <w:szCs w:val="24"/>
                 <w:lang w:val="es-CO" w:eastAsia="es-CO"/>
               </w:rPr>
-              <w:t>Tipo Destino (</w:t>
-            </w:r>
-            <w:proofErr w:type="spellStart"/>
-            <w:r>
-              <w:rPr>
-                <w:rFonts w:eastAsia="Times New Roman" w:hAnsi="Georgia" w:cs="Times New Roman"/>
-                <w:b/>
-                <w:bCs/>
-                <w:sz w:val="24"/>
-                <w:szCs w:val="24"/>
-                <w:lang w:val="es-CO" w:eastAsia="es-CO"/>
-              </w:rPr>
-              <w:t>MariaDB</w:t>
-            </w:r>
-            <w:proofErr w:type="spellEnd"/>
-            <w:r>
-              <w:rPr>
-                <w:rFonts w:eastAsia="Times New Roman" w:hAnsi="Georgia" w:cs="Times New Roman"/>
-                <w:b/>
-                <w:bCs/>
-                <w:sz w:val="24"/>
-                <w:szCs w:val="24"/>
-                <w:lang w:val="es-CO" w:eastAsia="es-CO"/>
-              </w:rPr>
-              <w:t xml:space="preserve"> Hostinger)</w:t>
-            </w:r>
-          </w:p>
-        </w:tc>
-        <w:tc>
-          <w:tcPr>
-            <w:tcW w:w="0" w:type="auto"/>
-            <w:hideMark/>
-          </w:tcPr>
-          <w:p>
-            <w:pPr>
-              <w:jc w:val="center"/>
-              <w:rPr>
-                <w:rFonts w:eastAsia="Times New Roman" w:hAnsi="Georgia" w:cs="Times New Roman"/>
-                <w:b/>
-                <w:bCs/>
-                <w:sz w:val="24"/>
-                <w:szCs w:val="24"/>
-                <w:lang w:val="es-CO" w:eastAsia="es-CO"/>
-              </w:rPr>
-            </w:pPr>
-            <w:r>
-              <w:rPr>
-                <w:rFonts w:eastAsia="Times New Roman" w:hAnsi="Georgia" w:cs="Times New Roman"/>
-                <w:b/>
-                <w:bCs/>
-                <w:sz w:val="24"/>
-                <w:szCs w:val="24"/>
-                <w:lang w:val="es-CO" w:eastAsia="es-CO"/>
-              </w:rPr>
               <w:t>Estado</w:t>
             </w:r>
           </w:p>
@@ -8481,63 +5937,31 @@
                 <w:lang w:val="es-CO" w:eastAsia="es-CO"/>
               </w:rPr>
             </w:pPr>
-            <w:proofErr w:type="spellStart"/>
-            <w:r>
-              <w:rPr>
-                <w:rFonts w:eastAsia="Times New Roman" w:hAnsi="Georgia" w:cs="Times New Roman"/>
-                <w:sz w:val="24"/>
-                <w:szCs w:val="24"/>
-                <w:lang w:val="es-CO" w:eastAsia="es-CO"/>
-              </w:rPr>
-              <w:t>IDs</w:t>
-            </w:r>
-            <w:proofErr w:type="spellEnd"/>
-            <w:r>
-              <w:rPr>
-                <w:rFonts w:eastAsia="Times New Roman" w:hAnsi="Georgia" w:cs="Times New Roman"/>
-                <w:sz w:val="24"/>
-                <w:szCs w:val="24"/>
-                <w:lang w:val="es-CO" w:eastAsia="es-CO"/>
-              </w:rPr>
-              <w:t xml:space="preserve"> (</w:t>
-            </w:r>
-            <w:proofErr w:type="spellStart"/>
-            <w:r>
-              <w:rPr>
-                <w:rFonts w:eastAsia="Times New Roman" w:hAnsi="Georgia" w:cs="Times New Roman"/>
-                <w:sz w:val="24"/>
-                <w:szCs w:val="24"/>
-                <w:lang w:val="es-CO" w:eastAsia="es-CO"/>
-              </w:rPr>
-              <w:t>int</w:t>
-            </w:r>
-            <w:proofErr w:type="spellEnd"/>
-            <w:r>
-              <w:rPr>
-                <w:rFonts w:eastAsia="Times New Roman" w:hAnsi="Georgia" w:cs="Times New Roman"/>
-                <w:sz w:val="24"/>
-                <w:szCs w:val="24"/>
-                <w:lang w:val="es-CO" w:eastAsia="es-CO"/>
-              </w:rPr>
-              <w:t xml:space="preserve"> AUTO_INCREMENT)</w:t>
-            </w:r>
-          </w:p>
-        </w:tc>
-        <w:tc>
-          <w:tcPr>
-            <w:tcW w:w="0" w:type="auto"/>
-            <w:hideMark/>
-          </w:tcPr>
-          <w:p>
-            <w:pPr>
-              <w:rPr>
-                <w:rFonts w:eastAsia="Times New Roman" w:hAnsi="Georgia" w:cs="Times New Roman"/>
-                <w:sz w:val="24"/>
-                <w:szCs w:val="24"/>
-                <w:lang w:val="es-CO" w:eastAsia="es-CO"/>
-              </w:rPr>
-            </w:pPr>
-            <w:proofErr w:type="spellStart"/>
+            <w:r>
+              <w:rPr>
+                <w:rFonts w:eastAsia="Times New Roman" w:hAnsi="Georgia" w:cs="Times New Roman"/>
+                <w:sz w:val="24"/>
+                <w:szCs w:val="24"/>
+                <w:lang w:val="es-CO" w:eastAsia="es-CO"/>
+              </w:rPr>
+              <w:t>IDs (int AUTO_INCREMENT)</w:t>
+            </w:r>
+          </w:p>
+        </w:tc>
+        <w:tc>
+          <w:tcPr>
+            <w:tcW w:w="0" w:type="auto"/>
+            <w:hideMark/>
+          </w:tcPr>
+          <w:p>
+            <w:pPr>
+              <w:rPr>
+                <w:rFonts w:eastAsia="Times New Roman" w:hAnsi="Georgia" w:cs="Times New Roman"/>
+                <w:sz w:val="24"/>
+                <w:szCs w:val="24"/>
+                <w:lang w:val="es-CO" w:eastAsia="es-CO"/>
+              </w:rPr>
+            </w:pPr>
             <w:r>
               <w:rPr>
                 <w:rFonts w:eastAsia="Times New Roman" w:hAnsi="Georgia" w:cs="Times New Roman"/>
@@ -8545,29 +5969,8 @@
                 <w:szCs w:val="24"/>
                 <w:lang w:eastAsia="es-CO"/>
               </w:rPr>
-              <w:t>id_usuario</w:t>
-            </w:r>
-            <w:proofErr w:type="spellEnd"/>
-            <w:r>
-              <w:rPr>
-                <w:rFonts w:eastAsia="Times New Roman" w:hAnsi="Georgia" w:cs="Times New Roman"/>
-                <w:sz w:val="24"/>
-                <w:szCs w:val="24"/>
-                <w:lang w:eastAsia="es-CO"/>
-              </w:rPr>
-              <w:t xml:space="preserve">, </w:t>
-            </w:r>
-            <w:proofErr w:type="spellStart"/>
-            <w:r>
-              <w:rPr>
-                <w:rFonts w:eastAsia="Times New Roman" w:hAnsi="Georgia" w:cs="Times New Roman"/>
-                <w:sz w:val="24"/>
-                <w:szCs w:val="24"/>
-                <w:lang w:eastAsia="es-CO"/>
-              </w:rPr>
-              <w:t>id_pedido</w:t>
-            </w:r>
-            <w:proofErr w:type="spellEnd"/>
+              <w:t>id_usuario, id_pedido</w:t>
+            </w:r>
           </w:p>
         </w:tc>
         <w:tc>
@@ -8686,36 +6089,14 @@
                 <w:lang w:val="es-CO" w:eastAsia="es-CO"/>
               </w:rPr>
             </w:pPr>
-            <w:proofErr w:type="spellStart"/>
-            <w:proofErr w:type="gramStart"/>
-            <w:r>
-              <w:rPr>
-                <w:rFonts w:eastAsia="Times New Roman" w:hAnsi="Georgia" w:cs="Times New Roman"/>
-                <w:sz w:val="24"/>
-                <w:szCs w:val="24"/>
-                <w:lang w:val="es-CO" w:eastAsia="es-CO"/>
-              </w:rPr>
-              <w:t>varchar</w:t>
-            </w:r>
-            <w:proofErr w:type="spellEnd"/>
-            <w:r>
-              <w:rPr>
-                <w:rFonts w:eastAsia="Times New Roman" w:hAnsi="Georgia" w:cs="Times New Roman"/>
-                <w:sz w:val="24"/>
-                <w:szCs w:val="24"/>
-                <w:lang w:val="es-CO" w:eastAsia="es-CO"/>
-              </w:rPr>
-              <w:t>(</w:t>
-            </w:r>
-            <w:proofErr w:type="gramEnd"/>
-            <w:r>
-              <w:rPr>
-                <w:rFonts w:eastAsia="Times New Roman" w:hAnsi="Georgia" w:cs="Times New Roman"/>
-                <w:sz w:val="24"/>
-                <w:szCs w:val="24"/>
-                <w:lang w:val="es-CO" w:eastAsia="es-CO"/>
-              </w:rPr>
-              <w:t>10-255)</w:t>
+            <w:r>
+              <w:rPr>
+                <w:rFonts w:eastAsia="Times New Roman" w:hAnsi="Georgia" w:cs="Times New Roman"/>
+                <w:sz w:val="24"/>
+                <w:szCs w:val="24"/>
+                <w:lang w:val="es-CO" w:eastAsia="es-CO"/>
+              </w:rPr>
+              <w:t>varchar(10-255)</w:t>
             </w:r>
           </w:p>
         </w:tc>
@@ -8785,7 +6166,6 @@
                 <w:lang w:val="es-CO" w:eastAsia="es-CO"/>
               </w:rPr>
             </w:pPr>
-            <w:proofErr w:type="spellStart"/>
             <w:r>
               <w:rPr>
                 <w:rFonts w:eastAsia="Times New Roman" w:hAnsi="Georgia" w:cs="Times New Roman"/>
@@ -8793,85 +6173,33 @@
                 <w:szCs w:val="24"/>
                 <w:lang w:eastAsia="es-CO"/>
               </w:rPr>
-              <w:t>descripcion</w:t>
-            </w:r>
-            <w:proofErr w:type="spellEnd"/>
-            <w:r>
-              <w:rPr>
-                <w:rFonts w:eastAsia="Times New Roman" w:hAnsi="Georgia" w:cs="Times New Roman"/>
-                <w:sz w:val="24"/>
-                <w:szCs w:val="24"/>
-                <w:lang w:eastAsia="es-CO"/>
-              </w:rPr>
-              <w:t xml:space="preserve"> (</w:t>
-            </w:r>
-            <w:proofErr w:type="spellStart"/>
-            <w:r>
-              <w:rPr>
-                <w:rFonts w:eastAsia="Times New Roman" w:hAnsi="Georgia" w:cs="Times New Roman"/>
-                <w:sz w:val="24"/>
-                <w:szCs w:val="24"/>
-                <w:lang w:eastAsia="es-CO"/>
+              <w:t>descripcion (text), respuesta (text)</w:t>
+            </w:r>
+          </w:p>
+        </w:tc>
+        <w:tc>
+          <w:tcPr>
+            <w:tcW w:w="0" w:type="auto"/>
+            <w:hideMark/>
+          </w:tcPr>
+          <w:p>
+            <w:pPr>
+              <w:rPr>
+                <w:rFonts w:eastAsia="Times New Roman" w:hAnsi="Georgia" w:cs="Times New Roman"/>
+                <w:sz w:val="24"/>
+                <w:szCs w:val="24"/>
+                <w:lang w:val="es-CO" w:eastAsia="es-CO"/>
+              </w:rPr>
+            </w:pPr>
+            <w:r>
+              <w:rPr>
+                <w:rFonts w:eastAsia="Times New Roman" w:hAnsi="Georgia" w:cs="Times New Roman"/>
+                <w:sz w:val="24"/>
+                <w:szCs w:val="24"/>
+                <w:lang w:val="es-CO" w:eastAsia="es-CO"/>
               </w:rPr>
               <w:t>text</w:t>
             </w:r>
-            <w:proofErr w:type="spellEnd"/>
-            <w:r>
-              <w:rPr>
-                <w:rFonts w:eastAsia="Times New Roman" w:hAnsi="Georgia" w:cs="Times New Roman"/>
-                <w:sz w:val="24"/>
-                <w:szCs w:val="24"/>
-                <w:lang w:eastAsia="es-CO"/>
-              </w:rPr>
-              <w:t>), respuesta (</w:t>
-            </w:r>
-            <w:proofErr w:type="spellStart"/>
-            <w:r>
-              <w:rPr>
-                <w:rFonts w:eastAsia="Times New Roman" w:hAnsi="Georgia" w:cs="Times New Roman"/>
-                <w:sz w:val="24"/>
-                <w:szCs w:val="24"/>
-                <w:lang w:eastAsia="es-CO"/>
-              </w:rPr>
-              <w:t>text</w:t>
-            </w:r>
-            <w:proofErr w:type="spellEnd"/>
-            <w:r>
-              <w:rPr>
-                <w:rFonts w:eastAsia="Times New Roman" w:hAnsi="Georgia" w:cs="Times New Roman"/>
-                <w:sz w:val="24"/>
-                <w:szCs w:val="24"/>
-                <w:lang w:eastAsia="es-CO"/>
-              </w:rPr>
-              <w:t>)</w:t>
-            </w:r>
-          </w:p>
-        </w:tc>
-        <w:tc>
-          <w:tcPr>
-            <w:tcW w:w="0" w:type="auto"/>
-            <w:hideMark/>
-          </w:tcPr>
-          <w:p>
-            <w:pPr>
-              <w:rPr>
-                <w:rFonts w:eastAsia="Times New Roman" w:hAnsi="Georgia" w:cs="Times New Roman"/>
-                <w:sz w:val="24"/>
-                <w:szCs w:val="24"/>
-                <w:lang w:val="es-CO" w:eastAsia="es-CO"/>
-              </w:rPr>
-            </w:pPr>
-            <w:proofErr w:type="spellStart"/>
-            <w:r>
-              <w:rPr>
-                <w:rFonts w:eastAsia="Times New Roman" w:hAnsi="Georgia" w:cs="Times New Roman"/>
-                <w:sz w:val="24"/>
-                <w:szCs w:val="24"/>
-                <w:lang w:val="es-CO" w:eastAsia="es-CO"/>
-              </w:rPr>
-              <w:t>text</w:t>
-            </w:r>
-            <w:proofErr w:type="spellEnd"/>
           </w:p>
         </w:tc>
         <w:tc>
@@ -8940,7 +6268,6 @@
                 <w:lang w:val="es-CO" w:eastAsia="es-CO"/>
               </w:rPr>
             </w:pPr>
-            <w:proofErr w:type="spellStart"/>
             <w:r>
               <w:rPr>
                 <w:rFonts w:eastAsia="Times New Roman" w:hAnsi="Georgia" w:cs="Times New Roman"/>
@@ -8948,94 +6275,33 @@
                 <w:szCs w:val="24"/>
                 <w:lang w:eastAsia="es-CO"/>
               </w:rPr>
-              <w:t>fecha_pedido</w:t>
-            </w:r>
-            <w:proofErr w:type="spellEnd"/>
-            <w:r>
-              <w:rPr>
-                <w:rFonts w:eastAsia="Times New Roman" w:hAnsi="Georgia" w:cs="Times New Roman"/>
-                <w:sz w:val="24"/>
-                <w:szCs w:val="24"/>
-                <w:lang w:eastAsia="es-CO"/>
-              </w:rPr>
-              <w:t xml:space="preserve"> (date), </w:t>
-            </w:r>
-            <w:proofErr w:type="spellStart"/>
-            <w:r>
-              <w:rPr>
-                <w:rFonts w:eastAsia="Times New Roman" w:hAnsi="Georgia" w:cs="Times New Roman"/>
-                <w:sz w:val="24"/>
-                <w:szCs w:val="24"/>
-                <w:lang w:eastAsia="es-CO"/>
-              </w:rPr>
-              <w:t>fecha_movimiento</w:t>
-            </w:r>
-            <w:proofErr w:type="spellEnd"/>
-            <w:r>
-              <w:rPr>
-                <w:rFonts w:eastAsia="Times New Roman" w:hAnsi="Georgia" w:cs="Times New Roman"/>
-                <w:sz w:val="24"/>
-                <w:szCs w:val="24"/>
-                <w:lang w:eastAsia="es-CO"/>
-              </w:rPr>
-              <w:t xml:space="preserve"> (</w:t>
-            </w:r>
-            <w:proofErr w:type="spellStart"/>
-            <w:r>
-              <w:rPr>
-                <w:rFonts w:eastAsia="Times New Roman" w:hAnsi="Georgia" w:cs="Times New Roman"/>
-                <w:sz w:val="24"/>
-                <w:szCs w:val="24"/>
-                <w:lang w:eastAsia="es-CO"/>
-              </w:rPr>
-              <w:t>datetime</w:t>
-            </w:r>
-            <w:proofErr w:type="spellEnd"/>
-            <w:r>
-              <w:rPr>
-                <w:rFonts w:eastAsia="Times New Roman" w:hAnsi="Georgia" w:cs="Times New Roman"/>
-                <w:sz w:val="24"/>
-                <w:szCs w:val="24"/>
-                <w:lang w:eastAsia="es-CO"/>
-              </w:rPr>
-              <w:t>)</w:t>
-            </w:r>
-          </w:p>
-        </w:tc>
-        <w:tc>
-          <w:tcPr>
-            <w:tcW w:w="0" w:type="auto"/>
-            <w:hideMark/>
-          </w:tcPr>
-          <w:p>
-            <w:pPr>
-              <w:rPr>
-                <w:rFonts w:eastAsia="Times New Roman" w:hAnsi="Georgia" w:cs="Times New Roman"/>
-                <w:sz w:val="24"/>
-                <w:szCs w:val="24"/>
-                <w:lang w:val="es-CO" w:eastAsia="es-CO"/>
-              </w:rPr>
-            </w:pPr>
-            <w:r>
-              <w:rPr>
-                <w:rFonts w:eastAsia="Times New Roman" w:hAnsi="Georgia" w:cs="Times New Roman"/>
-                <w:sz w:val="24"/>
-                <w:szCs w:val="24"/>
-                <w:lang w:val="es-CO" w:eastAsia="es-CO"/>
-              </w:rPr>
-              <w:t>date/</w:t>
-            </w:r>
-            <w:proofErr w:type="spellStart"/>
-            <w:r>
-              <w:rPr>
-                <w:rFonts w:eastAsia="Times New Roman" w:hAnsi="Georgia" w:cs="Times New Roman"/>
-                <w:sz w:val="24"/>
-                <w:szCs w:val="24"/>
-                <w:lang w:val="es-CO" w:eastAsia="es-CO"/>
-              </w:rPr>
-              <w:t>datetime</w:t>
-            </w:r>
-            <w:proofErr w:type="spellEnd"/>
+              <w:t>fecha_pedido (date), fecha_movimiento (datetime)</w:t>
+            </w:r>
+          </w:p>
+        </w:tc>
+        <w:tc>
+          <w:tcPr>
+            <w:tcW w:w="0" w:type="auto"/>
+            <w:hideMark/>
+          </w:tcPr>
+          <w:p>
+            <w:pPr>
+              <w:rPr>
+                <w:rFonts w:eastAsia="Times New Roman" w:hAnsi="Georgia" w:cs="Times New Roman"/>
+                <w:sz w:val="24"/>
+                <w:szCs w:val="24"/>
+                <w:lang w:val="es-CO" w:eastAsia="es-CO"/>
+              </w:rPr>
+            </w:pPr>
+            <w:r>
+              <w:rPr>
+                <w:rFonts w:eastAsia="Times New Roman" w:hAnsi="Georgia" w:cs="Times New Roman"/>
+                <w:sz w:val="24"/>
+                <w:szCs w:val="24"/>
+                <w:lang w:val="es-CO" w:eastAsia="es-CO"/>
+              </w:rPr>
+              <w:t>date/datetime</w:t>
+            </w:r>
           </w:p>
         </w:tc>
         <w:tc>
@@ -9206,7 +6472,6 @@
                 <w:lang w:val="es-CO" w:eastAsia="es-CO"/>
               </w:rPr>
             </w:pPr>
-            <w:proofErr w:type="spellStart"/>
             <w:r>
               <w:rPr>
                 <w:rFonts w:eastAsia="Times New Roman" w:hAnsi="Georgia" w:cs="Times New Roman"/>
@@ -9223,57 +6488,7 @@
                 <w:szCs w:val="24"/>
                 <w:lang w:eastAsia="es-CO"/>
               </w:rPr>
-              <w:t>ipo_pqrs</w:t>
-            </w:r>
-            <w:proofErr w:type="spellEnd"/>
-            <w:r>
-              <w:rPr>
-                <w:rFonts w:eastAsia="Times New Roman" w:hAnsi="Georgia" w:cs="Times New Roman"/>
-                <w:sz w:val="24"/>
-                <w:szCs w:val="24"/>
-                <w:lang w:eastAsia="es-CO"/>
-              </w:rPr>
-              <w:t xml:space="preserve"> (</w:t>
-            </w:r>
-            <w:proofErr w:type="spellStart"/>
-            <w:r>
-              <w:rPr>
-                <w:rFonts w:eastAsia="Times New Roman" w:hAnsi="Georgia" w:cs="Times New Roman"/>
-                <w:sz w:val="24"/>
-                <w:szCs w:val="24"/>
-                <w:lang w:eastAsia="es-CO"/>
-              </w:rPr>
-              <w:t>enum</w:t>
-            </w:r>
-            <w:proofErr w:type="spellEnd"/>
-            <w:r>
-              <w:rPr>
-                <w:rFonts w:eastAsia="Times New Roman" w:hAnsi="Georgia" w:cs="Times New Roman"/>
-                <w:sz w:val="24"/>
-                <w:szCs w:val="24"/>
-                <w:lang w:eastAsia="es-CO"/>
-              </w:rPr>
-              <w:t>), tipo (</w:t>
-            </w:r>
-            <w:proofErr w:type="spellStart"/>
-            <w:r>
-              <w:rPr>
-                <w:rFonts w:eastAsia="Times New Roman" w:hAnsi="Georgia" w:cs="Times New Roman"/>
-                <w:sz w:val="24"/>
-                <w:szCs w:val="24"/>
-                <w:lang w:eastAsia="es-CO"/>
-              </w:rPr>
-              <w:t>enum</w:t>
-            </w:r>
-            <w:proofErr w:type="spellEnd"/>
-            <w:r>
-              <w:rPr>
-                <w:rFonts w:eastAsia="Times New Roman" w:hAnsi="Georgia" w:cs="Times New Roman"/>
-                <w:sz w:val="24"/>
-                <w:szCs w:val="24"/>
-                <w:lang w:eastAsia="es-CO"/>
-              </w:rPr>
-              <w:t>)</w:t>
+              <w:t>ipo_pqrs (enum), tipo (enum)</w:t>
             </w:r>
           </w:p>
         </w:tc>
@@ -9368,7 +6583,6 @@
                 <w:lang w:val="es-CO" w:eastAsia="es-CO"/>
               </w:rPr>
             </w:pPr>
-            <w:proofErr w:type="spellStart"/>
             <w:r>
               <w:rPr>
                 <w:rFonts w:eastAsia="Times New Roman" w:hAnsi="Georgia" w:cs="Times New Roman"/>
@@ -9376,102 +6590,32 @@
                 <w:szCs w:val="24"/>
                 <w:lang w:eastAsia="es-CO"/>
               </w:rPr>
-              <w:t>id_usuario</w:t>
-            </w:r>
-            <w:proofErr w:type="spellEnd"/>
-            <w:r>
-              <w:rPr>
-                <w:rFonts w:eastAsia="Times New Roman" w:hAnsi="Georgia" w:cs="Times New Roman"/>
-                <w:sz w:val="24"/>
-                <w:szCs w:val="24"/>
-                <w:lang w:eastAsia="es-CO"/>
-              </w:rPr>
-              <w:t xml:space="preserve">, </w:t>
-            </w:r>
-            <w:proofErr w:type="spellStart"/>
-            <w:r>
-              <w:rPr>
-                <w:rFonts w:eastAsia="Times New Roman" w:hAnsi="Georgia" w:cs="Times New Roman"/>
-                <w:sz w:val="24"/>
-                <w:szCs w:val="24"/>
-                <w:lang w:eastAsia="es-CO"/>
-              </w:rPr>
-              <w:t>id_pedido</w:t>
-            </w:r>
-            <w:proofErr w:type="spellEnd"/>
-            <w:r>
-              <w:rPr>
-                <w:rFonts w:eastAsia="Times New Roman" w:hAnsi="Georgia" w:cs="Times New Roman"/>
-                <w:sz w:val="24"/>
-                <w:szCs w:val="24"/>
-                <w:lang w:eastAsia="es-CO"/>
-              </w:rPr>
-              <w:t xml:space="preserve"> (</w:t>
-            </w:r>
-            <w:proofErr w:type="spellStart"/>
-            <w:r>
-              <w:rPr>
-                <w:rFonts w:eastAsia="Times New Roman" w:hAnsi="Georgia" w:cs="Times New Roman"/>
-                <w:sz w:val="24"/>
-                <w:szCs w:val="24"/>
-                <w:lang w:eastAsia="es-CO"/>
-              </w:rPr>
-              <w:t>FKs</w:t>
-            </w:r>
-            <w:proofErr w:type="spellEnd"/>
-            <w:r>
-              <w:rPr>
-                <w:rFonts w:eastAsia="Times New Roman" w:hAnsi="Georgia" w:cs="Times New Roman"/>
-                <w:sz w:val="24"/>
-                <w:szCs w:val="24"/>
-                <w:lang w:eastAsia="es-CO"/>
-              </w:rPr>
-              <w:t>)</w:t>
-            </w:r>
-          </w:p>
-        </w:tc>
-        <w:tc>
-          <w:tcPr>
-            <w:tcW w:w="0" w:type="auto"/>
-            <w:hideMark/>
-          </w:tcPr>
-          <w:p>
-            <w:pPr>
-              <w:rPr>
-                <w:rFonts w:eastAsia="Times New Roman" w:hAnsi="Georgia" w:cs="Times New Roman"/>
-                <w:sz w:val="24"/>
-                <w:szCs w:val="24"/>
-                <w:lang w:val="es-CO" w:eastAsia="es-CO"/>
-              </w:rPr>
-            </w:pPr>
-            <w:r>
-              <w:rPr>
-                <w:rFonts w:eastAsia="Times New Roman" w:hAnsi="Georgia" w:cs="Times New Roman"/>
-                <w:sz w:val="24"/>
-                <w:szCs w:val="24"/>
-                <w:lang w:val="es-CO" w:eastAsia="es-CO"/>
-              </w:rPr>
-              <w:t>INT (</w:t>
-            </w:r>
-            <w:proofErr w:type="spellStart"/>
-            <w:r>
-              <w:rPr>
-                <w:rFonts w:eastAsia="Times New Roman" w:hAnsi="Georgia" w:cs="Times New Roman"/>
-                <w:sz w:val="24"/>
-                <w:szCs w:val="24"/>
-                <w:lang w:val="es-CO" w:eastAsia="es-CO"/>
-              </w:rPr>
-              <w:t>FKs</w:t>
-            </w:r>
-            <w:proofErr w:type="spellEnd"/>
-            <w:r>
-              <w:rPr>
-                <w:rFonts w:eastAsia="Times New Roman" w:hAnsi="Georgia" w:cs="Times New Roman"/>
-                <w:sz w:val="24"/>
-                <w:szCs w:val="24"/>
-                <w:lang w:val="es-CO" w:eastAsia="es-CO"/>
-              </w:rPr>
-              <w:t>)</w:t>
+              <w:t>id_usuario, id_pedido (FKs)</w:t>
+            </w:r>
+          </w:p>
+        </w:tc>
+        <w:tc>
+          <w:tcPr>
+            <w:tcW w:w="0" w:type="auto"/>
+            <w:hideMark/>
+          </w:tcPr>
+          <w:p>
+            <w:pPr>
+              <w:rPr>
+                <w:rFonts w:eastAsia="Times New Roman" w:hAnsi="Georgia" w:cs="Times New Roman"/>
+                <w:sz w:val="24"/>
+                <w:szCs w:val="24"/>
+                <w:lang w:val="es-CO" w:eastAsia="es-CO"/>
+              </w:rPr>
+            </w:pPr>
+            <w:r>
+              <w:rPr>
+                <w:rFonts w:eastAsia="Times New Roman" w:hAnsi="Georgia" w:cs="Times New Roman"/>
+                <w:sz w:val="24"/>
+                <w:szCs w:val="24"/>
+                <w:lang w:val="es-CO" w:eastAsia="es-CO"/>
+              </w:rPr>
+              <w:t>INT (FKs)</w:t>
             </w:r>
           </w:p>
         </w:tc>
@@ -9521,50 +6665,26 @@
           <w:szCs w:val="42"/>
           <w:lang w:val="es-CO" w:eastAsia="es-CO"/>
         </w:rPr>
-        <w:t xml:space="preserve">Consulta de validación ejecutadas en </w:t>
-      </w:r>
-      <w:proofErr w:type="spellStart"/>
-      <w:r>
+        <w:t>Consulta de validación ejecutadas en MariaDB Hostinger (vía CMD):</w:t>
+      </w:r>
+    </w:p>
+    <w:p>
+      <w:pPr>
+        <w:spacing w:before="100" w:beforeAutospacing="1" w:after="100" w:afterAutospacing="1" w:line="240" w:lineRule="auto"/>
         <w:rPr>
           <w:rFonts w:eastAsia="Times New Roman" w:hAnsi="Georgia" w:cs="Times New Roman"/>
           <w:b/>
           <w:bCs/>
-          <w:sz w:val="42"/>
-          <w:szCs w:val="42"/>
-          <w:lang w:val="es-CO" w:eastAsia="es-CO"/>
-        </w:rPr>
-        <w:t>MariaDB</w:t>
-      </w:r>
-      <w:proofErr w:type="spellEnd"/>
+          <w:sz w:val="24"/>
+          <w:szCs w:val="24"/>
+          <w:lang w:val="es-CO" w:eastAsia="es-CO"/>
+        </w:rPr>
+      </w:pPr>
       <w:r>
         <w:rPr>
           <w:rFonts w:eastAsia="Times New Roman" w:hAnsi="Georgia" w:cs="Times New Roman"/>
           <w:b/>
           <w:bCs/>
-          <w:sz w:val="42"/>
-          <w:szCs w:val="42"/>
-          <w:lang w:val="es-CO" w:eastAsia="es-CO"/>
-        </w:rPr>
-        <w:t xml:space="preserve"> Hostinger (vía CMD):</w:t>
-      </w:r>
-    </w:p>
-    <w:p>
-      <w:pPr>
-        <w:spacing w:before="100" w:beforeAutospacing="1" w:after="100" w:afterAutospacing="1" w:line="240" w:lineRule="auto"/>
-        <w:rPr>
-          <w:rFonts w:eastAsia="Times New Roman" w:hAnsi="Georgia" w:cs="Times New Roman"/>
-          <w:b/>
-          <w:bCs/>
-          <w:sz w:val="24"/>
-          <w:szCs w:val="24"/>
-          <w:lang w:val="es-CO" w:eastAsia="es-CO"/>
-        </w:rPr>
-      </w:pPr>
-      <w:r>
-        <w:rPr>
-          <w:rFonts w:eastAsia="Times New Roman" w:hAnsi="Georgia" w:cs="Times New Roman"/>
-          <w:b/>
-          <w:bCs/>
           <w:sz w:val="24"/>
           <w:szCs w:val="24"/>
           <w:lang w:val="es-CO" w:eastAsia="es-CO"/>
@@ -9705,40 +6825,22 @@
           <w:szCs w:val="28"/>
           <w:lang w:val="es-CO" w:eastAsia="es-CO"/>
         </w:rPr>
-        <w:t xml:space="preserve">n entre las tablas de pedido, usuarios, </w:t>
-      </w:r>
-      <w:proofErr w:type="spellStart"/>
+        <w:t xml:space="preserve">n entre las tablas de pedido, usuarios, envio y pago, y se limita a mostrar </w:t>
+      </w:r>
       <w:r>
         <w:rPr>
           <w:sz w:val="24"/>
           <w:szCs w:val="28"/>
           <w:lang w:val="es-CO" w:eastAsia="es-CO"/>
         </w:rPr>
-        <w:t>envio</w:t>
-      </w:r>
-      <w:proofErr w:type="spellEnd"/>
+        <w:t>ú</w:t>
+      </w:r>
       <w:r>
         <w:rPr>
           <w:sz w:val="24"/>
           <w:szCs w:val="28"/>
           <w:lang w:val="es-CO" w:eastAsia="es-CO"/>
         </w:rPr>
-        <w:t xml:space="preserve"> y pago, y se limita a mostrar </w:t>
-      </w:r>
-      <w:r>
-        <w:rPr>
-          <w:sz w:val="24"/>
-          <w:szCs w:val="28"/>
-          <w:lang w:val="es-CO" w:eastAsia="es-CO"/>
-        </w:rPr>
-        <w:t>ú</w:t>
-      </w:r>
-      <w:r>
-        <w:rPr>
-          <w:sz w:val="24"/>
-          <w:szCs w:val="28"/>
-          <w:lang w:val="es-CO" w:eastAsia="es-CO"/>
-        </w:rPr>
         <w:t>nicamente los primeros 10 registros.</w:t>
       </w:r>
       <w:r>
@@ -9749,6 +6851,7 @@
       </w:r>
       <w:r>
         <w:rPr>
+          <w:noProof/>
           <w:sz w:val="24"/>
           <w:szCs w:val="28"/>
           <w:lang w:val="es-CO" w:eastAsia="es-CO"/>
@@ -9769,7 +6872,7 @@
                     <pic:cNvPicPr/>
                   </pic:nvPicPr>
                   <pic:blipFill>
-                    <a:blip r:embed="rId22"/>
+                    <a:blip r:embed="rId21"/>
                     <a:stretch>
                       <a:fillRect/>
                     </a:stretch>
@@ -9917,27 +7020,7 @@
           <w:szCs w:val="24"/>
           <w:lang w:val="es-CO" w:eastAsia="es-CO"/>
         </w:rPr>
-        <w:t xml:space="preserve">Eliminar BD en </w:t>
-      </w:r>
-      <w:proofErr w:type="spellStart"/>
-      <w:r>
-        <w:rPr>
-          <w:rFonts w:eastAsia="Times New Roman" w:hAnsi="Georgia" w:cs="Times New Roman"/>
-          <w:sz w:val="24"/>
-          <w:szCs w:val="24"/>
-          <w:lang w:val="es-CO" w:eastAsia="es-CO"/>
-        </w:rPr>
-        <w:t>hPanel</w:t>
-      </w:r>
-      <w:proofErr w:type="spellEnd"/>
-      <w:r>
-        <w:rPr>
-          <w:rFonts w:eastAsia="Times New Roman" w:hAnsi="Georgia" w:cs="Times New Roman"/>
-          <w:sz w:val="24"/>
-          <w:szCs w:val="24"/>
-          <w:lang w:val="es-CO" w:eastAsia="es-CO"/>
-        </w:rPr>
-        <w:t xml:space="preserve"> Hostinger.</w:t>
+        <w:t>Eliminar BD en hPanel Hostinger.</w:t>
       </w:r>
     </w:p>
     <w:p>
@@ -9961,29 +7044,8 @@
           <w:szCs w:val="24"/>
           <w:lang w:val="es-CO" w:eastAsia="es-CO"/>
         </w:rPr>
-        <w:t xml:space="preserve">Restaurar </w:t>
-      </w:r>
-      <w:proofErr w:type="spellStart"/>
-      <w:r>
-        <w:rPr>
-          <w:rFonts w:eastAsia="Times New Roman" w:hAnsi="Georgia" w:cs="Times New Roman"/>
-          <w:sz w:val="24"/>
-          <w:szCs w:val="24"/>
-          <w:lang w:val="es-CO" w:eastAsia="es-CO"/>
-        </w:rPr>
-        <w:t>backup</w:t>
-      </w:r>
-      <w:proofErr w:type="spellEnd"/>
-      <w:r>
-        <w:rPr>
-          <w:rFonts w:eastAsia="Times New Roman" w:hAnsi="Georgia" w:cs="Times New Roman"/>
-          <w:sz w:val="24"/>
-          <w:szCs w:val="24"/>
-          <w:lang w:val="es-CO" w:eastAsia="es-CO"/>
-        </w:rPr>
-        <w:t xml:space="preserve"> local con </w:t>
-      </w:r>
-      <w:proofErr w:type="spellStart"/>
+        <w:t xml:space="preserve">Restaurar backup local con </w:t>
+      </w:r>
       <w:r>
         <w:rPr>
           <w:rFonts w:eastAsia="Times New Roman" w:hAnsi="Georgia" w:cs="Courier New"/>
@@ -9991,57 +7053,7 @@
           <w:szCs w:val="20"/>
           <w:lang w:val="es-CO" w:eastAsia="es-CO"/>
         </w:rPr>
-        <w:t>mysql</w:t>
-      </w:r>
-      <w:proofErr w:type="spellEnd"/>
-      <w:r>
-        <w:rPr>
-          <w:rFonts w:eastAsia="Times New Roman" w:hAnsi="Georgia" w:cs="Courier New"/>
-          <w:sz w:val="20"/>
-          <w:szCs w:val="20"/>
-          <w:lang w:val="es-CO" w:eastAsia="es-CO"/>
-        </w:rPr>
-        <w:t xml:space="preserve"> -u </w:t>
-      </w:r>
-      <w:proofErr w:type="spellStart"/>
-      <w:r>
-        <w:rPr>
-          <w:rFonts w:eastAsia="Times New Roman" w:hAnsi="Georgia" w:cs="Courier New"/>
-          <w:sz w:val="20"/>
-          <w:szCs w:val="20"/>
-          <w:lang w:val="es-CO" w:eastAsia="es-CO"/>
-        </w:rPr>
-        <w:t>root</w:t>
-      </w:r>
-      <w:proofErr w:type="spellEnd"/>
-      <w:r>
-        <w:rPr>
-          <w:rFonts w:eastAsia="Times New Roman" w:hAnsi="Georgia" w:cs="Courier New"/>
-          <w:sz w:val="20"/>
-          <w:szCs w:val="20"/>
-          <w:lang w:val="es-CO" w:eastAsia="es-CO"/>
-        </w:rPr>
-        <w:t xml:space="preserve"> -p </w:t>
-      </w:r>
-      <w:proofErr w:type="spellStart"/>
-      <w:r>
-        <w:rPr>
-          <w:rFonts w:eastAsia="Times New Roman" w:hAnsi="Georgia" w:cs="Courier New"/>
-          <w:sz w:val="20"/>
-          <w:szCs w:val="20"/>
-          <w:lang w:val="es-CO" w:eastAsia="es-CO"/>
-        </w:rPr>
-        <w:t>comunidadinteligente</w:t>
-      </w:r>
-      <w:proofErr w:type="spellEnd"/>
-      <w:r>
-        <w:rPr>
-          <w:rFonts w:eastAsia="Times New Roman" w:hAnsi="Georgia" w:cs="Courier New"/>
-          <w:sz w:val="20"/>
-          <w:szCs w:val="20"/>
-          <w:lang w:val="es-CO" w:eastAsia="es-CO"/>
-        </w:rPr>
-        <w:t xml:space="preserve"> &lt; backup_original.sql</w:t>
+        <w:t>mysql -u root -p comunidadinteligente &lt; backup_original.sql</w:t>
       </w:r>
       <w:r>
         <w:rPr>
@@ -10084,27 +7096,7 @@
           <w:lang w:val="es-CO" w:eastAsia="es-CO"/>
         </w:rPr>
         <w:br/>
-        <w:t xml:space="preserve">Mantener </w:t>
-      </w:r>
-      <w:proofErr w:type="spellStart"/>
-      <w:r>
-        <w:rPr>
-          <w:rFonts w:eastAsia="Times New Roman" w:hAnsi="Georgia" w:cs="Times New Roman"/>
-          <w:sz w:val="24"/>
-          <w:szCs w:val="24"/>
-          <w:lang w:val="es-CO" w:eastAsia="es-CO"/>
-        </w:rPr>
-        <w:t>backup.sql</w:t>
-      </w:r>
-      <w:proofErr w:type="spellEnd"/>
-      <w:r>
-        <w:rPr>
-          <w:rFonts w:eastAsia="Times New Roman" w:hAnsi="Georgia" w:cs="Times New Roman"/>
-          <w:sz w:val="24"/>
-          <w:szCs w:val="24"/>
-          <w:lang w:val="es-CO" w:eastAsia="es-CO"/>
-        </w:rPr>
-        <w:t xml:space="preserve"> local y no eliminar datos origen hasta validación completa.</w:t>
+        <w:t>Mantener backup.sql local y no eliminar datos origen hasta validación completa.</w:t>
       </w:r>
     </w:p>
     <w:p>
@@ -10172,67 +7164,7 @@
           <w:szCs w:val="24"/>
           <w:lang w:eastAsia="es-CO"/>
         </w:rPr>
-        <w:t xml:space="preserve">La carga inicial se realiza desde </w:t>
-      </w:r>
-      <w:proofErr w:type="spellStart"/>
-      <w:r>
-        <w:rPr>
-          <w:rFonts w:eastAsia="Times New Roman" w:hAnsi="Georgia" w:cs="Times New Roman"/>
-          <w:sz w:val="24"/>
-          <w:szCs w:val="24"/>
-          <w:lang w:eastAsia="es-CO"/>
-        </w:rPr>
-        <w:t>MariaDB</w:t>
-      </w:r>
-      <w:proofErr w:type="spellEnd"/>
-      <w:r>
-        <w:rPr>
-          <w:rFonts w:eastAsia="Times New Roman" w:hAnsi="Georgia" w:cs="Times New Roman"/>
-          <w:sz w:val="24"/>
-          <w:szCs w:val="24"/>
-          <w:lang w:eastAsia="es-CO"/>
-        </w:rPr>
-        <w:t xml:space="preserve"> local exportada, utilizando el script SQL generado por </w:t>
-      </w:r>
-      <w:proofErr w:type="spellStart"/>
-      <w:r>
-        <w:rPr>
-          <w:rFonts w:eastAsia="Times New Roman" w:hAnsi="Georgia" w:cs="Times New Roman"/>
-          <w:sz w:val="24"/>
-          <w:szCs w:val="24"/>
-          <w:lang w:eastAsia="es-CO"/>
-        </w:rPr>
-        <w:t>mysqldump</w:t>
-      </w:r>
-      <w:proofErr w:type="spellEnd"/>
-      <w:r>
-        <w:rPr>
-          <w:rFonts w:eastAsia="Times New Roman" w:hAnsi="Georgia" w:cs="Times New Roman"/>
-          <w:sz w:val="24"/>
-          <w:szCs w:val="24"/>
-          <w:lang w:eastAsia="es-CO"/>
-        </w:rPr>
-        <w:t xml:space="preserve"> con todas las sentencias INSERT correspondientes a las 11 tablas del sistema </w:t>
-      </w:r>
-      <w:proofErr w:type="spellStart"/>
-      <w:r>
-        <w:rPr>
-          <w:rFonts w:eastAsia="Times New Roman" w:hAnsi="Georgia" w:cs="Times New Roman"/>
-          <w:sz w:val="24"/>
-          <w:szCs w:val="24"/>
-          <w:lang w:eastAsia="es-CO"/>
-        </w:rPr>
-        <w:t>UrbanCops</w:t>
-      </w:r>
-      <w:proofErr w:type="spellEnd"/>
-      <w:r>
-        <w:rPr>
-          <w:rFonts w:eastAsia="Times New Roman" w:hAnsi="Georgia" w:cs="Times New Roman"/>
-          <w:sz w:val="24"/>
-          <w:szCs w:val="24"/>
-          <w:lang w:eastAsia="es-CO"/>
-        </w:rPr>
-        <w:t>.</w:t>
+        <w:t>La carga inicial se realiza desde MariaDB local exportada, utilizando el script SQL generado por mysqldump con todas las sentencias INSERT correspondientes a las 11 tablas del sistema UrbanCops.</w:t>
       </w:r>
     </w:p>
     <w:p>
@@ -10277,9 +7209,8 @@
           <w:szCs w:val="24"/>
           <w:lang w:eastAsia="es-CO"/>
         </w:rPr>
-        <w:t xml:space="preserve">Datos importados en </w:t>
-      </w:r>
-      <w:proofErr w:type="spellStart"/>
+        <w:t xml:space="preserve">Datos importados en MariaDB Hostinger (VPS 72.62.170.223) vía CMD, asegurando schema por defecto, secuencias AUTO_INCREMENT y restricciones </w:t>
+      </w:r>
       <w:r>
         <w:rPr>
           <w:rFonts w:eastAsia="Times New Roman" w:hAnsi="Georgia" w:cs="Times New Roman"/>
@@ -10287,127 +7218,8 @@
           <w:szCs w:val="24"/>
           <w:lang w:eastAsia="es-CO"/>
         </w:rPr>
-        <w:t>MariaDB</w:t>
-      </w:r>
-      <w:proofErr w:type="spellEnd"/>
-      <w:r>
-        <w:rPr>
-          <w:rFonts w:eastAsia="Times New Roman" w:hAnsi="Georgia" w:cs="Times New Roman"/>
-          <w:sz w:val="24"/>
-          <w:szCs w:val="24"/>
-          <w:lang w:eastAsia="es-CO"/>
-        </w:rPr>
-        <w:t xml:space="preserve"> Hostinger (VPS 72.62.170.223) vía CMD, asegurando </w:t>
-      </w:r>
-      <w:proofErr w:type="spellStart"/>
-      <w:r>
-        <w:rPr>
-          <w:rFonts w:eastAsia="Times New Roman" w:hAnsi="Georgia" w:cs="Times New Roman"/>
-          <w:sz w:val="24"/>
-          <w:szCs w:val="24"/>
-          <w:lang w:eastAsia="es-CO"/>
-        </w:rPr>
-        <w:t>schema</w:t>
-      </w:r>
-      <w:proofErr w:type="spellEnd"/>
-      <w:r>
-        <w:rPr>
-          <w:rFonts w:eastAsia="Times New Roman" w:hAnsi="Georgia" w:cs="Times New Roman"/>
-          <w:sz w:val="24"/>
-          <w:szCs w:val="24"/>
-          <w:lang w:eastAsia="es-CO"/>
-        </w:rPr>
-        <w:t xml:space="preserve"> por defecto, secuencias AUTO_INCREMENT y restricciones </w:t>
-      </w:r>
-      <w:r>
-        <w:rPr>
-          <w:rFonts w:eastAsia="Times New Roman" w:hAnsi="Georgia" w:cs="Times New Roman"/>
-          <w:sz w:val="24"/>
-          <w:szCs w:val="24"/>
-          <w:lang w:eastAsia="es-CO"/>
-        </w:rPr>
         <w:lastRenderedPageBreak/>
-        <w:t xml:space="preserve">FK de las tablas: pedido, usuarios, productos, </w:t>
-      </w:r>
-      <w:proofErr w:type="spellStart"/>
-      <w:r>
-        <w:rPr>
-          <w:rFonts w:eastAsia="Times New Roman" w:hAnsi="Georgia" w:cs="Times New Roman"/>
-          <w:sz w:val="24"/>
-          <w:szCs w:val="24"/>
-          <w:lang w:eastAsia="es-CO"/>
-        </w:rPr>
-        <w:t>envio</w:t>
-      </w:r>
-      <w:proofErr w:type="spellEnd"/>
-      <w:r>
-        <w:rPr>
-          <w:rFonts w:eastAsia="Times New Roman" w:hAnsi="Georgia" w:cs="Times New Roman"/>
-          <w:sz w:val="24"/>
-          <w:szCs w:val="24"/>
-          <w:lang w:eastAsia="es-CO"/>
-        </w:rPr>
-        <w:t xml:space="preserve">, pago, </w:t>
-      </w:r>
-      <w:proofErr w:type="spellStart"/>
-      <w:r>
-        <w:rPr>
-          <w:rFonts w:eastAsia="Times New Roman" w:hAnsi="Georgia" w:cs="Times New Roman"/>
-          <w:sz w:val="24"/>
-          <w:szCs w:val="24"/>
-          <w:lang w:eastAsia="es-CO"/>
-        </w:rPr>
-        <w:t>detalle_pedido</w:t>
-      </w:r>
-      <w:proofErr w:type="spellEnd"/>
-      <w:r>
-        <w:rPr>
-          <w:rFonts w:eastAsia="Times New Roman" w:hAnsi="Georgia" w:cs="Times New Roman"/>
-          <w:sz w:val="24"/>
-          <w:szCs w:val="24"/>
-          <w:lang w:eastAsia="es-CO"/>
-        </w:rPr>
-        <w:t xml:space="preserve">, inventario, </w:t>
-      </w:r>
-      <w:proofErr w:type="spellStart"/>
-      <w:r>
-        <w:rPr>
-          <w:rFonts w:eastAsia="Times New Roman" w:hAnsi="Georgia" w:cs="Times New Roman"/>
-          <w:sz w:val="24"/>
-          <w:szCs w:val="24"/>
-          <w:lang w:eastAsia="es-CO"/>
-        </w:rPr>
-        <w:t>personalizacion</w:t>
-      </w:r>
-      <w:proofErr w:type="spellEnd"/>
-      <w:r>
-        <w:rPr>
-          <w:rFonts w:eastAsia="Times New Roman" w:hAnsi="Georgia" w:cs="Times New Roman"/>
-          <w:sz w:val="24"/>
-          <w:szCs w:val="24"/>
-          <w:lang w:eastAsia="es-CO"/>
-        </w:rPr>
-        <w:t xml:space="preserve">, ventas, </w:t>
-      </w:r>
-      <w:proofErr w:type="spellStart"/>
-      <w:r>
-        <w:rPr>
-          <w:rFonts w:eastAsia="Times New Roman" w:hAnsi="Georgia" w:cs="Times New Roman"/>
-          <w:sz w:val="24"/>
-          <w:szCs w:val="24"/>
-          <w:lang w:eastAsia="es-CO"/>
-        </w:rPr>
-        <w:t>pqrs</w:t>
-      </w:r>
-      <w:proofErr w:type="spellEnd"/>
-      <w:r>
-        <w:rPr>
-          <w:rFonts w:eastAsia="Times New Roman" w:hAnsi="Georgia" w:cs="Times New Roman"/>
-          <w:sz w:val="24"/>
-          <w:szCs w:val="24"/>
-          <w:lang w:eastAsia="es-CO"/>
-        </w:rPr>
-        <w:t xml:space="preserve"> y rol</w:t>
+        <w:t>FK de las tablas: pedido, usuarios, productos, envio, pago, detalle_pedido, inventario, personalizacion, ventas, pqrs y rol</w:t>
       </w:r>
       <w:r>
         <w:rPr>
@@ -10465,27 +7277,7 @@
           <w:szCs w:val="24"/>
           <w:lang w:val="es-CO" w:eastAsia="es-CO"/>
         </w:rPr>
-        <w:t xml:space="preserve">El proceso de carga inicial consiste en poblar la base de datos en el servidor de Hostinger con los datos previamente registrados en el entorno local. </w:t>
-      </w:r>
-      <w:proofErr w:type="gramStart"/>
-      <w:r>
-        <w:rPr>
-          <w:rFonts w:eastAsia="Times New Roman" w:hAnsi="Georgia" w:cs="Times New Roman"/>
-          <w:sz w:val="24"/>
-          <w:szCs w:val="24"/>
-          <w:lang w:val="es-CO" w:eastAsia="es-CO"/>
-        </w:rPr>
-        <w:t>Los pasos a seguir</w:t>
-      </w:r>
-      <w:proofErr w:type="gramEnd"/>
-      <w:r>
-        <w:rPr>
-          <w:rFonts w:eastAsia="Times New Roman" w:hAnsi="Georgia" w:cs="Times New Roman"/>
-          <w:sz w:val="24"/>
-          <w:szCs w:val="24"/>
-          <w:lang w:val="es-CO" w:eastAsia="es-CO"/>
-        </w:rPr>
-        <w:t xml:space="preserve"> son los siguientes:</w:t>
+        <w:t>El proceso de carga inicial consiste en poblar la base de datos en el servidor de Hostinger con los datos previamente registrados en el entorno local. Los pasos a seguir son los siguientes:</w:t>
       </w:r>
     </w:p>
     <w:p>
@@ -10509,67 +7301,7 @@
           <w:szCs w:val="24"/>
           <w:lang w:val="es-CO" w:eastAsia="es-CO"/>
         </w:rPr>
-        <w:t xml:space="preserve">Generar el archivo de exportación desde </w:t>
-      </w:r>
-      <w:proofErr w:type="spellStart"/>
-      <w:r>
-        <w:rPr>
-          <w:rFonts w:eastAsia="Times New Roman" w:hAnsi="Georgia" w:cs="Times New Roman"/>
-          <w:sz w:val="24"/>
-          <w:szCs w:val="24"/>
-          <w:lang w:val="es-CO" w:eastAsia="es-CO"/>
-        </w:rPr>
-        <w:t>MariaDB</w:t>
-      </w:r>
-      <w:proofErr w:type="spellEnd"/>
-      <w:r>
-        <w:rPr>
-          <w:rFonts w:eastAsia="Times New Roman" w:hAnsi="Georgia" w:cs="Times New Roman"/>
-          <w:sz w:val="24"/>
-          <w:szCs w:val="24"/>
-          <w:lang w:val="es-CO" w:eastAsia="es-CO"/>
-        </w:rPr>
-        <w:t xml:space="preserve"> local ejecutando el siguiente comando: </w:t>
-      </w:r>
-      <w:proofErr w:type="spellStart"/>
-      <w:r>
-        <w:rPr>
-          <w:rFonts w:eastAsia="Times New Roman" w:hAnsi="Georgia" w:cs="Times New Roman"/>
-          <w:sz w:val="24"/>
-          <w:szCs w:val="24"/>
-          <w:lang w:val="es-CO" w:eastAsia="es-CO"/>
-        </w:rPr>
-        <w:t>mysqldump</w:t>
-      </w:r>
-      <w:proofErr w:type="spellEnd"/>
-      <w:r>
-        <w:rPr>
-          <w:rFonts w:eastAsia="Times New Roman" w:hAnsi="Georgia" w:cs="Times New Roman"/>
-          <w:sz w:val="24"/>
-          <w:szCs w:val="24"/>
-          <w:lang w:val="es-CO" w:eastAsia="es-CO"/>
-        </w:rPr>
-        <w:t xml:space="preserve"> -u </w:t>
-      </w:r>
-      <w:proofErr w:type="spellStart"/>
-      <w:r>
-        <w:rPr>
-          <w:rFonts w:eastAsia="Times New Roman" w:hAnsi="Georgia" w:cs="Times New Roman"/>
-          <w:sz w:val="24"/>
-          <w:szCs w:val="24"/>
-          <w:lang w:val="es-CO" w:eastAsia="es-CO"/>
-        </w:rPr>
-        <w:t>root</w:t>
-      </w:r>
-      <w:proofErr w:type="spellEnd"/>
-      <w:r>
-        <w:rPr>
-          <w:rFonts w:eastAsia="Times New Roman" w:hAnsi="Georgia" w:cs="Times New Roman"/>
-          <w:sz w:val="24"/>
-          <w:szCs w:val="24"/>
-          <w:lang w:val="es-CO" w:eastAsia="es-CO"/>
-        </w:rPr>
-        <w:t xml:space="preserve"> -p urban1 &gt; backup_urban1.sql</w:t>
+        <w:t>Generar el archivo de exportación desde MariaDB local ejecutando el siguiente comando: mysqldump -u root -p urban1 &gt; backup_urban1.sql</w:t>
       </w:r>
     </w:p>
     <w:p>
@@ -10617,47 +7349,7 @@
           <w:szCs w:val="24"/>
           <w:lang w:val="es-CO" w:eastAsia="es-CO"/>
         </w:rPr>
-        <w:t xml:space="preserve">Importar los datos en la base de datos urban1 del servidor remoto: </w:t>
-      </w:r>
-      <w:proofErr w:type="spellStart"/>
-      <w:r>
-        <w:rPr>
-          <w:rFonts w:eastAsia="Times New Roman" w:hAnsi="Georgia" w:cs="Times New Roman"/>
-          <w:sz w:val="24"/>
-          <w:szCs w:val="24"/>
-          <w:lang w:val="es-CO" w:eastAsia="es-CO"/>
-        </w:rPr>
-        <w:t>mysql</w:t>
-      </w:r>
-      <w:proofErr w:type="spellEnd"/>
-      <w:r>
-        <w:rPr>
-          <w:rFonts w:eastAsia="Times New Roman" w:hAnsi="Georgia" w:cs="Times New Roman"/>
-          <w:sz w:val="24"/>
-          <w:szCs w:val="24"/>
-          <w:lang w:val="es-CO" w:eastAsia="es-CO"/>
-        </w:rPr>
-        <w:t xml:space="preserve"> -u </w:t>
-      </w:r>
-      <w:proofErr w:type="spellStart"/>
-      <w:r>
-        <w:rPr>
-          <w:rFonts w:eastAsia="Times New Roman" w:hAnsi="Georgia" w:cs="Times New Roman"/>
-          <w:sz w:val="24"/>
-          <w:szCs w:val="24"/>
-          <w:lang w:val="es-CO" w:eastAsia="es-CO"/>
-        </w:rPr>
-        <w:t>root</w:t>
-      </w:r>
-      <w:proofErr w:type="spellEnd"/>
-      <w:r>
-        <w:rPr>
-          <w:rFonts w:eastAsia="Times New Roman" w:hAnsi="Georgia" w:cs="Times New Roman"/>
-          <w:sz w:val="24"/>
-          <w:szCs w:val="24"/>
-          <w:lang w:val="es-CO" w:eastAsia="es-CO"/>
-        </w:rPr>
-        <w:t xml:space="preserve"> -p urban1 &lt; backup_urban1.sql</w:t>
+        <w:t>Importar los datos en la base de datos urban1 del servidor remoto: mysql -u root -p urban1 &lt; backup_urban1.sql</w:t>
       </w:r>
     </w:p>
     <w:p>
@@ -10681,47 +7373,7 @@
           <w:szCs w:val="24"/>
           <w:lang w:val="es-CO" w:eastAsia="es-CO"/>
         </w:rPr>
-        <w:t xml:space="preserve">Verificar que los registros fueron cargados correctamente ejecutando consultas de conteo por tabla: SELECT </w:t>
-      </w:r>
-      <w:proofErr w:type="gramStart"/>
-      <w:r>
-        <w:rPr>
-          <w:rFonts w:eastAsia="Times New Roman" w:hAnsi="Georgia" w:cs="Times New Roman"/>
-          <w:sz w:val="24"/>
-          <w:szCs w:val="24"/>
-          <w:lang w:val="es-CO" w:eastAsia="es-CO"/>
-        </w:rPr>
-        <w:t>COUNT(</w:t>
-      </w:r>
-      <w:proofErr w:type="gramEnd"/>
-      <w:r>
-        <w:rPr>
-          <w:rFonts w:eastAsia="Times New Roman" w:hAnsi="Georgia" w:cs="Times New Roman"/>
-          <w:sz w:val="24"/>
-          <w:szCs w:val="24"/>
-          <w:lang w:val="es-CO" w:eastAsia="es-CO"/>
-        </w:rPr>
-        <w:t xml:space="preserve">*) FROM pedido; SELECT </w:t>
-      </w:r>
-      <w:proofErr w:type="gramStart"/>
-      <w:r>
-        <w:rPr>
-          <w:rFonts w:eastAsia="Times New Roman" w:hAnsi="Georgia" w:cs="Times New Roman"/>
-          <w:sz w:val="24"/>
-          <w:szCs w:val="24"/>
-          <w:lang w:val="es-CO" w:eastAsia="es-CO"/>
-        </w:rPr>
-        <w:t>COUNT(</w:t>
-      </w:r>
-      <w:proofErr w:type="gramEnd"/>
-      <w:r>
-        <w:rPr>
-          <w:rFonts w:eastAsia="Times New Roman" w:hAnsi="Georgia" w:cs="Times New Roman"/>
-          <w:sz w:val="24"/>
-          <w:szCs w:val="24"/>
-          <w:lang w:val="es-CO" w:eastAsia="es-CO"/>
-        </w:rPr>
-        <w:t>*) FROM usuarios;</w:t>
+        <w:t>Verificar que los registros fueron cargados correctamente ejecutando consultas de conteo por tabla: SELECT COUNT(*) FROM pedido; SELECT COUNT(*) FROM usuarios;</w:t>
       </w:r>
     </w:p>
     <w:p>
@@ -10738,25 +7390,14 @@
           <w:lang w:val="es-CO" w:eastAsia="es-CO"/>
         </w:rPr>
       </w:pPr>
-      <w:proofErr w:type="gramStart"/>
-      <w:r>
-        <w:rPr>
-          <w:rFonts w:eastAsia="Times New Roman" w:hAnsi="Georgia" w:cs="Times New Roman"/>
-          <w:sz w:val="24"/>
-          <w:szCs w:val="24"/>
-          <w:lang w:val="es-CO" w:eastAsia="es-CO"/>
-        </w:rPr>
-        <w:t>Confirmar</w:t>
-      </w:r>
-      <w:proofErr w:type="gramEnd"/>
-      <w:r>
-        <w:rPr>
-          <w:rFonts w:eastAsia="Times New Roman" w:hAnsi="Georgia" w:cs="Times New Roman"/>
-          <w:sz w:val="24"/>
-          <w:szCs w:val="24"/>
-          <w:lang w:val="es-CO" w:eastAsia="es-CO"/>
-        </w:rPr>
-        <w:t xml:space="preserve"> que los valores AUTO_INCREMENT, las restricciones de clave foránea (FK) y los tipos de datos ENUM se mantienen intactos tras la importación.</w:t>
+      <w:r>
+        <w:rPr>
+          <w:rFonts w:eastAsia="Times New Roman" w:hAnsi="Georgia" w:cs="Times New Roman"/>
+          <w:sz w:val="24"/>
+          <w:szCs w:val="24"/>
+          <w:lang w:val="es-CO" w:eastAsia="es-CO"/>
+        </w:rPr>
+        <w:t>Confirmar que los valores AUTO_INCREMENT, las restricciones de clave foránea (FK) y los tipos de datos ENUM se mantienen intactos tras la importación.</w:t>
       </w:r>
     </w:p>
     <w:p>
@@ -10780,27 +7421,7 @@
           <w:szCs w:val="24"/>
           <w:lang w:val="es-CO" w:eastAsia="es-CO"/>
         </w:rPr>
-        <w:t xml:space="preserve">Validar que la aplicación móvil </w:t>
-      </w:r>
-      <w:proofErr w:type="spellStart"/>
-      <w:r>
-        <w:rPr>
-          <w:rFonts w:eastAsia="Times New Roman" w:hAnsi="Georgia" w:cs="Times New Roman"/>
-          <w:sz w:val="24"/>
-          <w:szCs w:val="24"/>
-          <w:lang w:val="es-CO" w:eastAsia="es-CO"/>
-        </w:rPr>
-        <w:t>Flutter</w:t>
-      </w:r>
-      <w:proofErr w:type="spellEnd"/>
-      <w:r>
-        <w:rPr>
-          <w:rFonts w:eastAsia="Times New Roman" w:hAnsi="Georgia" w:cs="Times New Roman"/>
-          <w:sz w:val="24"/>
-          <w:szCs w:val="24"/>
-          <w:lang w:val="es-CO" w:eastAsia="es-CO"/>
-        </w:rPr>
-        <w:t xml:space="preserve"> consume correctamente los datos desde el servidor remoto https://capsurban.com.</w:t>
+        <w:t>Validar que la aplicación móvil Flutter consume correctamente los datos desde el servidor remoto https://capsurban.com.</w:t>
       </w:r>
     </w:p>
     <w:p>
@@ -10838,8 +7459,8 @@
       </w:pPr>
     </w:p>
     <w:sectPr>
-      <w:headerReference w:type="default" r:id="rId23"/>
-      <w:footerReference w:type="default" r:id="rId24"/>
+      <w:headerReference w:type="default" r:id="rId22"/>
+      <w:footerReference w:type="default" r:id="rId23"/>
       <w:pgSz w:w="12240" w:h="15840"/>
       <w:pgMar w:top="1415" w:right="1775" w:bottom="1415" w:left="1775" w:header="720" w:footer="720" w:gutter="0"/>
       <w:cols w:space="720"/>
@@ -12267,6 +8888,7 @@
   <w:style w:type="character" w:default="1" w:styleId="Fuentedeprrafopredeter">
     <w:name w:val="Default Paragraph Font"/>
     <w:uiPriority w:val="1"/>
+    <w:semiHidden/>
     <w:unhideWhenUsed/>
   </w:style>
   <w:style w:type="table" w:default="1" w:styleId="Tablanormal">

</xml_diff>